<commit_message>
feat(report): enhance monthly city report generation with statistical analysis and table formatting
</commit_message>
<xml_diff>
--- a/src/main/resources/templates/word/DEHAReportTemplate.docx
+++ b/src/main/resources/templates/word/DEHAReportTemplate.docx
@@ -820,16 +820,56 @@
               <w:bottom w:type="dxa" w:w="80"/>
               <w:right w:type="dxa" w:w="80"/>
             </w:tcMar>
-            <w:vAlign w:val="top"/>
+            <w:vAlign w:val="center"/>
           </w:tcPr>
           <w:p>
             <w:pPr>
-              <w:pStyle w:val="Table Style 2"/>
+              <w:keepNext w:val="0"/>
+              <w:keepLines w:val="0"/>
+              <w:pageBreakBefore w:val="0"/>
+              <w:widowControl w:val="1"/>
+              <w:shd w:val="clear" w:color="auto" w:fill="auto"/>
+              <w:suppressAutoHyphens w:val="0"/>
+              <w:bidi w:val="0"/>
+              <w:spacing w:before="0" w:after="0" w:line="240" w:lineRule="auto"/>
+              <w:ind w:left="0" w:right="0" w:firstLine="0"/>
+              <w:jc w:val="center"/>
+              <w:outlineLvl w:val="9"/>
+              <w:rPr>
+                <w:rtl w:val="0"/>
+              </w:rPr>
             </w:pPr>
             <w:r>
               <w:rPr>
+                <w:rFonts w:ascii="Futura" w:cs="Arial Unicode MS" w:hAnsi="Futura" w:eastAsia="Arial Unicode MS"/>
+                <w:b w:val="0"/>
+                <w:bCs w:val="0"/>
+                <w:i w:val="0"/>
+                <w:iCs w:val="0"/>
+                <w:caps w:val="0"/>
+                <w:smallCaps w:val="0"/>
+                <w:strike w:val="0"/>
+                <w:dstrike w:val="0"/>
+                <w:outline w:val="0"/>
+                <w:color w:val="000000"/>
+                <w:spacing w:val="0"/>
+                <w:kern w:val="0"/>
+                <w:position w:val="0"/>
+                <w:sz w:val="20"/>
+                <w:szCs w:val="20"/>
+                <w:u w:val="none" w:color="000000"/>
                 <w:shd w:val="nil" w:color="auto" w:fill="auto"/>
+                <w:vertAlign w:val="baseline"/>
                 <w:rtl w:val="0"/>
+                <w14:textOutline w14:w="12700" w14:cap="flat">
+                  <w14:noFill/>
+                  <w14:miter w14:lim="400000"/>
+                </w14:textOutline>
+                <w14:textFill>
+                  <w14:solidFill>
+                    <w14:srgbClr w14:val="000000"/>
+                  </w14:solidFill>
+                </w14:textFill>
               </w:rPr>
               <w:t>Tarih</w:t>
             </w:r>
@@ -851,58 +891,260 @@
               <w:bottom w:type="dxa" w:w="80"/>
               <w:right w:type="dxa" w:w="80"/>
             </w:tcMar>
-            <w:vAlign w:val="top"/>
+            <w:vAlign w:val="center"/>
           </w:tcPr>
           <w:p>
             <w:pPr>
-              <w:pStyle w:val="Table Style 2"/>
+              <w:keepNext w:val="0"/>
+              <w:keepLines w:val="0"/>
+              <w:pageBreakBefore w:val="0"/>
+              <w:widowControl w:val="1"/>
+              <w:shd w:val="clear" w:color="auto" w:fill="auto"/>
+              <w:suppressAutoHyphens w:val="0"/>
+              <w:bidi w:val="0"/>
+              <w:spacing w:before="0" w:after="0" w:line="240" w:lineRule="auto"/>
+              <w:ind w:left="0" w:right="0" w:firstLine="0"/>
+              <w:jc w:val="center"/>
+              <w:outlineLvl w:val="9"/>
+              <w:rPr>
+                <w:rtl w:val="0"/>
+              </w:rPr>
             </w:pPr>
             <w:r>
               <w:rPr>
+                <w:rFonts w:ascii="Futura" w:cs="Arial Unicode MS" w:hAnsi="Futura" w:eastAsia="Arial Unicode MS"/>
+                <w:b w:val="0"/>
+                <w:bCs w:val="0"/>
+                <w:i w:val="0"/>
+                <w:iCs w:val="0"/>
+                <w:caps w:val="0"/>
+                <w:smallCaps w:val="0"/>
+                <w:strike w:val="0"/>
+                <w:dstrike w:val="0"/>
+                <w:outline w:val="0"/>
+                <w:color w:val="000000"/>
+                <w:spacing w:val="0"/>
+                <w:kern w:val="0"/>
+                <w:position w:val="0"/>
+                <w:sz w:val="20"/>
+                <w:szCs w:val="20"/>
+                <w:u w:val="none" w:color="000000"/>
                 <w:shd w:val="nil" w:color="auto" w:fill="auto"/>
+                <w:vertAlign w:val="baseline"/>
                 <w:rtl w:val="0"/>
+                <w14:textOutline w14:w="12700" w14:cap="flat">
+                  <w14:noFill/>
+                  <w14:miter w14:lim="400000"/>
+                </w14:textOutline>
+                <w14:textFill>
+                  <w14:solidFill>
+                    <w14:srgbClr w14:val="000000"/>
+                  </w14:solidFill>
+                </w14:textFill>
               </w:rPr>
               <w:t>B</w:t>
             </w:r>
             <w:r>
               <w:rPr>
+                <w:rFonts w:ascii="Futura" w:cs="Arial Unicode MS" w:hAnsi="Futura" w:eastAsia="Arial Unicode MS" w:hint="default"/>
+                <w:b w:val="0"/>
+                <w:bCs w:val="0"/>
+                <w:i w:val="0"/>
+                <w:iCs w:val="0"/>
+                <w:caps w:val="0"/>
+                <w:smallCaps w:val="0"/>
+                <w:strike w:val="0"/>
+                <w:dstrike w:val="0"/>
+                <w:outline w:val="0"/>
+                <w:color w:val="000000"/>
+                <w:spacing w:val="0"/>
+                <w:kern w:val="0"/>
+                <w:position w:val="0"/>
+                <w:sz w:val="20"/>
+                <w:szCs w:val="20"/>
+                <w:u w:val="none" w:color="000000"/>
                 <w:shd w:val="nil" w:color="auto" w:fill="auto"/>
+                <w:vertAlign w:val="baseline"/>
                 <w:rtl w:val="0"/>
+                <w14:textOutline w14:w="12700" w14:cap="flat">
+                  <w14:noFill/>
+                  <w14:miter w14:lim="400000"/>
+                </w14:textOutline>
+                <w14:textFill>
+                  <w14:solidFill>
+                    <w14:srgbClr w14:val="000000"/>
+                  </w14:solidFill>
+                </w14:textFill>
               </w:rPr>
               <w:t>ü</w:t>
             </w:r>
             <w:r>
               <w:rPr>
+                <w:rFonts w:ascii="Futura" w:cs="Arial Unicode MS" w:hAnsi="Futura" w:eastAsia="Arial Unicode MS"/>
+                <w:b w:val="0"/>
+                <w:bCs w:val="0"/>
+                <w:i w:val="0"/>
+                <w:iCs w:val="0"/>
+                <w:caps w:val="0"/>
+                <w:smallCaps w:val="0"/>
+                <w:strike w:val="0"/>
+                <w:dstrike w:val="0"/>
+                <w:outline w:val="0"/>
+                <w:color w:val="000000"/>
+                <w:spacing w:val="0"/>
+                <w:kern w:val="0"/>
+                <w:position w:val="0"/>
+                <w:sz w:val="20"/>
+                <w:szCs w:val="20"/>
+                <w:u w:val="none" w:color="000000"/>
                 <w:shd w:val="nil" w:color="auto" w:fill="auto"/>
+                <w:vertAlign w:val="baseline"/>
                 <w:rtl w:val="0"/>
+                <w14:textOutline w14:w="12700" w14:cap="flat">
+                  <w14:noFill/>
+                  <w14:miter w14:lim="400000"/>
+                </w14:textOutline>
+                <w14:textFill>
+                  <w14:solidFill>
+                    <w14:srgbClr w14:val="000000"/>
+                  </w14:solidFill>
+                </w14:textFill>
               </w:rPr>
               <w:t>y</w:t>
             </w:r>
             <w:r>
               <w:rPr>
+                <w:rFonts w:ascii="Futura" w:cs="Arial Unicode MS" w:hAnsi="Futura" w:eastAsia="Arial Unicode MS" w:hint="default"/>
+                <w:b w:val="0"/>
+                <w:bCs w:val="0"/>
+                <w:i w:val="0"/>
+                <w:iCs w:val="0"/>
+                <w:caps w:val="0"/>
+                <w:smallCaps w:val="0"/>
+                <w:strike w:val="0"/>
+                <w:dstrike w:val="0"/>
+                <w:outline w:val="0"/>
+                <w:color w:val="000000"/>
+                <w:spacing w:val="0"/>
+                <w:kern w:val="0"/>
+                <w:position w:val="0"/>
+                <w:sz w:val="20"/>
+                <w:szCs w:val="20"/>
+                <w:u w:val="none" w:color="000000"/>
                 <w:shd w:val="nil" w:color="auto" w:fill="auto"/>
+                <w:vertAlign w:val="baseline"/>
                 <w:rtl w:val="0"/>
+                <w14:textOutline w14:w="12700" w14:cap="flat">
+                  <w14:noFill/>
+                  <w14:miter w14:lim="400000"/>
+                </w14:textOutline>
+                <w14:textFill>
+                  <w14:solidFill>
+                    <w14:srgbClr w14:val="000000"/>
+                  </w14:solidFill>
+                </w14:textFill>
               </w:rPr>
               <w:t>ü</w:t>
             </w:r>
             <w:r>
               <w:rPr>
+                <w:rFonts w:ascii="Futura" w:cs="Arial Unicode MS" w:hAnsi="Futura" w:eastAsia="Arial Unicode MS"/>
+                <w:b w:val="0"/>
+                <w:bCs w:val="0"/>
+                <w:i w:val="0"/>
+                <w:iCs w:val="0"/>
+                <w:caps w:val="0"/>
+                <w:smallCaps w:val="0"/>
+                <w:strike w:val="0"/>
+                <w:dstrike w:val="0"/>
+                <w:outline w:val="0"/>
+                <w:color w:val="000000"/>
+                <w:spacing w:val="0"/>
+                <w:kern w:val="0"/>
+                <w:position w:val="0"/>
+                <w:sz w:val="20"/>
+                <w:szCs w:val="20"/>
+                <w:u w:val="none" w:color="000000"/>
                 <w:shd w:val="nil" w:color="auto" w:fill="auto"/>
+                <w:vertAlign w:val="baseline"/>
                 <w:rtl w:val="0"/>
+                <w14:textOutline w14:w="12700" w14:cap="flat">
+                  <w14:noFill/>
+                  <w14:miter w14:lim="400000"/>
+                </w14:textOutline>
+                <w14:textFill>
+                  <w14:solidFill>
+                    <w14:srgbClr w14:val="000000"/>
+                  </w14:solidFill>
+                </w14:textFill>
               </w:rPr>
               <w:t>kl</w:t>
             </w:r>
             <w:r>
               <w:rPr>
+                <w:rFonts w:ascii="Futura" w:cs="Arial Unicode MS" w:hAnsi="Futura" w:eastAsia="Arial Unicode MS" w:hint="default"/>
+                <w:b w:val="0"/>
+                <w:bCs w:val="0"/>
+                <w:i w:val="0"/>
+                <w:iCs w:val="0"/>
+                <w:caps w:val="0"/>
+                <w:smallCaps w:val="0"/>
+                <w:strike w:val="0"/>
+                <w:dstrike w:val="0"/>
+                <w:outline w:val="0"/>
+                <w:color w:val="000000"/>
+                <w:spacing w:val="0"/>
+                <w:kern w:val="0"/>
+                <w:position w:val="0"/>
+                <w:sz w:val="20"/>
+                <w:szCs w:val="20"/>
+                <w:u w:val="none" w:color="000000"/>
                 <w:shd w:val="nil" w:color="auto" w:fill="auto"/>
+                <w:vertAlign w:val="baseline"/>
                 <w:rtl w:val="0"/>
+                <w14:textOutline w14:w="12700" w14:cap="flat">
+                  <w14:noFill/>
+                  <w14:miter w14:lim="400000"/>
+                </w14:textOutline>
+                <w14:textFill>
+                  <w14:solidFill>
+                    <w14:srgbClr w14:val="000000"/>
+                  </w14:solidFill>
+                </w14:textFill>
               </w:rPr>
               <w:t>ü</w:t>
             </w:r>
             <w:r>
               <w:rPr>
+                <w:rFonts w:ascii="Futura" w:cs="Arial Unicode MS" w:hAnsi="Futura" w:eastAsia="Arial Unicode MS"/>
+                <w:b w:val="0"/>
+                <w:bCs w:val="0"/>
+                <w:i w:val="0"/>
+                <w:iCs w:val="0"/>
+                <w:caps w:val="0"/>
+                <w:smallCaps w:val="0"/>
+                <w:strike w:val="0"/>
+                <w:dstrike w:val="0"/>
+                <w:outline w:val="0"/>
+                <w:color w:val="000000"/>
+                <w:spacing w:val="0"/>
+                <w:kern w:val="0"/>
+                <w:position w:val="0"/>
+                <w:sz w:val="20"/>
+                <w:szCs w:val="20"/>
+                <w:u w:val="none" w:color="000000"/>
                 <w:shd w:val="nil" w:color="auto" w:fill="auto"/>
+                <w:vertAlign w:val="baseline"/>
                 <w:rtl w:val="0"/>
+                <w14:textOutline w14:w="12700" w14:cap="flat">
+                  <w14:noFill/>
+                  <w14:miter w14:lim="400000"/>
+                </w14:textOutline>
+                <w14:textFill>
+                  <w14:solidFill>
+                    <w14:srgbClr w14:val="000000"/>
+                  </w14:solidFill>
+                </w14:textFill>
               </w:rPr>
               <w:t>k</w:t>
             </w:r>
@@ -924,16 +1166,56 @@
               <w:bottom w:type="dxa" w:w="80"/>
               <w:right w:type="dxa" w:w="80"/>
             </w:tcMar>
-            <w:vAlign w:val="top"/>
+            <w:vAlign w:val="center"/>
           </w:tcPr>
           <w:p>
             <w:pPr>
-              <w:pStyle w:val="Table Style 2"/>
+              <w:keepNext w:val="0"/>
+              <w:keepLines w:val="0"/>
+              <w:pageBreakBefore w:val="0"/>
+              <w:widowControl w:val="1"/>
+              <w:shd w:val="clear" w:color="auto" w:fill="auto"/>
+              <w:suppressAutoHyphens w:val="0"/>
+              <w:bidi w:val="0"/>
+              <w:spacing w:before="0" w:after="0" w:line="240" w:lineRule="auto"/>
+              <w:ind w:left="0" w:right="0" w:firstLine="0"/>
+              <w:jc w:val="center"/>
+              <w:outlineLvl w:val="9"/>
+              <w:rPr>
+                <w:rtl w:val="0"/>
+              </w:rPr>
             </w:pPr>
             <w:r>
               <w:rPr>
+                <w:rFonts w:ascii="Futura" w:cs="Arial Unicode MS" w:hAnsi="Futura" w:eastAsia="Arial Unicode MS"/>
+                <w:b w:val="0"/>
+                <w:bCs w:val="0"/>
+                <w:i w:val="0"/>
+                <w:iCs w:val="0"/>
+                <w:caps w:val="0"/>
+                <w:smallCaps w:val="0"/>
+                <w:strike w:val="0"/>
+                <w:dstrike w:val="0"/>
+                <w:outline w:val="0"/>
+                <w:color w:val="000000"/>
+                <w:spacing w:val="0"/>
+                <w:kern w:val="0"/>
+                <w:position w:val="0"/>
+                <w:sz w:val="20"/>
+                <w:szCs w:val="20"/>
+                <w:u w:val="none" w:color="000000"/>
                 <w:shd w:val="nil" w:color="auto" w:fill="auto"/>
+                <w:vertAlign w:val="baseline"/>
                 <w:rtl w:val="0"/>
+                <w14:textOutline w14:w="12700" w14:cap="flat">
+                  <w14:noFill/>
+                  <w14:miter w14:lim="400000"/>
+                </w14:textOutline>
+                <w14:textFill>
+                  <w14:solidFill>
+                    <w14:srgbClr w14:val="000000"/>
+                  </w14:solidFill>
+                </w14:textFill>
               </w:rPr>
               <w:t>Enlem</w:t>
             </w:r>
@@ -955,16 +1237,56 @@
               <w:bottom w:type="dxa" w:w="80"/>
               <w:right w:type="dxa" w:w="80"/>
             </w:tcMar>
-            <w:vAlign w:val="top"/>
+            <w:vAlign w:val="center"/>
           </w:tcPr>
           <w:p>
             <w:pPr>
-              <w:pStyle w:val="Table Style 2"/>
+              <w:keepNext w:val="0"/>
+              <w:keepLines w:val="0"/>
+              <w:pageBreakBefore w:val="0"/>
+              <w:widowControl w:val="1"/>
+              <w:shd w:val="clear" w:color="auto" w:fill="auto"/>
+              <w:suppressAutoHyphens w:val="0"/>
+              <w:bidi w:val="0"/>
+              <w:spacing w:before="0" w:after="0" w:line="240" w:lineRule="auto"/>
+              <w:ind w:left="0" w:right="0" w:firstLine="0"/>
+              <w:jc w:val="center"/>
+              <w:outlineLvl w:val="9"/>
+              <w:rPr>
+                <w:rtl w:val="0"/>
+              </w:rPr>
             </w:pPr>
             <w:r>
               <w:rPr>
+                <w:rFonts w:ascii="Futura" w:cs="Arial Unicode MS" w:hAnsi="Futura" w:eastAsia="Arial Unicode MS"/>
+                <w:b w:val="0"/>
+                <w:bCs w:val="0"/>
+                <w:i w:val="0"/>
+                <w:iCs w:val="0"/>
+                <w:caps w:val="0"/>
+                <w:smallCaps w:val="0"/>
+                <w:strike w:val="0"/>
+                <w:dstrike w:val="0"/>
+                <w:outline w:val="0"/>
+                <w:color w:val="000000"/>
+                <w:spacing w:val="0"/>
+                <w:kern w:val="0"/>
+                <w:position w:val="0"/>
+                <w:sz w:val="20"/>
+                <w:szCs w:val="20"/>
+                <w:u w:val="none" w:color="000000"/>
                 <w:shd w:val="nil" w:color="auto" w:fill="auto"/>
+                <w:vertAlign w:val="baseline"/>
                 <w:rtl w:val="0"/>
+                <w14:textOutline w14:w="12700" w14:cap="flat">
+                  <w14:noFill/>
+                  <w14:miter w14:lim="400000"/>
+                </w14:textOutline>
+                <w14:textFill>
+                  <w14:solidFill>
+                    <w14:srgbClr w14:val="000000"/>
+                  </w14:solidFill>
+                </w14:textFill>
               </w:rPr>
               <w:t>Boylam</w:t>
             </w:r>
@@ -994,7 +1316,7 @@
               <w:bottom w:type="dxa" w:w="80"/>
               <w:right w:type="dxa" w:w="80"/>
             </w:tcMar>
-            <w:vAlign w:val="top"/>
+            <w:vAlign w:val="center"/>
           </w:tcPr>
           <w:p/>
         </w:tc>
@@ -1014,7 +1336,7 @@
               <w:bottom w:type="dxa" w:w="80"/>
               <w:right w:type="dxa" w:w="80"/>
             </w:tcMar>
-            <w:vAlign w:val="top"/>
+            <w:vAlign w:val="center"/>
           </w:tcPr>
           <w:p/>
         </w:tc>
@@ -1034,7 +1356,7 @@
               <w:bottom w:type="dxa" w:w="80"/>
               <w:right w:type="dxa" w:w="80"/>
             </w:tcMar>
-            <w:vAlign w:val="top"/>
+            <w:vAlign w:val="center"/>
           </w:tcPr>
           <w:p/>
         </w:tc>
@@ -1054,7 +1376,7 @@
               <w:bottom w:type="dxa" w:w="80"/>
               <w:right w:type="dxa" w:w="80"/>
             </w:tcMar>
-            <w:vAlign w:val="top"/>
+            <w:vAlign w:val="center"/>
           </w:tcPr>
           <w:p/>
         </w:tc>
@@ -1249,16 +1571,56 @@
               <w:bottom w:type="dxa" w:w="80"/>
               <w:right w:type="dxa" w:w="80"/>
             </w:tcMar>
-            <w:vAlign w:val="top"/>
+            <w:vAlign w:val="center"/>
           </w:tcPr>
           <w:p>
             <w:pPr>
-              <w:pStyle w:val="Table Style 2"/>
+              <w:keepNext w:val="0"/>
+              <w:keepLines w:val="0"/>
+              <w:pageBreakBefore w:val="0"/>
+              <w:widowControl w:val="1"/>
+              <w:shd w:val="clear" w:color="auto" w:fill="auto"/>
+              <w:suppressAutoHyphens w:val="0"/>
+              <w:bidi w:val="0"/>
+              <w:spacing w:before="0" w:after="0" w:line="240" w:lineRule="auto"/>
+              <w:ind w:left="0" w:right="0" w:firstLine="0"/>
+              <w:jc w:val="center"/>
+              <w:outlineLvl w:val="9"/>
+              <w:rPr>
+                <w:rtl w:val="0"/>
+              </w:rPr>
             </w:pPr>
             <w:r>
               <w:rPr>
+                <w:rFonts w:ascii="Futura" w:cs="Arial Unicode MS" w:hAnsi="Futura" w:eastAsia="Arial Unicode MS"/>
+                <w:b w:val="0"/>
+                <w:bCs w:val="0"/>
+                <w:i w:val="0"/>
+                <w:iCs w:val="0"/>
+                <w:caps w:val="0"/>
+                <w:smallCaps w:val="0"/>
+                <w:strike w:val="0"/>
+                <w:dstrike w:val="0"/>
+                <w:outline w:val="0"/>
+                <w:color w:val="000000"/>
+                <w:spacing w:val="0"/>
+                <w:kern w:val="0"/>
+                <w:position w:val="0"/>
+                <w:sz w:val="20"/>
+                <w:szCs w:val="20"/>
+                <w:u w:val="none" w:color="000000"/>
                 <w:shd w:val="nil" w:color="auto" w:fill="auto"/>
+                <w:vertAlign w:val="baseline"/>
                 <w:rtl w:val="0"/>
+                <w14:textOutline w14:w="12700" w14:cap="flat">
+                  <w14:noFill/>
+                  <w14:miter w14:lim="400000"/>
+                </w14:textOutline>
+                <w14:textFill>
+                  <w14:solidFill>
+                    <w14:srgbClr w14:val="000000"/>
+                  </w14:solidFill>
+                </w14:textFill>
               </w:rPr>
               <w:t>Tarih</w:t>
             </w:r>
@@ -1280,58 +1642,260 @@
               <w:bottom w:type="dxa" w:w="80"/>
               <w:right w:type="dxa" w:w="80"/>
             </w:tcMar>
-            <w:vAlign w:val="top"/>
+            <w:vAlign w:val="center"/>
           </w:tcPr>
           <w:p>
             <w:pPr>
-              <w:pStyle w:val="Table Style 2"/>
+              <w:keepNext w:val="0"/>
+              <w:keepLines w:val="0"/>
+              <w:pageBreakBefore w:val="0"/>
+              <w:widowControl w:val="1"/>
+              <w:shd w:val="clear" w:color="auto" w:fill="auto"/>
+              <w:suppressAutoHyphens w:val="0"/>
+              <w:bidi w:val="0"/>
+              <w:spacing w:before="0" w:after="0" w:line="240" w:lineRule="auto"/>
+              <w:ind w:left="0" w:right="0" w:firstLine="0"/>
+              <w:jc w:val="center"/>
+              <w:outlineLvl w:val="9"/>
+              <w:rPr>
+                <w:rtl w:val="0"/>
+              </w:rPr>
             </w:pPr>
             <w:r>
               <w:rPr>
+                <w:rFonts w:ascii="Futura" w:cs="Arial Unicode MS" w:hAnsi="Futura" w:eastAsia="Arial Unicode MS"/>
+                <w:b w:val="0"/>
+                <w:bCs w:val="0"/>
+                <w:i w:val="0"/>
+                <w:iCs w:val="0"/>
+                <w:caps w:val="0"/>
+                <w:smallCaps w:val="0"/>
+                <w:strike w:val="0"/>
+                <w:dstrike w:val="0"/>
+                <w:outline w:val="0"/>
+                <w:color w:val="000000"/>
+                <w:spacing w:val="0"/>
+                <w:kern w:val="0"/>
+                <w:position w:val="0"/>
+                <w:sz w:val="20"/>
+                <w:szCs w:val="20"/>
+                <w:u w:val="none" w:color="000000"/>
                 <w:shd w:val="nil" w:color="auto" w:fill="auto"/>
+                <w:vertAlign w:val="baseline"/>
                 <w:rtl w:val="0"/>
+                <w14:textOutline w14:w="12700" w14:cap="flat">
+                  <w14:noFill/>
+                  <w14:miter w14:lim="400000"/>
+                </w14:textOutline>
+                <w14:textFill>
+                  <w14:solidFill>
+                    <w14:srgbClr w14:val="000000"/>
+                  </w14:solidFill>
+                </w14:textFill>
               </w:rPr>
               <w:t>B</w:t>
             </w:r>
             <w:r>
               <w:rPr>
+                <w:rFonts w:ascii="Futura" w:cs="Arial Unicode MS" w:hAnsi="Futura" w:eastAsia="Arial Unicode MS" w:hint="default"/>
+                <w:b w:val="0"/>
+                <w:bCs w:val="0"/>
+                <w:i w:val="0"/>
+                <w:iCs w:val="0"/>
+                <w:caps w:val="0"/>
+                <w:smallCaps w:val="0"/>
+                <w:strike w:val="0"/>
+                <w:dstrike w:val="0"/>
+                <w:outline w:val="0"/>
+                <w:color w:val="000000"/>
+                <w:spacing w:val="0"/>
+                <w:kern w:val="0"/>
+                <w:position w:val="0"/>
+                <w:sz w:val="20"/>
+                <w:szCs w:val="20"/>
+                <w:u w:val="none" w:color="000000"/>
                 <w:shd w:val="nil" w:color="auto" w:fill="auto"/>
+                <w:vertAlign w:val="baseline"/>
                 <w:rtl w:val="0"/>
+                <w14:textOutline w14:w="12700" w14:cap="flat">
+                  <w14:noFill/>
+                  <w14:miter w14:lim="400000"/>
+                </w14:textOutline>
+                <w14:textFill>
+                  <w14:solidFill>
+                    <w14:srgbClr w14:val="000000"/>
+                  </w14:solidFill>
+                </w14:textFill>
               </w:rPr>
               <w:t>ü</w:t>
             </w:r>
             <w:r>
               <w:rPr>
+                <w:rFonts w:ascii="Futura" w:cs="Arial Unicode MS" w:hAnsi="Futura" w:eastAsia="Arial Unicode MS"/>
+                <w:b w:val="0"/>
+                <w:bCs w:val="0"/>
+                <w:i w:val="0"/>
+                <w:iCs w:val="0"/>
+                <w:caps w:val="0"/>
+                <w:smallCaps w:val="0"/>
+                <w:strike w:val="0"/>
+                <w:dstrike w:val="0"/>
+                <w:outline w:val="0"/>
+                <w:color w:val="000000"/>
+                <w:spacing w:val="0"/>
+                <w:kern w:val="0"/>
+                <w:position w:val="0"/>
+                <w:sz w:val="20"/>
+                <w:szCs w:val="20"/>
+                <w:u w:val="none" w:color="000000"/>
                 <w:shd w:val="nil" w:color="auto" w:fill="auto"/>
+                <w:vertAlign w:val="baseline"/>
                 <w:rtl w:val="0"/>
+                <w14:textOutline w14:w="12700" w14:cap="flat">
+                  <w14:noFill/>
+                  <w14:miter w14:lim="400000"/>
+                </w14:textOutline>
+                <w14:textFill>
+                  <w14:solidFill>
+                    <w14:srgbClr w14:val="000000"/>
+                  </w14:solidFill>
+                </w14:textFill>
               </w:rPr>
               <w:t>y</w:t>
             </w:r>
             <w:r>
               <w:rPr>
+                <w:rFonts w:ascii="Futura" w:cs="Arial Unicode MS" w:hAnsi="Futura" w:eastAsia="Arial Unicode MS" w:hint="default"/>
+                <w:b w:val="0"/>
+                <w:bCs w:val="0"/>
+                <w:i w:val="0"/>
+                <w:iCs w:val="0"/>
+                <w:caps w:val="0"/>
+                <w:smallCaps w:val="0"/>
+                <w:strike w:val="0"/>
+                <w:dstrike w:val="0"/>
+                <w:outline w:val="0"/>
+                <w:color w:val="000000"/>
+                <w:spacing w:val="0"/>
+                <w:kern w:val="0"/>
+                <w:position w:val="0"/>
+                <w:sz w:val="20"/>
+                <w:szCs w:val="20"/>
+                <w:u w:val="none" w:color="000000"/>
                 <w:shd w:val="nil" w:color="auto" w:fill="auto"/>
+                <w:vertAlign w:val="baseline"/>
                 <w:rtl w:val="0"/>
+                <w14:textOutline w14:w="12700" w14:cap="flat">
+                  <w14:noFill/>
+                  <w14:miter w14:lim="400000"/>
+                </w14:textOutline>
+                <w14:textFill>
+                  <w14:solidFill>
+                    <w14:srgbClr w14:val="000000"/>
+                  </w14:solidFill>
+                </w14:textFill>
               </w:rPr>
               <w:t>ü</w:t>
             </w:r>
             <w:r>
               <w:rPr>
+                <w:rFonts w:ascii="Futura" w:cs="Arial Unicode MS" w:hAnsi="Futura" w:eastAsia="Arial Unicode MS"/>
+                <w:b w:val="0"/>
+                <w:bCs w:val="0"/>
+                <w:i w:val="0"/>
+                <w:iCs w:val="0"/>
+                <w:caps w:val="0"/>
+                <w:smallCaps w:val="0"/>
+                <w:strike w:val="0"/>
+                <w:dstrike w:val="0"/>
+                <w:outline w:val="0"/>
+                <w:color w:val="000000"/>
+                <w:spacing w:val="0"/>
+                <w:kern w:val="0"/>
+                <w:position w:val="0"/>
+                <w:sz w:val="20"/>
+                <w:szCs w:val="20"/>
+                <w:u w:val="none" w:color="000000"/>
                 <w:shd w:val="nil" w:color="auto" w:fill="auto"/>
+                <w:vertAlign w:val="baseline"/>
                 <w:rtl w:val="0"/>
+                <w14:textOutline w14:w="12700" w14:cap="flat">
+                  <w14:noFill/>
+                  <w14:miter w14:lim="400000"/>
+                </w14:textOutline>
+                <w14:textFill>
+                  <w14:solidFill>
+                    <w14:srgbClr w14:val="000000"/>
+                  </w14:solidFill>
+                </w14:textFill>
               </w:rPr>
               <w:t>kl</w:t>
             </w:r>
             <w:r>
               <w:rPr>
+                <w:rFonts w:ascii="Futura" w:cs="Arial Unicode MS" w:hAnsi="Futura" w:eastAsia="Arial Unicode MS" w:hint="default"/>
+                <w:b w:val="0"/>
+                <w:bCs w:val="0"/>
+                <w:i w:val="0"/>
+                <w:iCs w:val="0"/>
+                <w:caps w:val="0"/>
+                <w:smallCaps w:val="0"/>
+                <w:strike w:val="0"/>
+                <w:dstrike w:val="0"/>
+                <w:outline w:val="0"/>
+                <w:color w:val="000000"/>
+                <w:spacing w:val="0"/>
+                <w:kern w:val="0"/>
+                <w:position w:val="0"/>
+                <w:sz w:val="20"/>
+                <w:szCs w:val="20"/>
+                <w:u w:val="none" w:color="000000"/>
                 <w:shd w:val="nil" w:color="auto" w:fill="auto"/>
+                <w:vertAlign w:val="baseline"/>
                 <w:rtl w:val="0"/>
+                <w14:textOutline w14:w="12700" w14:cap="flat">
+                  <w14:noFill/>
+                  <w14:miter w14:lim="400000"/>
+                </w14:textOutline>
+                <w14:textFill>
+                  <w14:solidFill>
+                    <w14:srgbClr w14:val="000000"/>
+                  </w14:solidFill>
+                </w14:textFill>
               </w:rPr>
               <w:t>ü</w:t>
             </w:r>
             <w:r>
               <w:rPr>
+                <w:rFonts w:ascii="Futura" w:cs="Arial Unicode MS" w:hAnsi="Futura" w:eastAsia="Arial Unicode MS"/>
+                <w:b w:val="0"/>
+                <w:bCs w:val="0"/>
+                <w:i w:val="0"/>
+                <w:iCs w:val="0"/>
+                <w:caps w:val="0"/>
+                <w:smallCaps w:val="0"/>
+                <w:strike w:val="0"/>
+                <w:dstrike w:val="0"/>
+                <w:outline w:val="0"/>
+                <w:color w:val="000000"/>
+                <w:spacing w:val="0"/>
+                <w:kern w:val="0"/>
+                <w:position w:val="0"/>
+                <w:sz w:val="20"/>
+                <w:szCs w:val="20"/>
+                <w:u w:val="none" w:color="000000"/>
                 <w:shd w:val="nil" w:color="auto" w:fill="auto"/>
+                <w:vertAlign w:val="baseline"/>
                 <w:rtl w:val="0"/>
+                <w14:textOutline w14:w="12700" w14:cap="flat">
+                  <w14:noFill/>
+                  <w14:miter w14:lim="400000"/>
+                </w14:textOutline>
+                <w14:textFill>
+                  <w14:solidFill>
+                    <w14:srgbClr w14:val="000000"/>
+                  </w14:solidFill>
+                </w14:textFill>
               </w:rPr>
               <w:t>k</w:t>
             </w:r>
@@ -1353,16 +1917,56 @@
               <w:bottom w:type="dxa" w:w="80"/>
               <w:right w:type="dxa" w:w="80"/>
             </w:tcMar>
-            <w:vAlign w:val="top"/>
+            <w:vAlign w:val="center"/>
           </w:tcPr>
           <w:p>
             <w:pPr>
-              <w:pStyle w:val="Table Style 2"/>
+              <w:keepNext w:val="0"/>
+              <w:keepLines w:val="0"/>
+              <w:pageBreakBefore w:val="0"/>
+              <w:widowControl w:val="1"/>
+              <w:shd w:val="clear" w:color="auto" w:fill="auto"/>
+              <w:suppressAutoHyphens w:val="0"/>
+              <w:bidi w:val="0"/>
+              <w:spacing w:before="0" w:after="0" w:line="240" w:lineRule="auto"/>
+              <w:ind w:left="0" w:right="0" w:firstLine="0"/>
+              <w:jc w:val="center"/>
+              <w:outlineLvl w:val="9"/>
+              <w:rPr>
+                <w:rtl w:val="0"/>
+              </w:rPr>
             </w:pPr>
             <w:r>
               <w:rPr>
+                <w:rFonts w:ascii="Futura" w:cs="Arial Unicode MS" w:hAnsi="Futura" w:eastAsia="Arial Unicode MS"/>
+                <w:b w:val="0"/>
+                <w:bCs w:val="0"/>
+                <w:i w:val="0"/>
+                <w:iCs w:val="0"/>
+                <w:caps w:val="0"/>
+                <w:smallCaps w:val="0"/>
+                <w:strike w:val="0"/>
+                <w:dstrike w:val="0"/>
+                <w:outline w:val="0"/>
+                <w:color w:val="000000"/>
+                <w:spacing w:val="0"/>
+                <w:kern w:val="0"/>
+                <w:position w:val="0"/>
+                <w:sz w:val="20"/>
+                <w:szCs w:val="20"/>
+                <w:u w:val="none" w:color="000000"/>
                 <w:shd w:val="nil" w:color="auto" w:fill="auto"/>
+                <w:vertAlign w:val="baseline"/>
                 <w:rtl w:val="0"/>
+                <w14:textOutline w14:w="12700" w14:cap="flat">
+                  <w14:noFill/>
+                  <w14:miter w14:lim="400000"/>
+                </w14:textOutline>
+                <w14:textFill>
+                  <w14:solidFill>
+                    <w14:srgbClr w14:val="000000"/>
+                  </w14:solidFill>
+                </w14:textFill>
               </w:rPr>
               <w:t>Enlem</w:t>
             </w:r>
@@ -1384,16 +1988,56 @@
               <w:bottom w:type="dxa" w:w="80"/>
               <w:right w:type="dxa" w:w="80"/>
             </w:tcMar>
-            <w:vAlign w:val="top"/>
+            <w:vAlign w:val="center"/>
           </w:tcPr>
           <w:p>
             <w:pPr>
-              <w:pStyle w:val="Table Style 2"/>
+              <w:keepNext w:val="0"/>
+              <w:keepLines w:val="0"/>
+              <w:pageBreakBefore w:val="0"/>
+              <w:widowControl w:val="1"/>
+              <w:shd w:val="clear" w:color="auto" w:fill="auto"/>
+              <w:suppressAutoHyphens w:val="0"/>
+              <w:bidi w:val="0"/>
+              <w:spacing w:before="0" w:after="0" w:line="240" w:lineRule="auto"/>
+              <w:ind w:left="0" w:right="0" w:firstLine="0"/>
+              <w:jc w:val="center"/>
+              <w:outlineLvl w:val="9"/>
+              <w:rPr>
+                <w:rtl w:val="0"/>
+              </w:rPr>
             </w:pPr>
             <w:r>
               <w:rPr>
+                <w:rFonts w:ascii="Futura" w:cs="Arial Unicode MS" w:hAnsi="Futura" w:eastAsia="Arial Unicode MS"/>
+                <w:b w:val="0"/>
+                <w:bCs w:val="0"/>
+                <w:i w:val="0"/>
+                <w:iCs w:val="0"/>
+                <w:caps w:val="0"/>
+                <w:smallCaps w:val="0"/>
+                <w:strike w:val="0"/>
+                <w:dstrike w:val="0"/>
+                <w:outline w:val="0"/>
+                <w:color w:val="000000"/>
+                <w:spacing w:val="0"/>
+                <w:kern w:val="0"/>
+                <w:position w:val="0"/>
+                <w:sz w:val="20"/>
+                <w:szCs w:val="20"/>
+                <w:u w:val="none" w:color="000000"/>
                 <w:shd w:val="nil" w:color="auto" w:fill="auto"/>
+                <w:vertAlign w:val="baseline"/>
                 <w:rtl w:val="0"/>
+                <w14:textOutline w14:w="12700" w14:cap="flat">
+                  <w14:noFill/>
+                  <w14:miter w14:lim="400000"/>
+                </w14:textOutline>
+                <w14:textFill>
+                  <w14:solidFill>
+                    <w14:srgbClr w14:val="000000"/>
+                  </w14:solidFill>
+                </w14:textFill>
               </w:rPr>
               <w:t>Boylam</w:t>
             </w:r>
@@ -1423,7 +2067,7 @@
               <w:bottom w:type="dxa" w:w="80"/>
               <w:right w:type="dxa" w:w="80"/>
             </w:tcMar>
-            <w:vAlign w:val="top"/>
+            <w:vAlign w:val="center"/>
           </w:tcPr>
           <w:p/>
         </w:tc>
@@ -1443,7 +2087,7 @@
               <w:bottom w:type="dxa" w:w="80"/>
               <w:right w:type="dxa" w:w="80"/>
             </w:tcMar>
-            <w:vAlign w:val="top"/>
+            <w:vAlign w:val="center"/>
           </w:tcPr>
           <w:p/>
         </w:tc>
@@ -1463,7 +2107,7 @@
               <w:bottom w:type="dxa" w:w="80"/>
               <w:right w:type="dxa" w:w="80"/>
             </w:tcMar>
-            <w:vAlign w:val="top"/>
+            <w:vAlign w:val="center"/>
           </w:tcPr>
           <w:p/>
         </w:tc>
@@ -1483,7 +2127,7 @@
               <w:bottom w:type="dxa" w:w="80"/>
               <w:right w:type="dxa" w:w="80"/>
             </w:tcMar>
-            <w:vAlign w:val="top"/>
+            <w:vAlign w:val="center"/>
           </w:tcPr>
           <w:p/>
         </w:tc>
@@ -1695,7 +2339,16 @@
           <w:bCs w:val="0"/>
           <w:rtl w:val="0"/>
         </w:rPr>
-        <w:t>Deprem Tahmini B</w:t>
+        <w:t>Deprem Tahmin</w:t>
+      </w:r>
+      <w:r>
+        <w:rPr>
+          <w:rFonts w:ascii="Futura Bold" w:hAnsi="Futura Bold"/>
+          <w:b w:val="0"/>
+          <w:bCs w:val="0"/>
+          <w:rtl w:val="0"/>
+        </w:rPr>
+        <w:t xml:space="preserve">leri </w:t>
       </w:r>
       <w:r>
         <w:rPr>
@@ -1704,7 +2357,7 @@
           <w:bCs w:val="0"/>
           <w:rtl w:val="0"/>
         </w:rPr>
-        <w:t>ü</w:t>
+        <w:t>İ</w:t>
       </w:r>
       <w:r>
         <w:rPr>
@@ -1713,43 +2366,7 @@
           <w:bCs w:val="0"/>
           <w:rtl w:val="0"/>
         </w:rPr>
-        <w:t>y</w:t>
-      </w:r>
-      <w:r>
-        <w:rPr>
-          <w:rFonts w:ascii="Futura Bold" w:hAnsi="Futura Bold" w:hint="default"/>
-          <w:b w:val="0"/>
-          <w:bCs w:val="0"/>
-          <w:rtl w:val="0"/>
-        </w:rPr>
-        <w:t>ü</w:t>
-      </w:r>
-      <w:r>
-        <w:rPr>
-          <w:rFonts w:ascii="Futura Bold" w:hAnsi="Futura Bold"/>
-          <w:b w:val="0"/>
-          <w:bCs w:val="0"/>
-          <w:rtl w:val="0"/>
-        </w:rPr>
-        <w:t>kl</w:t>
-      </w:r>
-      <w:r>
-        <w:rPr>
-          <w:rFonts w:ascii="Futura Bold" w:hAnsi="Futura Bold" w:hint="default"/>
-          <w:b w:val="0"/>
-          <w:bCs w:val="0"/>
-          <w:rtl w:val="0"/>
-        </w:rPr>
-        <w:t xml:space="preserve">üğü </w:t>
-      </w:r>
-      <w:r>
-        <w:rPr>
-          <w:rFonts w:ascii="Futura Bold" w:hAnsi="Futura Bold"/>
-          <w:b w:val="0"/>
-          <w:bCs w:val="0"/>
-          <w:rtl w:val="0"/>
-        </w:rPr>
-        <w:t>Ortalamas</w:t>
+        <w:t>statistik Hesaplar</w:t>
       </w:r>
       <w:r>
         <w:rPr>
@@ -1769,9 +2386,17 @@
         </w:rPr>
       </w:pPr>
     </w:p>
+    <w:p>
+      <w:pPr>
+        <w:pStyle w:val="Body A"/>
+        <w:rPr>
+          <w:rFonts w:ascii="Futura" w:cs="Futura" w:hAnsi="Futura" w:eastAsia="Futura"/>
+        </w:rPr>
+      </w:pPr>
+    </w:p>
     <w:tbl>
       <w:tblPr>
-        <w:tblW w:w="9630" w:type="dxa"/>
+        <w:tblW w:w="9519" w:type="dxa"/>
         <w:jc w:val="left"/>
         <w:tblInd w:w="216" w:type="dxa"/>
         <w:tblBorders>
@@ -1786,20 +2411,22 @@
         <w:tblLayout w:type="fixed"/>
       </w:tblPr>
       <w:tblGrid>
-        <w:gridCol w:w="3210"/>
-        <w:gridCol w:w="3210"/>
-        <w:gridCol w:w="3210"/>
+        <w:gridCol w:w="1903"/>
+        <w:gridCol w:w="1904"/>
+        <w:gridCol w:w="1904"/>
+        <w:gridCol w:w="1904"/>
+        <w:gridCol w:w="1904"/>
       </w:tblGrid>
       <w:tr>
         <w:tblPrEx>
           <w:shd w:val="clear" w:color="auto" w:fill="cadfff"/>
         </w:tblPrEx>
         <w:trPr>
-          <w:trHeight w:val="300" w:hRule="atLeast"/>
+          <w:trHeight w:val="519" w:hRule="atLeast"/>
         </w:trPr>
         <w:tc>
           <w:tcPr>
-            <w:tcW w:type="dxa" w:w="3210"/>
+            <w:tcW w:type="dxa" w:w="1903"/>
             <w:tcBorders>
               <w:top w:val="single" w:color="000000" w:sz="2" w:space="0" w:shadow="0" w:frame="0"/>
               <w:left w:val="single" w:color="000000" w:sz="2" w:space="0" w:shadow="0" w:frame="0"/>
@@ -1813,73 +2440,294 @@
               <w:bottom w:type="dxa" w:w="80"/>
               <w:right w:type="dxa" w:w="80"/>
             </w:tcMar>
-            <w:vAlign w:val="top"/>
+            <w:vAlign w:val="center"/>
           </w:tcPr>
           <w:p>
             <w:pPr>
-              <w:pStyle w:val="Table Style 2"/>
+              <w:keepNext w:val="0"/>
+              <w:keepLines w:val="0"/>
+              <w:pageBreakBefore w:val="0"/>
+              <w:widowControl w:val="1"/>
+              <w:shd w:val="clear" w:color="auto" w:fill="auto"/>
+              <w:suppressAutoHyphens w:val="0"/>
+              <w:bidi w:val="0"/>
+              <w:spacing w:before="0" w:after="0" w:line="240" w:lineRule="auto"/>
+              <w:ind w:left="0" w:right="0" w:firstLine="0"/>
+              <w:jc w:val="center"/>
+              <w:outlineLvl w:val="9"/>
+              <w:rPr>
+                <w:rtl w:val="0"/>
+              </w:rPr>
             </w:pPr>
             <w:r>
               <w:rPr>
-                <w:rFonts w:ascii="Futura" w:hAnsi="Futura"/>
+                <w:rFonts w:ascii="Futura" w:cs="Arial Unicode MS" w:hAnsi="Futura" w:eastAsia="Arial Unicode MS"/>
+                <w:b w:val="0"/>
+                <w:bCs w:val="0"/>
+                <w:i w:val="0"/>
+                <w:iCs w:val="0"/>
+                <w:caps w:val="0"/>
+                <w:smallCaps w:val="0"/>
+                <w:strike w:val="0"/>
+                <w:dstrike w:val="0"/>
+                <w:outline w:val="0"/>
+                <w:color w:val="000000"/>
+                <w:spacing w:val="0"/>
+                <w:kern w:val="0"/>
+                <w:position w:val="0"/>
+                <w:sz w:val="20"/>
+                <w:szCs w:val="20"/>
+                <w:u w:val="none" w:color="000000"/>
                 <w:shd w:val="nil" w:color="auto" w:fill="auto"/>
+                <w:vertAlign w:val="baseline"/>
                 <w:rtl w:val="0"/>
+                <w14:textOutline w14:w="12700" w14:cap="flat">
+                  <w14:noFill/>
+                  <w14:miter w14:lim="400000"/>
+                </w14:textOutline>
+                <w14:textFill>
+                  <w14:solidFill>
+                    <w14:srgbClr w14:val="000000"/>
+                  </w14:solidFill>
+                </w14:textFill>
               </w:rPr>
               <w:t>B</w:t>
             </w:r>
             <w:r>
               <w:rPr>
-                <w:rFonts w:ascii="Futura" w:hAnsi="Futura" w:hint="default"/>
+                <w:rFonts w:ascii="Futura" w:cs="Arial Unicode MS" w:hAnsi="Futura" w:eastAsia="Arial Unicode MS" w:hint="default"/>
+                <w:b w:val="0"/>
+                <w:bCs w:val="0"/>
+                <w:i w:val="0"/>
+                <w:iCs w:val="0"/>
+                <w:caps w:val="0"/>
+                <w:smallCaps w:val="0"/>
+                <w:strike w:val="0"/>
+                <w:dstrike w:val="0"/>
+                <w:outline w:val="0"/>
+                <w:color w:val="000000"/>
+                <w:spacing w:val="0"/>
+                <w:kern w:val="0"/>
+                <w:position w:val="0"/>
+                <w:sz w:val="20"/>
+                <w:szCs w:val="20"/>
+                <w:u w:val="none" w:color="000000"/>
                 <w:shd w:val="nil" w:color="auto" w:fill="auto"/>
+                <w:vertAlign w:val="baseline"/>
                 <w:rtl w:val="0"/>
+                <w14:textOutline w14:w="12700" w14:cap="flat">
+                  <w14:noFill/>
+                  <w14:miter w14:lim="400000"/>
+                </w14:textOutline>
+                <w14:textFill>
+                  <w14:solidFill>
+                    <w14:srgbClr w14:val="000000"/>
+                  </w14:solidFill>
+                </w14:textFill>
               </w:rPr>
               <w:t>ü</w:t>
             </w:r>
             <w:r>
               <w:rPr>
-                <w:rFonts w:ascii="Futura" w:hAnsi="Futura"/>
+                <w:rFonts w:ascii="Futura" w:cs="Arial Unicode MS" w:hAnsi="Futura" w:eastAsia="Arial Unicode MS"/>
+                <w:b w:val="0"/>
+                <w:bCs w:val="0"/>
+                <w:i w:val="0"/>
+                <w:iCs w:val="0"/>
+                <w:caps w:val="0"/>
+                <w:smallCaps w:val="0"/>
+                <w:strike w:val="0"/>
+                <w:dstrike w:val="0"/>
+                <w:outline w:val="0"/>
+                <w:color w:val="000000"/>
+                <w:spacing w:val="0"/>
+                <w:kern w:val="0"/>
+                <w:position w:val="0"/>
+                <w:sz w:val="20"/>
+                <w:szCs w:val="20"/>
+                <w:u w:val="none" w:color="000000"/>
                 <w:shd w:val="nil" w:color="auto" w:fill="auto"/>
+                <w:vertAlign w:val="baseline"/>
                 <w:rtl w:val="0"/>
+                <w14:textOutline w14:w="12700" w14:cap="flat">
+                  <w14:noFill/>
+                  <w14:miter w14:lim="400000"/>
+                </w14:textOutline>
+                <w14:textFill>
+                  <w14:solidFill>
+                    <w14:srgbClr w14:val="000000"/>
+                  </w14:solidFill>
+                </w14:textFill>
               </w:rPr>
               <w:t>y</w:t>
             </w:r>
             <w:r>
               <w:rPr>
-                <w:rFonts w:ascii="Futura" w:hAnsi="Futura" w:hint="default"/>
+                <w:rFonts w:ascii="Futura" w:cs="Arial Unicode MS" w:hAnsi="Futura" w:eastAsia="Arial Unicode MS" w:hint="default"/>
+                <w:b w:val="0"/>
+                <w:bCs w:val="0"/>
+                <w:i w:val="0"/>
+                <w:iCs w:val="0"/>
+                <w:caps w:val="0"/>
+                <w:smallCaps w:val="0"/>
+                <w:strike w:val="0"/>
+                <w:dstrike w:val="0"/>
+                <w:outline w:val="0"/>
+                <w:color w:val="000000"/>
+                <w:spacing w:val="0"/>
+                <w:kern w:val="0"/>
+                <w:position w:val="0"/>
+                <w:sz w:val="20"/>
+                <w:szCs w:val="20"/>
+                <w:u w:val="none" w:color="000000"/>
                 <w:shd w:val="nil" w:color="auto" w:fill="auto"/>
+                <w:vertAlign w:val="baseline"/>
                 <w:rtl w:val="0"/>
+                <w14:textOutline w14:w="12700" w14:cap="flat">
+                  <w14:noFill/>
+                  <w14:miter w14:lim="400000"/>
+                </w14:textOutline>
+                <w14:textFill>
+                  <w14:solidFill>
+                    <w14:srgbClr w14:val="000000"/>
+                  </w14:solidFill>
+                </w14:textFill>
               </w:rPr>
               <w:t>ü</w:t>
             </w:r>
             <w:r>
               <w:rPr>
-                <w:rFonts w:ascii="Futura" w:hAnsi="Futura"/>
+                <w:rFonts w:ascii="Futura" w:cs="Arial Unicode MS" w:hAnsi="Futura" w:eastAsia="Arial Unicode MS"/>
+                <w:b w:val="0"/>
+                <w:bCs w:val="0"/>
+                <w:i w:val="0"/>
+                <w:iCs w:val="0"/>
+                <w:caps w:val="0"/>
+                <w:smallCaps w:val="0"/>
+                <w:strike w:val="0"/>
+                <w:dstrike w:val="0"/>
+                <w:outline w:val="0"/>
+                <w:color w:val="000000"/>
+                <w:spacing w:val="0"/>
+                <w:kern w:val="0"/>
+                <w:position w:val="0"/>
+                <w:sz w:val="20"/>
+                <w:szCs w:val="20"/>
+                <w:u w:val="none" w:color="000000"/>
                 <w:shd w:val="nil" w:color="auto" w:fill="auto"/>
+                <w:vertAlign w:val="baseline"/>
                 <w:rtl w:val="0"/>
+                <w14:textOutline w14:w="12700" w14:cap="flat">
+                  <w14:noFill/>
+                  <w14:miter w14:lim="400000"/>
+                </w14:textOutline>
+                <w14:textFill>
+                  <w14:solidFill>
+                    <w14:srgbClr w14:val="000000"/>
+                  </w14:solidFill>
+                </w14:textFill>
               </w:rPr>
               <w:t>kl</w:t>
             </w:r>
             <w:r>
               <w:rPr>
-                <w:rFonts w:ascii="Futura" w:hAnsi="Futura" w:hint="default"/>
+                <w:rFonts w:ascii="Futura" w:cs="Arial Unicode MS" w:hAnsi="Futura" w:eastAsia="Arial Unicode MS" w:hint="default"/>
+                <w:b w:val="0"/>
+                <w:bCs w:val="0"/>
+                <w:i w:val="0"/>
+                <w:iCs w:val="0"/>
+                <w:caps w:val="0"/>
+                <w:smallCaps w:val="0"/>
+                <w:strike w:val="0"/>
+                <w:dstrike w:val="0"/>
+                <w:outline w:val="0"/>
+                <w:color w:val="000000"/>
+                <w:spacing w:val="0"/>
+                <w:kern w:val="0"/>
+                <w:position w:val="0"/>
+                <w:sz w:val="20"/>
+                <w:szCs w:val="20"/>
+                <w:u w:val="none" w:color="000000"/>
                 <w:shd w:val="nil" w:color="auto" w:fill="auto"/>
+                <w:vertAlign w:val="baseline"/>
                 <w:rtl w:val="0"/>
+                <w14:textOutline w14:w="12700" w14:cap="flat">
+                  <w14:noFill/>
+                  <w14:miter w14:lim="400000"/>
+                </w14:textOutline>
+                <w14:textFill>
+                  <w14:solidFill>
+                    <w14:srgbClr w14:val="000000"/>
+                  </w14:solidFill>
+                </w14:textFill>
               </w:rPr>
               <w:t>ü</w:t>
             </w:r>
             <w:r>
               <w:rPr>
-                <w:rFonts w:ascii="Futura" w:hAnsi="Futura"/>
+                <w:rFonts w:ascii="Futura" w:cs="Arial Unicode MS" w:hAnsi="Futura" w:eastAsia="Arial Unicode MS"/>
+                <w:b w:val="0"/>
+                <w:bCs w:val="0"/>
+                <w:i w:val="0"/>
+                <w:iCs w:val="0"/>
+                <w:caps w:val="0"/>
+                <w:smallCaps w:val="0"/>
+                <w:strike w:val="0"/>
+                <w:dstrike w:val="0"/>
+                <w:outline w:val="0"/>
+                <w:color w:val="000000"/>
+                <w:spacing w:val="0"/>
+                <w:kern w:val="0"/>
+                <w:position w:val="0"/>
+                <w:sz w:val="20"/>
+                <w:szCs w:val="20"/>
+                <w:u w:val="none" w:color="000000"/>
                 <w:shd w:val="nil" w:color="auto" w:fill="auto"/>
+                <w:vertAlign w:val="baseline"/>
                 <w:rtl w:val="0"/>
+                <w14:textOutline w14:w="12700" w14:cap="flat">
+                  <w14:noFill/>
+                  <w14:miter w14:lim="400000"/>
+                </w14:textOutline>
+                <w14:textFill>
+                  <w14:solidFill>
+                    <w14:srgbClr w14:val="000000"/>
+                  </w14:solidFill>
+                </w14:textFill>
               </w:rPr>
               <w:t>kler Toplam</w:t>
             </w:r>
             <w:r>
               <w:rPr>
-                <w:rFonts w:ascii="Futura" w:hAnsi="Futura" w:hint="default"/>
+                <w:rFonts w:ascii="Futura" w:cs="Arial Unicode MS" w:hAnsi="Futura" w:eastAsia="Arial Unicode MS" w:hint="default"/>
+                <w:b w:val="0"/>
+                <w:bCs w:val="0"/>
+                <w:i w:val="0"/>
+                <w:iCs w:val="0"/>
+                <w:caps w:val="0"/>
+                <w:smallCaps w:val="0"/>
+                <w:strike w:val="0"/>
+                <w:dstrike w:val="0"/>
+                <w:outline w:val="0"/>
+                <w:color w:val="000000"/>
+                <w:spacing w:val="0"/>
+                <w:kern w:val="0"/>
+                <w:position w:val="0"/>
+                <w:sz w:val="20"/>
+                <w:szCs w:val="20"/>
+                <w:u w:val="none" w:color="000000"/>
                 <w:shd w:val="nil" w:color="auto" w:fill="auto"/>
+                <w:vertAlign w:val="baseline"/>
                 <w:rtl w:val="0"/>
+                <w14:textOutline w14:w="12700" w14:cap="flat">
+                  <w14:noFill/>
+                  <w14:miter w14:lim="400000"/>
+                </w14:textOutline>
+                <w14:textFill>
+                  <w14:solidFill>
+                    <w14:srgbClr w14:val="000000"/>
+                  </w14:solidFill>
+                </w14:textFill>
               </w:rPr>
               <w:t>ı</w:t>
             </w:r>
@@ -1887,7 +2735,7 @@
         </w:tc>
         <w:tc>
           <w:tcPr>
-            <w:tcW w:type="dxa" w:w="3210"/>
+            <w:tcW w:type="dxa" w:w="1903"/>
             <w:tcBorders>
               <w:top w:val="single" w:color="000000" w:sz="2" w:space="0" w:shadow="0" w:frame="0"/>
               <w:left w:val="single" w:color="000000" w:sz="2" w:space="0" w:shadow="0" w:frame="0"/>
@@ -1901,41 +2749,158 @@
               <w:bottom w:type="dxa" w:w="80"/>
               <w:right w:type="dxa" w:w="80"/>
             </w:tcMar>
-            <w:vAlign w:val="top"/>
+            <w:vAlign w:val="center"/>
           </w:tcPr>
           <w:p>
             <w:pPr>
-              <w:pStyle w:val="Table Style 2"/>
+              <w:keepNext w:val="0"/>
+              <w:keepLines w:val="0"/>
+              <w:pageBreakBefore w:val="0"/>
+              <w:widowControl w:val="1"/>
+              <w:shd w:val="clear" w:color="auto" w:fill="auto"/>
+              <w:suppressAutoHyphens w:val="0"/>
+              <w:bidi w:val="0"/>
+              <w:spacing w:before="0" w:after="0" w:line="240" w:lineRule="auto"/>
+              <w:ind w:left="0" w:right="0" w:firstLine="0"/>
+              <w:jc w:val="center"/>
+              <w:outlineLvl w:val="9"/>
+              <w:rPr>
+                <w:rtl w:val="0"/>
+              </w:rPr>
             </w:pPr>
             <w:r>
               <w:rPr>
-                <w:rFonts w:ascii="Futura" w:hAnsi="Futura"/>
+                <w:rFonts w:ascii="Futura" w:cs="Arial Unicode MS" w:hAnsi="Futura" w:eastAsia="Arial Unicode MS"/>
+                <w:b w:val="0"/>
+                <w:bCs w:val="0"/>
+                <w:i w:val="0"/>
+                <w:iCs w:val="0"/>
+                <w:caps w:val="0"/>
+                <w:smallCaps w:val="0"/>
+                <w:strike w:val="0"/>
+                <w:dstrike w:val="0"/>
+                <w:outline w:val="0"/>
+                <w:color w:val="000000"/>
+                <w:spacing w:val="0"/>
+                <w:kern w:val="0"/>
+                <w:position w:val="0"/>
+                <w:sz w:val="20"/>
+                <w:szCs w:val="20"/>
+                <w:u w:val="none" w:color="000000"/>
                 <w:shd w:val="nil" w:color="auto" w:fill="auto"/>
+                <w:vertAlign w:val="baseline"/>
                 <w:rtl w:val="0"/>
+                <w14:textOutline w14:w="12700" w14:cap="flat">
+                  <w14:noFill/>
+                  <w14:miter w14:lim="400000"/>
+                </w14:textOutline>
+                <w14:textFill>
+                  <w14:solidFill>
+                    <w14:srgbClr w14:val="000000"/>
+                  </w14:solidFill>
+                </w14:textFill>
               </w:rPr>
               <w:t>Deprem Say</w:t>
             </w:r>
             <w:r>
               <w:rPr>
-                <w:rFonts w:ascii="Futura" w:hAnsi="Futura" w:hint="default"/>
+                <w:rFonts w:ascii="Futura" w:cs="Arial Unicode MS" w:hAnsi="Futura" w:eastAsia="Arial Unicode MS" w:hint="default"/>
+                <w:b w:val="0"/>
+                <w:bCs w:val="0"/>
+                <w:i w:val="0"/>
+                <w:iCs w:val="0"/>
+                <w:caps w:val="0"/>
+                <w:smallCaps w:val="0"/>
+                <w:strike w:val="0"/>
+                <w:dstrike w:val="0"/>
+                <w:outline w:val="0"/>
+                <w:color w:val="000000"/>
+                <w:spacing w:val="0"/>
+                <w:kern w:val="0"/>
+                <w:position w:val="0"/>
+                <w:sz w:val="20"/>
+                <w:szCs w:val="20"/>
+                <w:u w:val="none" w:color="000000"/>
                 <w:shd w:val="nil" w:color="auto" w:fill="auto"/>
+                <w:vertAlign w:val="baseline"/>
                 <w:rtl w:val="0"/>
+                <w14:textOutline w14:w="12700" w14:cap="flat">
+                  <w14:noFill/>
+                  <w14:miter w14:lim="400000"/>
+                </w14:textOutline>
+                <w14:textFill>
+                  <w14:solidFill>
+                    <w14:srgbClr w14:val="000000"/>
+                  </w14:solidFill>
+                </w14:textFill>
               </w:rPr>
               <w:t>ı</w:t>
             </w:r>
             <w:r>
               <w:rPr>
-                <w:rFonts w:ascii="Futura" w:hAnsi="Futura"/>
+                <w:rFonts w:ascii="Futura" w:cs="Arial Unicode MS" w:hAnsi="Futura" w:eastAsia="Arial Unicode MS"/>
+                <w:b w:val="0"/>
+                <w:bCs w:val="0"/>
+                <w:i w:val="0"/>
+                <w:iCs w:val="0"/>
+                <w:caps w:val="0"/>
+                <w:smallCaps w:val="0"/>
+                <w:strike w:val="0"/>
+                <w:dstrike w:val="0"/>
+                <w:outline w:val="0"/>
+                <w:color w:val="000000"/>
+                <w:spacing w:val="0"/>
+                <w:kern w:val="0"/>
+                <w:position w:val="0"/>
+                <w:sz w:val="20"/>
+                <w:szCs w:val="20"/>
+                <w:u w:val="none" w:color="000000"/>
                 <w:shd w:val="nil" w:color="auto" w:fill="auto"/>
+                <w:vertAlign w:val="baseline"/>
                 <w:rtl w:val="0"/>
+                <w14:textOutline w14:w="12700" w14:cap="flat">
+                  <w14:noFill/>
+                  <w14:miter w14:lim="400000"/>
+                </w14:textOutline>
+                <w14:textFill>
+                  <w14:solidFill>
+                    <w14:srgbClr w14:val="000000"/>
+                  </w14:solidFill>
+                </w14:textFill>
               </w:rPr>
               <w:t>s</w:t>
             </w:r>
             <w:r>
               <w:rPr>
-                <w:rFonts w:ascii="Futura" w:hAnsi="Futura" w:hint="default"/>
+                <w:rFonts w:ascii="Futura" w:cs="Arial Unicode MS" w:hAnsi="Futura" w:eastAsia="Arial Unicode MS" w:hint="default"/>
+                <w:b w:val="0"/>
+                <w:bCs w:val="0"/>
+                <w:i w:val="0"/>
+                <w:iCs w:val="0"/>
+                <w:caps w:val="0"/>
+                <w:smallCaps w:val="0"/>
+                <w:strike w:val="0"/>
+                <w:dstrike w:val="0"/>
+                <w:outline w:val="0"/>
+                <w:color w:val="000000"/>
+                <w:spacing w:val="0"/>
+                <w:kern w:val="0"/>
+                <w:position w:val="0"/>
+                <w:sz w:val="20"/>
+                <w:szCs w:val="20"/>
+                <w:u w:val="none" w:color="000000"/>
                 <w:shd w:val="nil" w:color="auto" w:fill="auto"/>
+                <w:vertAlign w:val="baseline"/>
                 <w:rtl w:val="0"/>
+                <w14:textOutline w14:w="12700" w14:cap="flat">
+                  <w14:noFill/>
+                  <w14:miter w14:lim="400000"/>
+                </w14:textOutline>
+                <w14:textFill>
+                  <w14:solidFill>
+                    <w14:srgbClr w14:val="000000"/>
+                  </w14:solidFill>
+                </w14:textFill>
               </w:rPr>
               <w:t>ı</w:t>
             </w:r>
@@ -1943,7 +2908,7 @@
         </w:tc>
         <w:tc>
           <w:tcPr>
-            <w:tcW w:type="dxa" w:w="3210"/>
+            <w:tcW w:type="dxa" w:w="1903"/>
             <w:tcBorders>
               <w:top w:val="single" w:color="000000" w:sz="2" w:space="0" w:shadow="0" w:frame="0"/>
               <w:left w:val="single" w:color="000000" w:sz="2" w:space="0" w:shadow="0" w:frame="0"/>
@@ -1957,67 +2922,200 @@
               <w:bottom w:type="dxa" w:w="80"/>
               <w:right w:type="dxa" w:w="80"/>
             </w:tcMar>
-            <w:vAlign w:val="top"/>
+            <w:vAlign w:val="center"/>
           </w:tcPr>
           <w:p>
             <w:pPr>
-              <w:pStyle w:val="Table Style 2"/>
+              <w:keepNext w:val="0"/>
+              <w:keepLines w:val="0"/>
+              <w:pageBreakBefore w:val="0"/>
+              <w:widowControl w:val="1"/>
+              <w:shd w:val="clear" w:color="auto" w:fill="auto"/>
+              <w:suppressAutoHyphens w:val="0"/>
+              <w:bidi w:val="0"/>
+              <w:spacing w:before="0" w:after="0" w:line="240" w:lineRule="auto"/>
+              <w:ind w:left="0" w:right="0" w:firstLine="0"/>
+              <w:jc w:val="center"/>
+              <w:outlineLvl w:val="9"/>
+              <w:rPr>
+                <w:rtl w:val="0"/>
+              </w:rPr>
             </w:pPr>
             <w:r>
               <w:rPr>
-                <w:rFonts w:ascii="Futura" w:hAnsi="Futura"/>
+                <w:rFonts w:ascii="Futura" w:cs="Arial Unicode MS" w:hAnsi="Futura" w:eastAsia="Arial Unicode MS"/>
+                <w:b w:val="0"/>
+                <w:bCs w:val="0"/>
+                <w:i w:val="0"/>
+                <w:iCs w:val="0"/>
+                <w:caps w:val="0"/>
+                <w:smallCaps w:val="0"/>
+                <w:strike w:val="0"/>
+                <w:dstrike w:val="0"/>
+                <w:outline w:val="0"/>
+                <w:color w:val="000000"/>
+                <w:spacing w:val="0"/>
+                <w:kern w:val="0"/>
+                <w:position w:val="0"/>
+                <w:sz w:val="20"/>
+                <w:szCs w:val="20"/>
+                <w:u w:val="none" w:color="000000"/>
                 <w:shd w:val="nil" w:color="auto" w:fill="auto"/>
+                <w:vertAlign w:val="baseline"/>
+                <w:rtl w:val="0"/>
+                <w14:textOutline w14:w="12700" w14:cap="flat">
+                  <w14:noFill/>
+                  <w14:miter w14:lim="400000"/>
+                </w14:textOutline>
+                <w14:textFill>
+                  <w14:solidFill>
+                    <w14:srgbClr w14:val="000000"/>
+                  </w14:solidFill>
+                </w14:textFill>
+              </w:rPr>
+              <w:t>Aritmetik Ortalama</w:t>
+            </w:r>
+          </w:p>
+        </w:tc>
+        <w:tc>
+          <w:tcPr>
+            <w:tcW w:type="dxa" w:w="1903"/>
+            <w:tcBorders>
+              <w:top w:val="single" w:color="000000" w:sz="2" w:space="0" w:shadow="0" w:frame="0"/>
+              <w:left w:val="single" w:color="000000" w:sz="2" w:space="0" w:shadow="0" w:frame="0"/>
+              <w:bottom w:val="single" w:color="000000" w:sz="2" w:space="0" w:shadow="0" w:frame="0"/>
+              <w:right w:val="single" w:color="000000" w:sz="2" w:space="0" w:shadow="0" w:frame="0"/>
+            </w:tcBorders>
+            <w:shd w:val="clear" w:color="auto" w:fill="auto"/>
+            <w:tcMar>
+              <w:top w:type="dxa" w:w="80"/>
+              <w:left w:type="dxa" w:w="80"/>
+              <w:bottom w:type="dxa" w:w="80"/>
+              <w:right w:type="dxa" w:w="80"/>
+            </w:tcMar>
+            <w:vAlign w:val="center"/>
+          </w:tcPr>
+          <w:p>
+            <w:pPr>
+              <w:keepNext w:val="0"/>
+              <w:keepLines w:val="0"/>
+              <w:pageBreakBefore w:val="0"/>
+              <w:widowControl w:val="1"/>
+              <w:shd w:val="clear" w:color="auto" w:fill="auto"/>
+              <w:suppressAutoHyphens w:val="0"/>
+              <w:bidi w:val="0"/>
+              <w:spacing w:before="0" w:after="0" w:line="240" w:lineRule="auto"/>
+              <w:ind w:left="0" w:right="0" w:firstLine="0"/>
+              <w:jc w:val="center"/>
+              <w:outlineLvl w:val="9"/>
+              <w:rPr>
                 <w:rtl w:val="0"/>
               </w:rPr>
-              <w:t>Ortalama B</w:t>
-            </w:r>
+            </w:pPr>
             <w:r>
               <w:rPr>
-                <w:rFonts w:ascii="Futura" w:hAnsi="Futura" w:hint="default"/>
+                <w:rFonts w:ascii="Futura" w:cs="Arial Unicode MS" w:hAnsi="Futura" w:eastAsia="Arial Unicode MS"/>
+                <w:b w:val="0"/>
+                <w:bCs w:val="0"/>
+                <w:i w:val="0"/>
+                <w:iCs w:val="0"/>
+                <w:caps w:val="0"/>
+                <w:smallCaps w:val="0"/>
+                <w:strike w:val="0"/>
+                <w:dstrike w:val="0"/>
+                <w:outline w:val="0"/>
+                <w:color w:val="000000"/>
+                <w:spacing w:val="0"/>
+                <w:kern w:val="0"/>
+                <w:position w:val="0"/>
+                <w:sz w:val="20"/>
+                <w:szCs w:val="20"/>
+                <w:u w:val="none" w:color="000000"/>
                 <w:shd w:val="nil" w:color="auto" w:fill="auto"/>
+                <w:vertAlign w:val="baseline"/>
+                <w:rtl w:val="0"/>
+                <w14:textOutline w14:w="12700" w14:cap="flat">
+                  <w14:noFill/>
+                  <w14:miter w14:lim="400000"/>
+                </w14:textOutline>
+                <w14:textFill>
+                  <w14:solidFill>
+                    <w14:srgbClr w14:val="000000"/>
+                  </w14:solidFill>
+                </w14:textFill>
+              </w:rPr>
+              <w:t>Standart Sapma</w:t>
+            </w:r>
+          </w:p>
+        </w:tc>
+        <w:tc>
+          <w:tcPr>
+            <w:tcW w:type="dxa" w:w="1903"/>
+            <w:tcBorders>
+              <w:top w:val="single" w:color="000000" w:sz="2" w:space="0" w:shadow="0" w:frame="0"/>
+              <w:left w:val="single" w:color="000000" w:sz="2" w:space="0" w:shadow="0" w:frame="0"/>
+              <w:bottom w:val="single" w:color="000000" w:sz="2" w:space="0" w:shadow="0" w:frame="0"/>
+              <w:right w:val="single" w:color="000000" w:sz="2" w:space="0" w:shadow="0" w:frame="0"/>
+            </w:tcBorders>
+            <w:shd w:val="clear" w:color="auto" w:fill="auto"/>
+            <w:tcMar>
+              <w:top w:type="dxa" w:w="80"/>
+              <w:left w:type="dxa" w:w="80"/>
+              <w:bottom w:type="dxa" w:w="80"/>
+              <w:right w:type="dxa" w:w="80"/>
+            </w:tcMar>
+            <w:vAlign w:val="center"/>
+          </w:tcPr>
+          <w:p>
+            <w:pPr>
+              <w:keepNext w:val="0"/>
+              <w:keepLines w:val="0"/>
+              <w:pageBreakBefore w:val="0"/>
+              <w:widowControl w:val="1"/>
+              <w:shd w:val="clear" w:color="auto" w:fill="auto"/>
+              <w:suppressAutoHyphens w:val="0"/>
+              <w:bidi w:val="0"/>
+              <w:spacing w:before="0" w:after="0" w:line="240" w:lineRule="auto"/>
+              <w:ind w:left="0" w:right="0" w:firstLine="0"/>
+              <w:jc w:val="center"/>
+              <w:outlineLvl w:val="9"/>
+              <w:rPr>
                 <w:rtl w:val="0"/>
               </w:rPr>
-              <w:t>ü</w:t>
-            </w:r>
+            </w:pPr>
             <w:r>
               <w:rPr>
-                <w:rFonts w:ascii="Futura" w:hAnsi="Futura"/>
+                <w:rFonts w:ascii="Futura" w:cs="Arial Unicode MS" w:hAnsi="Futura" w:eastAsia="Arial Unicode MS"/>
+                <w:b w:val="0"/>
+                <w:bCs w:val="0"/>
+                <w:i w:val="0"/>
+                <w:iCs w:val="0"/>
+                <w:caps w:val="0"/>
+                <w:smallCaps w:val="0"/>
+                <w:strike w:val="0"/>
+                <w:dstrike w:val="0"/>
+                <w:outline w:val="0"/>
+                <w:color w:val="000000"/>
+                <w:spacing w:val="0"/>
+                <w:kern w:val="0"/>
+                <w:position w:val="0"/>
+                <w:sz w:val="20"/>
+                <w:szCs w:val="20"/>
+                <w:u w:val="none" w:color="000000"/>
                 <w:shd w:val="nil" w:color="auto" w:fill="auto"/>
+                <w:vertAlign w:val="baseline"/>
                 <w:rtl w:val="0"/>
+                <w14:textOutline w14:w="12700" w14:cap="flat">
+                  <w14:noFill/>
+                  <w14:miter w14:lim="400000"/>
+                </w14:textOutline>
+                <w14:textFill>
+                  <w14:solidFill>
+                    <w14:srgbClr w14:val="000000"/>
+                  </w14:solidFill>
+                </w14:textFill>
               </w:rPr>
-              <w:t>y</w:t>
-            </w:r>
-            <w:r>
-              <w:rPr>
-                <w:rFonts w:ascii="Futura" w:hAnsi="Futura" w:hint="default"/>
-                <w:shd w:val="nil" w:color="auto" w:fill="auto"/>
-                <w:rtl w:val="0"/>
-              </w:rPr>
-              <w:t>ü</w:t>
-            </w:r>
-            <w:r>
-              <w:rPr>
-                <w:rFonts w:ascii="Futura" w:hAnsi="Futura"/>
-                <w:shd w:val="nil" w:color="auto" w:fill="auto"/>
-                <w:rtl w:val="0"/>
-              </w:rPr>
-              <w:t>kl</w:t>
-            </w:r>
-            <w:r>
-              <w:rPr>
-                <w:rFonts w:ascii="Futura" w:hAnsi="Futura" w:hint="default"/>
-                <w:shd w:val="nil" w:color="auto" w:fill="auto"/>
-                <w:rtl w:val="0"/>
-              </w:rPr>
-              <w:t>ü</w:t>
-            </w:r>
-            <w:r>
-              <w:rPr>
-                <w:rFonts w:ascii="Futura" w:hAnsi="Futura"/>
-                <w:shd w:val="nil" w:color="auto" w:fill="auto"/>
-                <w:rtl w:val="0"/>
-              </w:rPr>
-              <w:t>k</w:t>
+              <w:t>Varyans</w:t>
             </w:r>
           </w:p>
         </w:tc>
@@ -2031,7 +3129,7 @@
         </w:trPr>
         <w:tc>
           <w:tcPr>
-            <w:tcW w:type="dxa" w:w="3210"/>
+            <w:tcW w:type="dxa" w:w="1903"/>
             <w:tcBorders>
               <w:top w:val="single" w:color="000000" w:sz="2" w:space="0" w:shadow="0" w:frame="0"/>
               <w:left w:val="single" w:color="000000" w:sz="2" w:space="0" w:shadow="0" w:frame="0"/>
@@ -2045,13 +3143,13 @@
               <w:bottom w:type="dxa" w:w="80"/>
               <w:right w:type="dxa" w:w="80"/>
             </w:tcMar>
-            <w:vAlign w:val="top"/>
-          </w:tcPr>
-          <w:p/>
-        </w:tc>
-        <w:tc>
-          <w:tcPr>
-            <w:tcW w:type="dxa" w:w="3210"/>
+            <w:vAlign w:val="center"/>
+          </w:tcPr>
+          <w:p/>
+        </w:tc>
+        <w:tc>
+          <w:tcPr>
+            <w:tcW w:type="dxa" w:w="1903"/>
             <w:tcBorders>
               <w:top w:val="single" w:color="000000" w:sz="2" w:space="0" w:shadow="0" w:frame="0"/>
               <w:left w:val="single" w:color="000000" w:sz="2" w:space="0" w:shadow="0" w:frame="0"/>
@@ -2065,13 +3163,13 @@
               <w:bottom w:type="dxa" w:w="80"/>
               <w:right w:type="dxa" w:w="80"/>
             </w:tcMar>
-            <w:vAlign w:val="top"/>
-          </w:tcPr>
-          <w:p/>
-        </w:tc>
-        <w:tc>
-          <w:tcPr>
-            <w:tcW w:type="dxa" w:w="3210"/>
+            <w:vAlign w:val="center"/>
+          </w:tcPr>
+          <w:p/>
+        </w:tc>
+        <w:tc>
+          <w:tcPr>
+            <w:tcW w:type="dxa" w:w="1903"/>
             <w:tcBorders>
               <w:top w:val="single" w:color="000000" w:sz="2" w:space="0" w:shadow="0" w:frame="0"/>
               <w:left w:val="single" w:color="000000" w:sz="2" w:space="0" w:shadow="0" w:frame="0"/>
@@ -2085,7 +3183,47 @@
               <w:bottom w:type="dxa" w:w="80"/>
               <w:right w:type="dxa" w:w="80"/>
             </w:tcMar>
-            <w:vAlign w:val="top"/>
+            <w:vAlign w:val="center"/>
+          </w:tcPr>
+          <w:p/>
+        </w:tc>
+        <w:tc>
+          <w:tcPr>
+            <w:tcW w:type="dxa" w:w="1903"/>
+            <w:tcBorders>
+              <w:top w:val="single" w:color="000000" w:sz="2" w:space="0" w:shadow="0" w:frame="0"/>
+              <w:left w:val="single" w:color="000000" w:sz="2" w:space="0" w:shadow="0" w:frame="0"/>
+              <w:bottom w:val="single" w:color="000000" w:sz="2" w:space="0" w:shadow="0" w:frame="0"/>
+              <w:right w:val="single" w:color="000000" w:sz="2" w:space="0" w:shadow="0" w:frame="0"/>
+            </w:tcBorders>
+            <w:shd w:val="clear" w:color="auto" w:fill="f5f5f5"/>
+            <w:tcMar>
+              <w:top w:type="dxa" w:w="80"/>
+              <w:left w:type="dxa" w:w="80"/>
+              <w:bottom w:type="dxa" w:w="80"/>
+              <w:right w:type="dxa" w:w="80"/>
+            </w:tcMar>
+            <w:vAlign w:val="center"/>
+          </w:tcPr>
+          <w:p/>
+        </w:tc>
+        <w:tc>
+          <w:tcPr>
+            <w:tcW w:type="dxa" w:w="1903"/>
+            <w:tcBorders>
+              <w:top w:val="single" w:color="000000" w:sz="2" w:space="0" w:shadow="0" w:frame="0"/>
+              <w:left w:val="single" w:color="000000" w:sz="2" w:space="0" w:shadow="0" w:frame="0"/>
+              <w:bottom w:val="single" w:color="000000" w:sz="2" w:space="0" w:shadow="0" w:frame="0"/>
+              <w:right w:val="single" w:color="000000" w:sz="2" w:space="0" w:shadow="0" w:frame="0"/>
+            </w:tcBorders>
+            <w:shd w:val="clear" w:color="auto" w:fill="f5f5f5"/>
+            <w:tcMar>
+              <w:top w:type="dxa" w:w="80"/>
+              <w:left w:type="dxa" w:w="80"/>
+              <w:bottom w:type="dxa" w:w="80"/>
+              <w:right w:type="dxa" w:w="80"/>
+            </w:tcMar>
+            <w:vAlign w:val="center"/>
           </w:tcPr>
           <w:p/>
         </w:tc>
@@ -2101,664 +3239,6 @@
         </w:rPr>
       </w:pPr>
     </w:p>
-    <w:p>
-      <w:pPr>
-        <w:pStyle w:val="Body A"/>
-        <w:rPr>
-          <w:rFonts w:ascii="Futura" w:cs="Futura" w:hAnsi="Futura" w:eastAsia="Futura"/>
-        </w:rPr>
-      </w:pPr>
-    </w:p>
-    <w:p>
-      <w:pPr>
-        <w:pStyle w:val="Body A"/>
-        <w:rPr>
-          <w:rFonts w:ascii="Futura" w:cs="Futura" w:hAnsi="Futura" w:eastAsia="Futura"/>
-        </w:rPr>
-      </w:pPr>
-    </w:p>
-    <w:p>
-      <w:pPr>
-        <w:pStyle w:val="Heading 2"/>
-        <w:rPr>
-          <w:rFonts w:ascii="Futura Bold" w:cs="Futura Bold" w:hAnsi="Futura Bold" w:eastAsia="Futura Bold"/>
-          <w:b w:val="0"/>
-          <w:bCs w:val="0"/>
-        </w:rPr>
-      </w:pPr>
-      <w:r>
-        <w:rPr>
-          <w:rFonts w:ascii="Futura Bold" w:hAnsi="Futura Bold"/>
-          <w:b w:val="0"/>
-          <w:bCs w:val="0"/>
-          <w:rtl w:val="0"/>
-        </w:rPr>
-        <w:t>Deprem Tahmini B</w:t>
-      </w:r>
-      <w:r>
-        <w:rPr>
-          <w:rFonts w:ascii="Futura Bold" w:hAnsi="Futura Bold" w:hint="default"/>
-          <w:b w:val="0"/>
-          <w:bCs w:val="0"/>
-          <w:rtl w:val="0"/>
-        </w:rPr>
-        <w:t>ü</w:t>
-      </w:r>
-      <w:r>
-        <w:rPr>
-          <w:rFonts w:ascii="Futura Bold" w:hAnsi="Futura Bold"/>
-          <w:b w:val="0"/>
-          <w:bCs w:val="0"/>
-          <w:rtl w:val="0"/>
-        </w:rPr>
-        <w:t>y</w:t>
-      </w:r>
-      <w:r>
-        <w:rPr>
-          <w:rFonts w:ascii="Futura Bold" w:hAnsi="Futura Bold" w:hint="default"/>
-          <w:b w:val="0"/>
-          <w:bCs w:val="0"/>
-          <w:rtl w:val="0"/>
-        </w:rPr>
-        <w:t>ü</w:t>
-      </w:r>
-      <w:r>
-        <w:rPr>
-          <w:rFonts w:ascii="Futura Bold" w:hAnsi="Futura Bold"/>
-          <w:b w:val="0"/>
-          <w:bCs w:val="0"/>
-          <w:rtl w:val="0"/>
-        </w:rPr>
-        <w:t>kl</w:t>
-      </w:r>
-      <w:r>
-        <w:rPr>
-          <w:rFonts w:ascii="Futura Bold" w:hAnsi="Futura Bold" w:hint="default"/>
-          <w:b w:val="0"/>
-          <w:bCs w:val="0"/>
-          <w:rtl w:val="0"/>
-        </w:rPr>
-        <w:t xml:space="preserve">üğü </w:t>
-      </w:r>
-      <w:r>
-        <w:rPr>
-          <w:rFonts w:ascii="Futura Bold" w:hAnsi="Futura Bold"/>
-          <w:b w:val="0"/>
-          <w:bCs w:val="0"/>
-          <w:rtl w:val="0"/>
-        </w:rPr>
-        <w:t>Standart Sapmas</w:t>
-      </w:r>
-      <w:r>
-        <w:rPr>
-          <w:rFonts w:ascii="Futura Bold" w:hAnsi="Futura Bold" w:hint="default"/>
-          <w:b w:val="0"/>
-          <w:bCs w:val="0"/>
-          <w:rtl w:val="0"/>
-        </w:rPr>
-        <w:t>ı</w:t>
-      </w:r>
-    </w:p>
-    <w:p>
-      <w:pPr>
-        <w:pStyle w:val="Body A"/>
-        <w:rPr>
-          <w:rFonts w:ascii="Futura" w:cs="Futura" w:hAnsi="Futura" w:eastAsia="Futura"/>
-        </w:rPr>
-      </w:pPr>
-    </w:p>
-    <w:tbl>
-      <w:tblPr>
-        <w:tblW w:w="9630" w:type="dxa"/>
-        <w:jc w:val="left"/>
-        <w:tblInd w:w="216" w:type="dxa"/>
-        <w:tblBorders>
-          <w:top w:val="single" w:color="ffffff" w:sz="8" w:space="0" w:shadow="0" w:frame="0"/>
-          <w:left w:val="single" w:color="ffffff" w:sz="8" w:space="0" w:shadow="0" w:frame="0"/>
-          <w:bottom w:val="single" w:color="ffffff" w:sz="8" w:space="0" w:shadow="0" w:frame="0"/>
-          <w:right w:val="single" w:color="ffffff" w:sz="8" w:space="0" w:shadow="0" w:frame="0"/>
-          <w:insideH w:val="single" w:color="ffffff" w:sz="8" w:space="0" w:shadow="0" w:frame="0"/>
-          <w:insideV w:val="single" w:color="ffffff" w:sz="8" w:space="0" w:shadow="0" w:frame="0"/>
-        </w:tblBorders>
-        <w:shd w:val="clear" w:color="auto" w:fill="cadfff"/>
-        <w:tblLayout w:type="fixed"/>
-      </w:tblPr>
-      <w:tblGrid>
-        <w:gridCol w:w="3210"/>
-        <w:gridCol w:w="3210"/>
-        <w:gridCol w:w="3210"/>
-      </w:tblGrid>
-      <w:tr>
-        <w:tblPrEx>
-          <w:shd w:val="clear" w:color="auto" w:fill="cadfff"/>
-        </w:tblPrEx>
-        <w:trPr>
-          <w:trHeight w:val="300" w:hRule="atLeast"/>
-        </w:trPr>
-        <w:tc>
-          <w:tcPr>
-            <w:tcW w:type="dxa" w:w="3210"/>
-            <w:tcBorders>
-              <w:top w:val="single" w:color="000000" w:sz="2" w:space="0" w:shadow="0" w:frame="0"/>
-              <w:left w:val="single" w:color="000000" w:sz="2" w:space="0" w:shadow="0" w:frame="0"/>
-              <w:bottom w:val="single" w:color="000000" w:sz="2" w:space="0" w:shadow="0" w:frame="0"/>
-              <w:right w:val="single" w:color="000000" w:sz="2" w:space="0" w:shadow="0" w:frame="0"/>
-            </w:tcBorders>
-            <w:shd w:val="clear" w:color="auto" w:fill="auto"/>
-            <w:tcMar>
-              <w:top w:type="dxa" w:w="80"/>
-              <w:left w:type="dxa" w:w="80"/>
-              <w:bottom w:type="dxa" w:w="80"/>
-              <w:right w:type="dxa" w:w="80"/>
-            </w:tcMar>
-            <w:vAlign w:val="top"/>
-          </w:tcPr>
-          <w:p>
-            <w:pPr>
-              <w:pStyle w:val="Table Style 2"/>
-            </w:pPr>
-            <w:r>
-              <w:rPr>
-                <w:rFonts w:ascii="Times New Roman" w:hAnsi="Times New Roman"/>
-                <w:shd w:val="nil" w:color="auto" w:fill="auto"/>
-                <w:rtl w:val="0"/>
-              </w:rPr>
-              <w:t>Aritmetik Ortalama</w:t>
-            </w:r>
-          </w:p>
-        </w:tc>
-        <w:tc>
-          <w:tcPr>
-            <w:tcW w:type="dxa" w:w="3210"/>
-            <w:tcBorders>
-              <w:top w:val="single" w:color="000000" w:sz="2" w:space="0" w:shadow="0" w:frame="0"/>
-              <w:left w:val="single" w:color="000000" w:sz="2" w:space="0" w:shadow="0" w:frame="0"/>
-              <w:bottom w:val="single" w:color="000000" w:sz="2" w:space="0" w:shadow="0" w:frame="0"/>
-              <w:right w:val="single" w:color="000000" w:sz="2" w:space="0" w:shadow="0" w:frame="0"/>
-            </w:tcBorders>
-            <w:shd w:val="clear" w:color="auto" w:fill="auto"/>
-            <w:tcMar>
-              <w:top w:type="dxa" w:w="80"/>
-              <w:left w:type="dxa" w:w="80"/>
-              <w:bottom w:type="dxa" w:w="80"/>
-              <w:right w:type="dxa" w:w="80"/>
-            </w:tcMar>
-            <w:vAlign w:val="top"/>
-          </w:tcPr>
-          <w:p>
-            <w:pPr>
-              <w:pStyle w:val="Table Style 2"/>
-            </w:pPr>
-            <w:r>
-              <w:rPr>
-                <w:rFonts w:ascii="Times New Roman" w:hAnsi="Times New Roman"/>
-                <w:shd w:val="nil" w:color="auto" w:fill="auto"/>
-                <w:rtl w:val="0"/>
-              </w:rPr>
-              <w:t>Deprem Say</w:t>
-            </w:r>
-            <w:r>
-              <w:rPr>
-                <w:rFonts w:ascii="Times New Roman" w:hAnsi="Times New Roman" w:hint="default"/>
-                <w:shd w:val="nil" w:color="auto" w:fill="auto"/>
-                <w:rtl w:val="0"/>
-              </w:rPr>
-              <w:t>ı</w:t>
-            </w:r>
-            <w:r>
-              <w:rPr>
-                <w:rFonts w:ascii="Times New Roman" w:hAnsi="Times New Roman"/>
-                <w:shd w:val="nil" w:color="auto" w:fill="auto"/>
-                <w:rtl w:val="0"/>
-              </w:rPr>
-              <w:t>s</w:t>
-            </w:r>
-            <w:r>
-              <w:rPr>
-                <w:rFonts w:ascii="Times New Roman" w:hAnsi="Times New Roman" w:hint="default"/>
-                <w:shd w:val="nil" w:color="auto" w:fill="auto"/>
-                <w:rtl w:val="0"/>
-              </w:rPr>
-              <w:t>ı</w:t>
-            </w:r>
-          </w:p>
-        </w:tc>
-        <w:tc>
-          <w:tcPr>
-            <w:tcW w:type="dxa" w:w="3210"/>
-            <w:tcBorders>
-              <w:top w:val="single" w:color="000000" w:sz="2" w:space="0" w:shadow="0" w:frame="0"/>
-              <w:left w:val="single" w:color="000000" w:sz="2" w:space="0" w:shadow="0" w:frame="0"/>
-              <w:bottom w:val="single" w:color="000000" w:sz="2" w:space="0" w:shadow="0" w:frame="0"/>
-              <w:right w:val="single" w:color="000000" w:sz="2" w:space="0" w:shadow="0" w:frame="0"/>
-            </w:tcBorders>
-            <w:shd w:val="clear" w:color="auto" w:fill="auto"/>
-            <w:tcMar>
-              <w:top w:type="dxa" w:w="80"/>
-              <w:left w:type="dxa" w:w="80"/>
-              <w:bottom w:type="dxa" w:w="80"/>
-              <w:right w:type="dxa" w:w="80"/>
-            </w:tcMar>
-            <w:vAlign w:val="top"/>
-          </w:tcPr>
-          <w:p>
-            <w:pPr>
-              <w:pStyle w:val="Table Style 2"/>
-            </w:pPr>
-            <w:r>
-              <w:rPr>
-                <w:rFonts w:ascii="Times New Roman" w:hAnsi="Times New Roman"/>
-                <w:shd w:val="nil" w:color="auto" w:fill="auto"/>
-                <w:rtl w:val="0"/>
-              </w:rPr>
-              <w:t>Standart Sapma</w:t>
-            </w:r>
-          </w:p>
-        </w:tc>
-      </w:tr>
-      <w:tr>
-        <w:tblPrEx>
-          <w:shd w:val="clear" w:color="auto" w:fill="cadfff"/>
-        </w:tblPrEx>
-        <w:trPr>
-          <w:trHeight w:val="300" w:hRule="atLeast"/>
-        </w:trPr>
-        <w:tc>
-          <w:tcPr>
-            <w:tcW w:type="dxa" w:w="3210"/>
-            <w:tcBorders>
-              <w:top w:val="single" w:color="000000" w:sz="2" w:space="0" w:shadow="0" w:frame="0"/>
-              <w:left w:val="single" w:color="000000" w:sz="2" w:space="0" w:shadow="0" w:frame="0"/>
-              <w:bottom w:val="single" w:color="000000" w:sz="2" w:space="0" w:shadow="0" w:frame="0"/>
-              <w:right w:val="single" w:color="000000" w:sz="2" w:space="0" w:shadow="0" w:frame="0"/>
-            </w:tcBorders>
-            <w:shd w:val="clear" w:color="auto" w:fill="f5f5f5"/>
-            <w:tcMar>
-              <w:top w:type="dxa" w:w="80"/>
-              <w:left w:type="dxa" w:w="80"/>
-              <w:bottom w:type="dxa" w:w="80"/>
-              <w:right w:type="dxa" w:w="80"/>
-            </w:tcMar>
-            <w:vAlign w:val="top"/>
-          </w:tcPr>
-          <w:p/>
-        </w:tc>
-        <w:tc>
-          <w:tcPr>
-            <w:tcW w:type="dxa" w:w="3210"/>
-            <w:tcBorders>
-              <w:top w:val="single" w:color="000000" w:sz="2" w:space="0" w:shadow="0" w:frame="0"/>
-              <w:left w:val="single" w:color="000000" w:sz="2" w:space="0" w:shadow="0" w:frame="0"/>
-              <w:bottom w:val="single" w:color="000000" w:sz="2" w:space="0" w:shadow="0" w:frame="0"/>
-              <w:right w:val="single" w:color="000000" w:sz="2" w:space="0" w:shadow="0" w:frame="0"/>
-            </w:tcBorders>
-            <w:shd w:val="clear" w:color="auto" w:fill="f5f5f5"/>
-            <w:tcMar>
-              <w:top w:type="dxa" w:w="80"/>
-              <w:left w:type="dxa" w:w="80"/>
-              <w:bottom w:type="dxa" w:w="80"/>
-              <w:right w:type="dxa" w:w="80"/>
-            </w:tcMar>
-            <w:vAlign w:val="top"/>
-          </w:tcPr>
-          <w:p/>
-        </w:tc>
-        <w:tc>
-          <w:tcPr>
-            <w:tcW w:type="dxa" w:w="3210"/>
-            <w:tcBorders>
-              <w:top w:val="single" w:color="000000" w:sz="2" w:space="0" w:shadow="0" w:frame="0"/>
-              <w:left w:val="single" w:color="000000" w:sz="2" w:space="0" w:shadow="0" w:frame="0"/>
-              <w:bottom w:val="single" w:color="000000" w:sz="2" w:space="0" w:shadow="0" w:frame="0"/>
-              <w:right w:val="single" w:color="000000" w:sz="2" w:space="0" w:shadow="0" w:frame="0"/>
-            </w:tcBorders>
-            <w:shd w:val="clear" w:color="auto" w:fill="f5f5f5"/>
-            <w:tcMar>
-              <w:top w:type="dxa" w:w="80"/>
-              <w:left w:type="dxa" w:w="80"/>
-              <w:bottom w:type="dxa" w:w="80"/>
-              <w:right w:type="dxa" w:w="80"/>
-            </w:tcMar>
-            <w:vAlign w:val="top"/>
-          </w:tcPr>
-          <w:p/>
-        </w:tc>
-      </w:tr>
-    </w:tbl>
-    <w:p>
-      <w:pPr>
-        <w:pStyle w:val="Body A"/>
-        <w:widowControl w:val="0"/>
-        <w:ind w:left="108" w:hanging="108"/>
-        <w:rPr>
-          <w:rFonts w:ascii="Futura" w:cs="Futura" w:hAnsi="Futura" w:eastAsia="Futura"/>
-        </w:rPr>
-      </w:pPr>
-    </w:p>
-    <w:p>
-      <w:pPr>
-        <w:pStyle w:val="Body A"/>
-        <w:rPr>
-          <w:rFonts w:ascii="Futura" w:cs="Futura" w:hAnsi="Futura" w:eastAsia="Futura"/>
-        </w:rPr>
-      </w:pPr>
-    </w:p>
-    <w:p>
-      <w:pPr>
-        <w:pStyle w:val="Body A"/>
-        <w:rPr>
-          <w:rFonts w:ascii="Futura" w:cs="Futura" w:hAnsi="Futura" w:eastAsia="Futura"/>
-        </w:rPr>
-      </w:pPr>
-    </w:p>
-    <w:p>
-      <w:pPr>
-        <w:pStyle w:val="Heading 2"/>
-        <w:rPr>
-          <w:rFonts w:ascii="Futura Bold" w:cs="Futura Bold" w:hAnsi="Futura Bold" w:eastAsia="Futura Bold"/>
-          <w:b w:val="0"/>
-          <w:bCs w:val="0"/>
-        </w:rPr>
-      </w:pPr>
-      <w:r>
-        <w:rPr>
-          <w:rFonts w:ascii="Futura Bold" w:hAnsi="Futura Bold"/>
-          <w:b w:val="0"/>
-          <w:bCs w:val="0"/>
-          <w:rtl w:val="0"/>
-        </w:rPr>
-        <w:t>Deprem Tahmini B</w:t>
-      </w:r>
-      <w:r>
-        <w:rPr>
-          <w:rFonts w:ascii="Futura Bold" w:hAnsi="Futura Bold" w:hint="default"/>
-          <w:b w:val="0"/>
-          <w:bCs w:val="0"/>
-          <w:rtl w:val="0"/>
-        </w:rPr>
-        <w:t>ü</w:t>
-      </w:r>
-      <w:r>
-        <w:rPr>
-          <w:rFonts w:ascii="Futura Bold" w:hAnsi="Futura Bold"/>
-          <w:b w:val="0"/>
-          <w:bCs w:val="0"/>
-          <w:rtl w:val="0"/>
-        </w:rPr>
-        <w:t>y</w:t>
-      </w:r>
-      <w:r>
-        <w:rPr>
-          <w:rFonts w:ascii="Futura Bold" w:hAnsi="Futura Bold" w:hint="default"/>
-          <w:b w:val="0"/>
-          <w:bCs w:val="0"/>
-          <w:rtl w:val="0"/>
-        </w:rPr>
-        <w:t>ü</w:t>
-      </w:r>
-      <w:r>
-        <w:rPr>
-          <w:rFonts w:ascii="Futura Bold" w:hAnsi="Futura Bold"/>
-          <w:b w:val="0"/>
-          <w:bCs w:val="0"/>
-          <w:rtl w:val="0"/>
-        </w:rPr>
-        <w:t>kl</w:t>
-      </w:r>
-      <w:r>
-        <w:rPr>
-          <w:rFonts w:ascii="Futura Bold" w:hAnsi="Futura Bold" w:hint="default"/>
-          <w:b w:val="0"/>
-          <w:bCs w:val="0"/>
-          <w:rtl w:val="0"/>
-        </w:rPr>
-        <w:t xml:space="preserve">üğü </w:t>
-      </w:r>
-      <w:r>
-        <w:rPr>
-          <w:rFonts w:ascii="Futura Bold" w:hAnsi="Futura Bold"/>
-          <w:b w:val="0"/>
-          <w:bCs w:val="0"/>
-          <w:rtl w:val="0"/>
-        </w:rPr>
-        <w:t>Varyans</w:t>
-      </w:r>
-      <w:r>
-        <w:rPr>
-          <w:rFonts w:ascii="Futura Bold" w:hAnsi="Futura Bold" w:hint="default"/>
-          <w:b w:val="0"/>
-          <w:bCs w:val="0"/>
-          <w:rtl w:val="0"/>
-        </w:rPr>
-        <w:t>ı</w:t>
-      </w:r>
-    </w:p>
-    <w:p>
-      <w:pPr>
-        <w:pStyle w:val="Body A"/>
-        <w:rPr>
-          <w:rFonts w:ascii="Futura" w:cs="Futura" w:hAnsi="Futura" w:eastAsia="Futura"/>
-        </w:rPr>
-      </w:pPr>
-    </w:p>
-    <w:tbl>
-      <w:tblPr>
-        <w:tblW w:w="9630" w:type="dxa"/>
-        <w:jc w:val="left"/>
-        <w:tblInd w:w="216" w:type="dxa"/>
-        <w:tblBorders>
-          <w:top w:val="single" w:color="ffffff" w:sz="8" w:space="0" w:shadow="0" w:frame="0"/>
-          <w:left w:val="single" w:color="ffffff" w:sz="8" w:space="0" w:shadow="0" w:frame="0"/>
-          <w:bottom w:val="single" w:color="ffffff" w:sz="8" w:space="0" w:shadow="0" w:frame="0"/>
-          <w:right w:val="single" w:color="ffffff" w:sz="8" w:space="0" w:shadow="0" w:frame="0"/>
-          <w:insideH w:val="single" w:color="ffffff" w:sz="8" w:space="0" w:shadow="0" w:frame="0"/>
-          <w:insideV w:val="single" w:color="ffffff" w:sz="8" w:space="0" w:shadow="0" w:frame="0"/>
-        </w:tblBorders>
-        <w:shd w:val="clear" w:color="auto" w:fill="cadfff"/>
-        <w:tblLayout w:type="fixed"/>
-      </w:tblPr>
-      <w:tblGrid>
-        <w:gridCol w:w="3210"/>
-        <w:gridCol w:w="3210"/>
-        <w:gridCol w:w="3210"/>
-      </w:tblGrid>
-      <w:tr>
-        <w:tblPrEx>
-          <w:shd w:val="clear" w:color="auto" w:fill="cadfff"/>
-        </w:tblPrEx>
-        <w:trPr>
-          <w:trHeight w:val="300" w:hRule="atLeast"/>
-        </w:trPr>
-        <w:tc>
-          <w:tcPr>
-            <w:tcW w:type="dxa" w:w="3210"/>
-            <w:tcBorders>
-              <w:top w:val="single" w:color="000000" w:sz="2" w:space="0" w:shadow="0" w:frame="0"/>
-              <w:left w:val="single" w:color="000000" w:sz="2" w:space="0" w:shadow="0" w:frame="0"/>
-              <w:bottom w:val="single" w:color="000000" w:sz="2" w:space="0" w:shadow="0" w:frame="0"/>
-              <w:right w:val="single" w:color="000000" w:sz="2" w:space="0" w:shadow="0" w:frame="0"/>
-            </w:tcBorders>
-            <w:shd w:val="clear" w:color="auto" w:fill="auto"/>
-            <w:tcMar>
-              <w:top w:type="dxa" w:w="80"/>
-              <w:left w:type="dxa" w:w="80"/>
-              <w:bottom w:type="dxa" w:w="80"/>
-              <w:right w:type="dxa" w:w="80"/>
-            </w:tcMar>
-            <w:vAlign w:val="top"/>
-          </w:tcPr>
-          <w:p>
-            <w:pPr>
-              <w:pStyle w:val="Table Style 2"/>
-            </w:pPr>
-            <w:r>
-              <w:rPr>
-                <w:rFonts w:ascii="Times New Roman" w:hAnsi="Times New Roman"/>
-                <w:shd w:val="nil" w:color="auto" w:fill="auto"/>
-                <w:rtl w:val="0"/>
-              </w:rPr>
-              <w:t>Aritmetik Ortalama</w:t>
-            </w:r>
-          </w:p>
-        </w:tc>
-        <w:tc>
-          <w:tcPr>
-            <w:tcW w:type="dxa" w:w="3210"/>
-            <w:tcBorders>
-              <w:top w:val="single" w:color="000000" w:sz="2" w:space="0" w:shadow="0" w:frame="0"/>
-              <w:left w:val="single" w:color="000000" w:sz="2" w:space="0" w:shadow="0" w:frame="0"/>
-              <w:bottom w:val="single" w:color="000000" w:sz="2" w:space="0" w:shadow="0" w:frame="0"/>
-              <w:right w:val="single" w:color="000000" w:sz="2" w:space="0" w:shadow="0" w:frame="0"/>
-            </w:tcBorders>
-            <w:shd w:val="clear" w:color="auto" w:fill="auto"/>
-            <w:tcMar>
-              <w:top w:type="dxa" w:w="80"/>
-              <w:left w:type="dxa" w:w="80"/>
-              <w:bottom w:type="dxa" w:w="80"/>
-              <w:right w:type="dxa" w:w="80"/>
-            </w:tcMar>
-            <w:vAlign w:val="top"/>
-          </w:tcPr>
-          <w:p>
-            <w:pPr>
-              <w:pStyle w:val="Table Style 2"/>
-            </w:pPr>
-            <w:r>
-              <w:rPr>
-                <w:rFonts w:ascii="Times New Roman" w:hAnsi="Times New Roman"/>
-                <w:shd w:val="nil" w:color="auto" w:fill="auto"/>
-                <w:rtl w:val="0"/>
-              </w:rPr>
-              <w:t>Deprem Say</w:t>
-            </w:r>
-            <w:r>
-              <w:rPr>
-                <w:rFonts w:ascii="Times New Roman" w:hAnsi="Times New Roman" w:hint="default"/>
-                <w:shd w:val="nil" w:color="auto" w:fill="auto"/>
-                <w:rtl w:val="0"/>
-              </w:rPr>
-              <w:t>ı</w:t>
-            </w:r>
-            <w:r>
-              <w:rPr>
-                <w:rFonts w:ascii="Times New Roman" w:hAnsi="Times New Roman"/>
-                <w:shd w:val="nil" w:color="auto" w:fill="auto"/>
-                <w:rtl w:val="0"/>
-              </w:rPr>
-              <w:t>s</w:t>
-            </w:r>
-            <w:r>
-              <w:rPr>
-                <w:rFonts w:ascii="Times New Roman" w:hAnsi="Times New Roman" w:hint="default"/>
-                <w:shd w:val="nil" w:color="auto" w:fill="auto"/>
-                <w:rtl w:val="0"/>
-              </w:rPr>
-              <w:t>ı</w:t>
-            </w:r>
-          </w:p>
-        </w:tc>
-        <w:tc>
-          <w:tcPr>
-            <w:tcW w:type="dxa" w:w="3210"/>
-            <w:tcBorders>
-              <w:top w:val="single" w:color="000000" w:sz="2" w:space="0" w:shadow="0" w:frame="0"/>
-              <w:left w:val="single" w:color="000000" w:sz="2" w:space="0" w:shadow="0" w:frame="0"/>
-              <w:bottom w:val="single" w:color="000000" w:sz="2" w:space="0" w:shadow="0" w:frame="0"/>
-              <w:right w:val="single" w:color="000000" w:sz="2" w:space="0" w:shadow="0" w:frame="0"/>
-            </w:tcBorders>
-            <w:shd w:val="clear" w:color="auto" w:fill="auto"/>
-            <w:tcMar>
-              <w:top w:type="dxa" w:w="80"/>
-              <w:left w:type="dxa" w:w="80"/>
-              <w:bottom w:type="dxa" w:w="80"/>
-              <w:right w:type="dxa" w:w="80"/>
-            </w:tcMar>
-            <w:vAlign w:val="top"/>
-          </w:tcPr>
-          <w:p>
-            <w:pPr>
-              <w:pStyle w:val="Table Style 2"/>
-            </w:pPr>
-            <w:r>
-              <w:rPr>
-                <w:rFonts w:ascii="Times New Roman" w:hAnsi="Times New Roman"/>
-                <w:shd w:val="nil" w:color="auto" w:fill="auto"/>
-                <w:rtl w:val="0"/>
-              </w:rPr>
-              <w:t>Varyans</w:t>
-            </w:r>
-          </w:p>
-        </w:tc>
-      </w:tr>
-      <w:tr>
-        <w:tblPrEx>
-          <w:shd w:val="clear" w:color="auto" w:fill="cadfff"/>
-        </w:tblPrEx>
-        <w:trPr>
-          <w:trHeight w:val="300" w:hRule="atLeast"/>
-        </w:trPr>
-        <w:tc>
-          <w:tcPr>
-            <w:tcW w:type="dxa" w:w="3210"/>
-            <w:tcBorders>
-              <w:top w:val="single" w:color="000000" w:sz="2" w:space="0" w:shadow="0" w:frame="0"/>
-              <w:left w:val="single" w:color="000000" w:sz="2" w:space="0" w:shadow="0" w:frame="0"/>
-              <w:bottom w:val="single" w:color="000000" w:sz="2" w:space="0" w:shadow="0" w:frame="0"/>
-              <w:right w:val="single" w:color="000000" w:sz="2" w:space="0" w:shadow="0" w:frame="0"/>
-            </w:tcBorders>
-            <w:shd w:val="clear" w:color="auto" w:fill="f5f5f5"/>
-            <w:tcMar>
-              <w:top w:type="dxa" w:w="80"/>
-              <w:left w:type="dxa" w:w="80"/>
-              <w:bottom w:type="dxa" w:w="80"/>
-              <w:right w:type="dxa" w:w="80"/>
-            </w:tcMar>
-            <w:vAlign w:val="top"/>
-          </w:tcPr>
-          <w:p/>
-        </w:tc>
-        <w:tc>
-          <w:tcPr>
-            <w:tcW w:type="dxa" w:w="3210"/>
-            <w:tcBorders>
-              <w:top w:val="single" w:color="000000" w:sz="2" w:space="0" w:shadow="0" w:frame="0"/>
-              <w:left w:val="single" w:color="000000" w:sz="2" w:space="0" w:shadow="0" w:frame="0"/>
-              <w:bottom w:val="single" w:color="000000" w:sz="2" w:space="0" w:shadow="0" w:frame="0"/>
-              <w:right w:val="single" w:color="000000" w:sz="2" w:space="0" w:shadow="0" w:frame="0"/>
-            </w:tcBorders>
-            <w:shd w:val="clear" w:color="auto" w:fill="f5f5f5"/>
-            <w:tcMar>
-              <w:top w:type="dxa" w:w="80"/>
-              <w:left w:type="dxa" w:w="80"/>
-              <w:bottom w:type="dxa" w:w="80"/>
-              <w:right w:type="dxa" w:w="80"/>
-            </w:tcMar>
-            <w:vAlign w:val="top"/>
-          </w:tcPr>
-          <w:p/>
-        </w:tc>
-        <w:tc>
-          <w:tcPr>
-            <w:tcW w:type="dxa" w:w="3210"/>
-            <w:tcBorders>
-              <w:top w:val="single" w:color="000000" w:sz="2" w:space="0" w:shadow="0" w:frame="0"/>
-              <w:left w:val="single" w:color="000000" w:sz="2" w:space="0" w:shadow="0" w:frame="0"/>
-              <w:bottom w:val="single" w:color="000000" w:sz="2" w:space="0" w:shadow="0" w:frame="0"/>
-              <w:right w:val="single" w:color="000000" w:sz="2" w:space="0" w:shadow="0" w:frame="0"/>
-            </w:tcBorders>
-            <w:shd w:val="clear" w:color="auto" w:fill="f5f5f5"/>
-            <w:tcMar>
-              <w:top w:type="dxa" w:w="80"/>
-              <w:left w:type="dxa" w:w="80"/>
-              <w:bottom w:type="dxa" w:w="80"/>
-              <w:right w:type="dxa" w:w="80"/>
-            </w:tcMar>
-            <w:vAlign w:val="top"/>
-          </w:tcPr>
-          <w:p/>
-        </w:tc>
-      </w:tr>
-    </w:tbl>
     <w:p>
       <w:pPr>
         <w:pStyle w:val="Body A"/>
@@ -3272,7 +3752,7 @@
               <wp:posOffset>1420469</wp:posOffset>
             </wp:positionH>
             <wp:positionV relativeFrom="line">
-              <wp:posOffset>2836520</wp:posOffset>
+              <wp:posOffset>3073908</wp:posOffset>
             </wp:positionV>
             <wp:extent cx="4952999" cy="3750154"/>
             <wp:effectExtent l="0" t="0" r="0" b="0"/>
@@ -7902,53 +8382,6 @@
       <w:position w:val="0"/>
       <w:sz w:val="32"/>
       <w:szCs w:val="32"/>
-      <w:u w:val="none" w:color="000000"/>
-      <w:shd w:val="nil" w:color="auto" w:fill="auto"/>
-      <w:vertAlign w:val="baseline"/>
-      <w14:textOutline w14:w="12700" w14:cap="flat">
-        <w14:noFill/>
-        <w14:miter w14:lim="400000"/>
-      </w14:textOutline>
-      <w14:textFill>
-        <w14:solidFill>
-          <w14:srgbClr w14:val="000000"/>
-        </w14:solidFill>
-      </w14:textFill>
-    </w:rPr>
-  </w:style>
-  <w:style w:type="paragraph" w:styleId="Table Style 2">
-    <w:name w:val="Table Style 2"/>
-    <w:next w:val="Table Style 2"/>
-    <w:pPr>
-      <w:keepNext w:val="0"/>
-      <w:keepLines w:val="0"/>
-      <w:pageBreakBefore w:val="0"/>
-      <w:widowControl w:val="1"/>
-      <w:shd w:val="clear" w:color="auto" w:fill="auto"/>
-      <w:suppressAutoHyphens w:val="0"/>
-      <w:bidi w:val="0"/>
-      <w:spacing w:before="0" w:after="0" w:line="240" w:lineRule="auto"/>
-      <w:ind w:left="0" w:right="0" w:firstLine="0"/>
-      <w:jc w:val="left"/>
-      <w:outlineLvl w:val="9"/>
-    </w:pPr>
-    <w:rPr>
-      <w:rFonts w:ascii="Helvetica Neue" w:cs="Arial Unicode MS" w:hAnsi="Helvetica Neue" w:eastAsia="Arial Unicode MS"/>
-      <w:b w:val="0"/>
-      <w:bCs w:val="0"/>
-      <w:i w:val="0"/>
-      <w:iCs w:val="0"/>
-      <w:caps w:val="0"/>
-      <w:smallCaps w:val="0"/>
-      <w:strike w:val="0"/>
-      <w:dstrike w:val="0"/>
-      <w:outline w:val="0"/>
-      <w:color w:val="000000"/>
-      <w:spacing w:val="0"/>
-      <w:kern w:val="0"/>
-      <w:position w:val="0"/>
-      <w:sz w:val="20"/>
-      <w:szCs w:val="20"/>
       <w:u w:val="none" w:color="000000"/>
       <w:shd w:val="nil" w:color="auto" w:fill="auto"/>
       <w:vertAlign w:val="baseline"/>
@@ -8751,7 +9184,7 @@
               <c:strCache>
                 <c:ptCount val="1"/>
                 <c:pt idx="0">
-                  <c:v>Region 1</c:v>
+                  <c:v>Deprem Büyüklükleri</c:v>
                 </c:pt>
               </c:strCache>
             </c:strRef>
@@ -8864,7 +9297,7 @@
                       <a:solidFill>
                         <a:srgbClr val="000000"/>
                       </a:solidFill>
-                      <a:latin typeface="Helvetica Neue"/>
+                      <a:latin typeface="Futura"/>
                     </a:defRPr>
                   </a:pPr>
                 </a:p>
@@ -8888,7 +9321,7 @@
                       <a:solidFill>
                         <a:srgbClr val="000000"/>
                       </a:solidFill>
-                      <a:latin typeface="Helvetica Neue"/>
+                      <a:latin typeface="Futura"/>
                     </a:defRPr>
                   </a:pPr>
                 </a:p>
@@ -8912,7 +9345,7 @@
                       <a:solidFill>
                         <a:srgbClr val="000000"/>
                       </a:solidFill>
-                      <a:latin typeface="Helvetica Neue"/>
+                      <a:latin typeface="Futura"/>
                     </a:defRPr>
                   </a:pPr>
                 </a:p>
@@ -8936,7 +9369,7 @@
                       <a:solidFill>
                         <a:srgbClr val="000000"/>
                       </a:solidFill>
-                      <a:latin typeface="Helvetica Neue"/>
+                      <a:latin typeface="Futura"/>
                     </a:defRPr>
                   </a:pPr>
                 </a:p>
@@ -8960,7 +9393,7 @@
                       <a:solidFill>
                         <a:srgbClr val="000000"/>
                       </a:solidFill>
-                      <a:latin typeface="Helvetica Neue"/>
+                      <a:latin typeface="Futura"/>
                     </a:defRPr>
                   </a:pPr>
                 </a:p>
@@ -8984,7 +9417,7 @@
                       <a:solidFill>
                         <a:srgbClr val="000000"/>
                       </a:solidFill>
-                      <a:latin typeface="Helvetica Neue"/>
+                      <a:latin typeface="Futura"/>
                     </a:defRPr>
                   </a:pPr>
                 </a:p>
@@ -9006,7 +9439,7 @@
                     <a:solidFill>
                       <a:srgbClr val="000000"/>
                     </a:solidFill>
-                    <a:latin typeface="Helvetica Neue"/>
+                    <a:latin typeface="Futura"/>
                   </a:defRPr>
                 </a:pPr>
               </a:p>
@@ -9106,7 +9539,7 @@
           <c:x val="0"/>
           <c:y val="0"/>
           <c:w val="1"/>
-          <c:h val="0.0646901"/>
+          <c:h val="0.0680162"/>
         </c:manualLayout>
       </c:layout>
       <c:overlay val="1"/>
@@ -9127,7 +9560,7 @@
               <a:solidFill>
                 <a:srgbClr val="000000"/>
               </a:solidFill>
-              <a:latin typeface="Helvetica Neue"/>
+              <a:latin typeface="Futura"/>
             </a:defRPr>
           </a:pPr>
         </a:p>

</xml_diff>

<commit_message>
feat(auth): add forgot password functionality and related email service updates
</commit_message>
<xml_diff>
--- a/src/main/resources/templates/word/DEHAReportTemplate.docx
+++ b/src/main/resources/templates/word/DEHAReportTemplate.docx
@@ -777,7 +777,7 @@
     </w:p>
     <w:tbl>
       <w:tblPr>
-        <w:tblW w:w="9630" w:type="dxa"/>
+        <w:tblW w:w="9571" w:type="dxa"/>
         <w:jc w:val="left"/>
         <w:tblInd w:w="216" w:type="dxa"/>
         <w:tblBorders>
@@ -792,10 +792,9 @@
         <w:tblLayout w:type="fixed"/>
       </w:tblPr>
       <w:tblGrid>
-        <w:gridCol w:w="2407"/>
-        <w:gridCol w:w="2408"/>
-        <w:gridCol w:w="2408"/>
-        <w:gridCol w:w="2407"/>
+        <w:gridCol w:w="3189"/>
+        <w:gridCol w:w="3191"/>
+        <w:gridCol w:w="3191"/>
       </w:tblGrid>
       <w:tr>
         <w:tblPrEx>
@@ -806,7 +805,7 @@
         </w:trPr>
         <w:tc>
           <w:tcPr>
-            <w:tcW w:type="dxa" w:w="2407"/>
+            <w:tcW w:type="dxa" w:w="3189"/>
             <w:tcBorders>
               <w:top w:val="single" w:color="929292" w:sz="4" w:space="0" w:shadow="0" w:frame="0"/>
               <w:left w:val="single" w:color="929292" w:sz="4" w:space="0" w:shadow="0" w:frame="0"/>
@@ -877,7 +876,7 @@
         </w:tc>
         <w:tc>
           <w:tcPr>
-            <w:tcW w:type="dxa" w:w="2408"/>
+            <w:tcW w:type="dxa" w:w="3190"/>
             <w:tcBorders>
               <w:top w:val="single" w:color="929292" w:sz="4" w:space="0" w:shadow="0" w:frame="0"/>
               <w:left w:val="single" w:color="929292" w:sz="4" w:space="0" w:shadow="0" w:frame="0"/>
@@ -1152,7 +1151,7 @@
         </w:tc>
         <w:tc>
           <w:tcPr>
-            <w:tcW w:type="dxa" w:w="2408"/>
+            <w:tcW w:type="dxa" w:w="3190"/>
             <w:tcBorders>
               <w:top w:val="single" w:color="929292" w:sz="4" w:space="0" w:shadow="0" w:frame="0"/>
               <w:left w:val="single" w:color="929292" w:sz="4" w:space="0" w:shadow="0" w:frame="0"/>
@@ -1217,78 +1216,7 @@
                   </w14:solidFill>
                 </w14:textFill>
               </w:rPr>
-              <w:t>Enlem</w:t>
-            </w:r>
-          </w:p>
-        </w:tc>
-        <w:tc>
-          <w:tcPr>
-            <w:tcW w:type="dxa" w:w="2407"/>
-            <w:tcBorders>
-              <w:top w:val="single" w:color="929292" w:sz="4" w:space="0" w:shadow="0" w:frame="0"/>
-              <w:left w:val="single" w:color="929292" w:sz="4" w:space="0" w:shadow="0" w:frame="0"/>
-              <w:bottom w:val="single" w:color="929292" w:sz="4" w:space="0" w:shadow="0" w:frame="0"/>
-              <w:right w:val="single" w:color="929292" w:sz="4" w:space="0" w:shadow="0" w:frame="0"/>
-            </w:tcBorders>
-            <w:shd w:val="clear" w:color="auto" w:fill="auto"/>
-            <w:tcMar>
-              <w:top w:type="dxa" w:w="80"/>
-              <w:left w:type="dxa" w:w="80"/>
-              <w:bottom w:type="dxa" w:w="80"/>
-              <w:right w:type="dxa" w:w="80"/>
-            </w:tcMar>
-            <w:vAlign w:val="center"/>
-          </w:tcPr>
-          <w:p>
-            <w:pPr>
-              <w:keepNext w:val="0"/>
-              <w:keepLines w:val="0"/>
-              <w:pageBreakBefore w:val="0"/>
-              <w:widowControl w:val="1"/>
-              <w:shd w:val="clear" w:color="auto" w:fill="auto"/>
-              <w:suppressAutoHyphens w:val="0"/>
-              <w:bidi w:val="0"/>
-              <w:spacing w:before="0" w:after="0" w:line="240" w:lineRule="auto"/>
-              <w:ind w:left="0" w:right="0" w:firstLine="0"/>
-              <w:jc w:val="center"/>
-              <w:outlineLvl w:val="9"/>
-              <w:rPr>
-                <w:rtl w:val="0"/>
-              </w:rPr>
-            </w:pPr>
-            <w:r>
-              <w:rPr>
-                <w:rFonts w:ascii="Futura" w:cs="Arial Unicode MS" w:hAnsi="Futura" w:eastAsia="Arial Unicode MS"/>
-                <w:b w:val="0"/>
-                <w:bCs w:val="0"/>
-                <w:i w:val="0"/>
-                <w:iCs w:val="0"/>
-                <w:caps w:val="0"/>
-                <w:smallCaps w:val="0"/>
-                <w:strike w:val="0"/>
-                <w:dstrike w:val="0"/>
-                <w:outline w:val="0"/>
-                <w:color w:val="000000"/>
-                <w:spacing w:val="0"/>
-                <w:kern w:val="0"/>
-                <w:position w:val="0"/>
-                <w:sz w:val="20"/>
-                <w:szCs w:val="20"/>
-                <w:u w:val="none" w:color="000000"/>
-                <w:shd w:val="nil" w:color="auto" w:fill="auto"/>
-                <w:vertAlign w:val="baseline"/>
-                <w:rtl w:val="0"/>
-                <w14:textOutline w14:w="12700" w14:cap="flat">
-                  <w14:noFill/>
-                  <w14:miter w14:lim="400000"/>
-                </w14:textOutline>
-                <w14:textFill>
-                  <w14:solidFill>
-                    <w14:srgbClr w14:val="000000"/>
-                  </w14:solidFill>
-                </w14:textFill>
-              </w:rPr>
-              <w:t>Boylam</w:t>
+              <w:t>Derinlik</w:t>
             </w:r>
           </w:p>
         </w:tc>
@@ -1302,7 +1230,7 @@
         </w:trPr>
         <w:tc>
           <w:tcPr>
-            <w:tcW w:type="dxa" w:w="2407"/>
+            <w:tcW w:type="dxa" w:w="3189"/>
             <w:tcBorders>
               <w:top w:val="single" w:color="929292" w:sz="4" w:space="0" w:shadow="0" w:frame="0"/>
               <w:left w:val="single" w:color="929292" w:sz="4" w:space="0" w:shadow="0" w:frame="0"/>
@@ -1322,7 +1250,7 @@
         </w:tc>
         <w:tc>
           <w:tcPr>
-            <w:tcW w:type="dxa" w:w="2408"/>
+            <w:tcW w:type="dxa" w:w="3190"/>
             <w:tcBorders>
               <w:top w:val="single" w:color="929292" w:sz="4" w:space="0" w:shadow="0" w:frame="0"/>
               <w:left w:val="single" w:color="929292" w:sz="4" w:space="0" w:shadow="0" w:frame="0"/>
@@ -1342,27 +1270,7 @@
         </w:tc>
         <w:tc>
           <w:tcPr>
-            <w:tcW w:type="dxa" w:w="2408"/>
-            <w:tcBorders>
-              <w:top w:val="single" w:color="929292" w:sz="4" w:space="0" w:shadow="0" w:frame="0"/>
-              <w:left w:val="single" w:color="929292" w:sz="4" w:space="0" w:shadow="0" w:frame="0"/>
-              <w:bottom w:val="single" w:color="929292" w:sz="4" w:space="0" w:shadow="0" w:frame="0"/>
-              <w:right w:val="single" w:color="929292" w:sz="4" w:space="0" w:shadow="0" w:frame="0"/>
-            </w:tcBorders>
-            <w:shd w:val="clear" w:color="auto" w:fill="f7f7f6"/>
-            <w:tcMar>
-              <w:top w:type="dxa" w:w="80"/>
-              <w:left w:type="dxa" w:w="80"/>
-              <w:bottom w:type="dxa" w:w="80"/>
-              <w:right w:type="dxa" w:w="80"/>
-            </w:tcMar>
-            <w:vAlign w:val="center"/>
-          </w:tcPr>
-          <w:p/>
-        </w:tc>
-        <w:tc>
-          <w:tcPr>
-            <w:tcW w:type="dxa" w:w="2407"/>
+            <w:tcW w:type="dxa" w:w="3190"/>
             <w:tcBorders>
               <w:top w:val="single" w:color="929292" w:sz="4" w:space="0" w:shadow="0" w:frame="0"/>
               <w:left w:val="single" w:color="929292" w:sz="4" w:space="0" w:shadow="0" w:frame="0"/>
@@ -1528,7 +1436,7 @@
     </w:p>
     <w:tbl>
       <w:tblPr>
-        <w:tblW w:w="9630" w:type="dxa"/>
+        <w:tblW w:w="9574" w:type="dxa"/>
         <w:jc w:val="left"/>
         <w:tblInd w:w="216" w:type="dxa"/>
         <w:tblBorders>
@@ -1543,10 +1451,9 @@
         <w:tblLayout w:type="fixed"/>
       </w:tblPr>
       <w:tblGrid>
-        <w:gridCol w:w="2407"/>
-        <w:gridCol w:w="2408"/>
-        <w:gridCol w:w="2408"/>
-        <w:gridCol w:w="2407"/>
+        <w:gridCol w:w="3190"/>
+        <w:gridCol w:w="3192"/>
+        <w:gridCol w:w="3192"/>
       </w:tblGrid>
       <w:tr>
         <w:tblPrEx>
@@ -1557,7 +1464,7 @@
         </w:trPr>
         <w:tc>
           <w:tcPr>
-            <w:tcW w:type="dxa" w:w="2407"/>
+            <w:tcW w:type="dxa" w:w="3190"/>
             <w:tcBorders>
               <w:top w:val="single" w:color="000000" w:sz="2" w:space="0" w:shadow="0" w:frame="0"/>
               <w:left w:val="single" w:color="000000" w:sz="2" w:space="0" w:shadow="0" w:frame="0"/>
@@ -1628,7 +1535,7 @@
         </w:tc>
         <w:tc>
           <w:tcPr>
-            <w:tcW w:type="dxa" w:w="2408"/>
+            <w:tcW w:type="dxa" w:w="3191"/>
             <w:tcBorders>
               <w:top w:val="single" w:color="000000" w:sz="2" w:space="0" w:shadow="0" w:frame="0"/>
               <w:left w:val="single" w:color="000000" w:sz="2" w:space="0" w:shadow="0" w:frame="0"/>
@@ -1903,7 +1810,7 @@
         </w:tc>
         <w:tc>
           <w:tcPr>
-            <w:tcW w:type="dxa" w:w="2408"/>
+            <w:tcW w:type="dxa" w:w="3191"/>
             <w:tcBorders>
               <w:top w:val="single" w:color="000000" w:sz="2" w:space="0" w:shadow="0" w:frame="0"/>
               <w:left w:val="single" w:color="000000" w:sz="2" w:space="0" w:shadow="0" w:frame="0"/>
@@ -1968,78 +1875,7 @@
                   </w14:solidFill>
                 </w14:textFill>
               </w:rPr>
-              <w:t>Enlem</w:t>
-            </w:r>
-          </w:p>
-        </w:tc>
-        <w:tc>
-          <w:tcPr>
-            <w:tcW w:type="dxa" w:w="2407"/>
-            <w:tcBorders>
-              <w:top w:val="single" w:color="000000" w:sz="2" w:space="0" w:shadow="0" w:frame="0"/>
-              <w:left w:val="single" w:color="000000" w:sz="2" w:space="0" w:shadow="0" w:frame="0"/>
-              <w:bottom w:val="single" w:color="000000" w:sz="2" w:space="0" w:shadow="0" w:frame="0"/>
-              <w:right w:val="single" w:color="000000" w:sz="2" w:space="0" w:shadow="0" w:frame="0"/>
-            </w:tcBorders>
-            <w:shd w:val="clear" w:color="auto" w:fill="auto"/>
-            <w:tcMar>
-              <w:top w:type="dxa" w:w="80"/>
-              <w:left w:type="dxa" w:w="80"/>
-              <w:bottom w:type="dxa" w:w="80"/>
-              <w:right w:type="dxa" w:w="80"/>
-            </w:tcMar>
-            <w:vAlign w:val="center"/>
-          </w:tcPr>
-          <w:p>
-            <w:pPr>
-              <w:keepNext w:val="0"/>
-              <w:keepLines w:val="0"/>
-              <w:pageBreakBefore w:val="0"/>
-              <w:widowControl w:val="1"/>
-              <w:shd w:val="clear" w:color="auto" w:fill="auto"/>
-              <w:suppressAutoHyphens w:val="0"/>
-              <w:bidi w:val="0"/>
-              <w:spacing w:before="0" w:after="0" w:line="240" w:lineRule="auto"/>
-              <w:ind w:left="0" w:right="0" w:firstLine="0"/>
-              <w:jc w:val="center"/>
-              <w:outlineLvl w:val="9"/>
-              <w:rPr>
-                <w:rtl w:val="0"/>
-              </w:rPr>
-            </w:pPr>
-            <w:r>
-              <w:rPr>
-                <w:rFonts w:ascii="Futura" w:cs="Arial Unicode MS" w:hAnsi="Futura" w:eastAsia="Arial Unicode MS"/>
-                <w:b w:val="0"/>
-                <w:bCs w:val="0"/>
-                <w:i w:val="0"/>
-                <w:iCs w:val="0"/>
-                <w:caps w:val="0"/>
-                <w:smallCaps w:val="0"/>
-                <w:strike w:val="0"/>
-                <w:dstrike w:val="0"/>
-                <w:outline w:val="0"/>
-                <w:color w:val="000000"/>
-                <w:spacing w:val="0"/>
-                <w:kern w:val="0"/>
-                <w:position w:val="0"/>
-                <w:sz w:val="20"/>
-                <w:szCs w:val="20"/>
-                <w:u w:val="none" w:color="000000"/>
-                <w:shd w:val="nil" w:color="auto" w:fill="auto"/>
-                <w:vertAlign w:val="baseline"/>
-                <w:rtl w:val="0"/>
-                <w14:textOutline w14:w="12700" w14:cap="flat">
-                  <w14:noFill/>
-                  <w14:miter w14:lim="400000"/>
-                </w14:textOutline>
-                <w14:textFill>
-                  <w14:solidFill>
-                    <w14:srgbClr w14:val="000000"/>
-                  </w14:solidFill>
-                </w14:textFill>
-              </w:rPr>
-              <w:t>Boylam</w:t>
+              <w:t>Derinlik</w:t>
             </w:r>
           </w:p>
         </w:tc>
@@ -2053,7 +1889,7 @@
         </w:trPr>
         <w:tc>
           <w:tcPr>
-            <w:tcW w:type="dxa" w:w="2407"/>
+            <w:tcW w:type="dxa" w:w="3190"/>
             <w:tcBorders>
               <w:top w:val="single" w:color="000000" w:sz="2" w:space="0" w:shadow="0" w:frame="0"/>
               <w:left w:val="single" w:color="000000" w:sz="2" w:space="0" w:shadow="0" w:frame="0"/>
@@ -2073,7 +1909,7 @@
         </w:tc>
         <w:tc>
           <w:tcPr>
-            <w:tcW w:type="dxa" w:w="2408"/>
+            <w:tcW w:type="dxa" w:w="3191"/>
             <w:tcBorders>
               <w:top w:val="single" w:color="000000" w:sz="2" w:space="0" w:shadow="0" w:frame="0"/>
               <w:left w:val="single" w:color="000000" w:sz="2" w:space="0" w:shadow="0" w:frame="0"/>
@@ -2093,27 +1929,7 @@
         </w:tc>
         <w:tc>
           <w:tcPr>
-            <w:tcW w:type="dxa" w:w="2408"/>
-            <w:tcBorders>
-              <w:top w:val="single" w:color="000000" w:sz="2" w:space="0" w:shadow="0" w:frame="0"/>
-              <w:left w:val="single" w:color="000000" w:sz="2" w:space="0" w:shadow="0" w:frame="0"/>
-              <w:bottom w:val="single" w:color="000000" w:sz="2" w:space="0" w:shadow="0" w:frame="0"/>
-              <w:right w:val="single" w:color="000000" w:sz="2" w:space="0" w:shadow="0" w:frame="0"/>
-            </w:tcBorders>
-            <w:shd w:val="clear" w:color="auto" w:fill="f5f5f5"/>
-            <w:tcMar>
-              <w:top w:type="dxa" w:w="80"/>
-              <w:left w:type="dxa" w:w="80"/>
-              <w:bottom w:type="dxa" w:w="80"/>
-              <w:right w:type="dxa" w:w="80"/>
-            </w:tcMar>
-            <w:vAlign w:val="center"/>
-          </w:tcPr>
-          <w:p/>
-        </w:tc>
-        <w:tc>
-          <w:tcPr>
-            <w:tcW w:type="dxa" w:w="2407"/>
+            <w:tcW w:type="dxa" w:w="3191"/>
             <w:tcBorders>
               <w:top w:val="single" w:color="000000" w:sz="2" w:space="0" w:shadow="0" w:frame="0"/>
               <w:left w:val="single" w:color="000000" w:sz="2" w:space="0" w:shadow="0" w:frame="0"/>
@@ -3887,7 +3703,7 @@
     </w:p>
     <w:tbl>
       <w:tblPr>
-        <w:tblW w:w="9627" w:type="dxa"/>
+        <w:tblW w:w="9514" w:type="dxa"/>
         <w:jc w:val="left"/>
         <w:tblInd w:w="216" w:type="dxa"/>
         <w:tblBorders>
@@ -3902,12 +3718,10 @@
         <w:tblLayout w:type="fixed"/>
       </w:tblPr>
       <w:tblGrid>
-        <w:gridCol w:w="1604"/>
-        <w:gridCol w:w="1605"/>
-        <w:gridCol w:w="1604"/>
-        <w:gridCol w:w="1605"/>
-        <w:gridCol w:w="1605"/>
-        <w:gridCol w:w="1604"/>
+        <w:gridCol w:w="2377"/>
+        <w:gridCol w:w="2380"/>
+        <w:gridCol w:w="2377"/>
+        <w:gridCol w:w="2380"/>
       </w:tblGrid>
       <w:tr>
         <w:tblPrEx>
@@ -3919,7 +3733,7 @@
         </w:trPr>
         <w:tc>
           <w:tcPr>
-            <w:tcW w:type="dxa" w:w="1604"/>
+            <w:tcW w:type="dxa" w:w="2377"/>
             <w:tcBorders>
               <w:top w:val="single" w:color="929292" w:sz="4" w:space="0" w:shadow="0" w:frame="0"/>
               <w:left w:val="single" w:color="929292" w:sz="4" w:space="0" w:shadow="0" w:frame="0"/>
@@ -3950,7 +3764,7 @@
         </w:tc>
         <w:tc>
           <w:tcPr>
-            <w:tcW w:type="dxa" w:w="1605"/>
+            <w:tcW w:type="dxa" w:w="2379"/>
             <w:tcBorders>
               <w:top w:val="single" w:color="929292" w:sz="4" w:space="0" w:shadow="0" w:frame="0"/>
               <w:left w:val="single" w:color="ffffff" w:sz="4" w:space="0" w:shadow="0" w:frame="0"/>
@@ -4023,7 +3837,7 @@
         </w:tc>
         <w:tc>
           <w:tcPr>
-            <w:tcW w:type="dxa" w:w="1604"/>
+            <w:tcW w:type="dxa" w:w="2377"/>
             <w:tcBorders>
               <w:top w:val="single" w:color="929292" w:sz="4" w:space="0" w:shadow="0" w:frame="0"/>
               <w:left w:val="single" w:color="ffffff" w:sz="4" w:space="0" w:shadow="0" w:frame="0"/>
@@ -4054,7 +3868,7 @@
         </w:tc>
         <w:tc>
           <w:tcPr>
-            <w:tcW w:type="dxa" w:w="1605"/>
+            <w:tcW w:type="dxa" w:w="2379"/>
             <w:tcBorders>
               <w:top w:val="single" w:color="929292" w:sz="4" w:space="0" w:shadow="0" w:frame="0"/>
               <w:left w:val="single" w:color="ffffff" w:sz="4" w:space="0" w:shadow="0" w:frame="0"/>
@@ -4090,68 +3904,6 @@
             </w:r>
           </w:p>
         </w:tc>
-        <w:tc>
-          <w:tcPr>
-            <w:tcW w:type="dxa" w:w="1605"/>
-            <w:tcBorders>
-              <w:top w:val="single" w:color="929292" w:sz="4" w:space="0" w:shadow="0" w:frame="0"/>
-              <w:left w:val="single" w:color="ffffff" w:sz="4" w:space="0" w:shadow="0" w:frame="0"/>
-              <w:bottom w:val="single" w:color="89847f" w:sz="8" w:space="0" w:shadow="0" w:frame="0"/>
-              <w:right w:val="single" w:color="ffffff" w:sz="4" w:space="0" w:shadow="0" w:frame="0"/>
-            </w:tcBorders>
-            <w:shd w:val="clear" w:color="auto" w:fill="00a2ff"/>
-            <w:tcMar>
-              <w:top w:type="dxa" w:w="80"/>
-              <w:left w:type="dxa" w:w="80"/>
-              <w:bottom w:type="dxa" w:w="80"/>
-              <w:right w:type="dxa" w:w="80"/>
-            </w:tcMar>
-            <w:vAlign w:val="top"/>
-          </w:tcPr>
-          <w:p>
-            <w:pPr>
-              <w:pStyle w:val="Table Style 3"/>
-            </w:pPr>
-            <w:r>
-              <w:rPr>
-                <w:shd w:val="nil" w:color="auto" w:fill="auto"/>
-                <w:rtl w:val="0"/>
-              </w:rPr>
-              <w:t>Enlem</w:t>
-            </w:r>
-          </w:p>
-        </w:tc>
-        <w:tc>
-          <w:tcPr>
-            <w:tcW w:type="dxa" w:w="1604"/>
-            <w:tcBorders>
-              <w:top w:val="single" w:color="929292" w:sz="4" w:space="0" w:shadow="0" w:frame="0"/>
-              <w:left w:val="single" w:color="ffffff" w:sz="4" w:space="0" w:shadow="0" w:frame="0"/>
-              <w:bottom w:val="single" w:color="89847f" w:sz="8" w:space="0" w:shadow="0" w:frame="0"/>
-              <w:right w:val="single" w:color="929292" w:sz="4" w:space="0" w:shadow="0" w:frame="0"/>
-            </w:tcBorders>
-            <w:shd w:val="clear" w:color="auto" w:fill="00a2ff"/>
-            <w:tcMar>
-              <w:top w:type="dxa" w:w="80"/>
-              <w:left w:type="dxa" w:w="80"/>
-              <w:bottom w:type="dxa" w:w="80"/>
-              <w:right w:type="dxa" w:w="80"/>
-            </w:tcMar>
-            <w:vAlign w:val="top"/>
-          </w:tcPr>
-          <w:p>
-            <w:pPr>
-              <w:pStyle w:val="Table Style 3"/>
-            </w:pPr>
-            <w:r>
-              <w:rPr>
-                <w:shd w:val="nil" w:color="auto" w:fill="auto"/>
-                <w:rtl w:val="0"/>
-              </w:rPr>
-              <w:t>Boylam</w:t>
-            </w:r>
-          </w:p>
-        </w:tc>
       </w:tr>
       <w:tr>
         <w:tblPrEx>
@@ -4162,7 +3914,7 @@
         </w:trPr>
         <w:tc>
           <w:tcPr>
-            <w:tcW w:type="dxa" w:w="1604"/>
+            <w:tcW w:type="dxa" w:w="2377"/>
             <w:tcBorders>
               <w:top w:val="single" w:color="89847f" w:sz="8" w:space="0" w:shadow="0" w:frame="0"/>
               <w:left w:val="single" w:color="929292" w:sz="4" w:space="0" w:shadow="0" w:frame="0"/>
@@ -4182,7 +3934,7 @@
         </w:tc>
         <w:tc>
           <w:tcPr>
-            <w:tcW w:type="dxa" w:w="1605"/>
+            <w:tcW w:type="dxa" w:w="2379"/>
             <w:tcBorders>
               <w:top w:val="single" w:color="89847f" w:sz="8" w:space="0" w:shadow="0" w:frame="0"/>
               <w:left w:val="single" w:color="929292" w:sz="4" w:space="0" w:shadow="0" w:frame="0"/>
@@ -4202,7 +3954,7 @@
         </w:tc>
         <w:tc>
           <w:tcPr>
-            <w:tcW w:type="dxa" w:w="1604"/>
+            <w:tcW w:type="dxa" w:w="2377"/>
             <w:tcBorders>
               <w:top w:val="single" w:color="89847f" w:sz="8" w:space="0" w:shadow="0" w:frame="0"/>
               <w:left w:val="single" w:color="929292" w:sz="4" w:space="0" w:shadow="0" w:frame="0"/>
@@ -4222,47 +3974,7 @@
         </w:tc>
         <w:tc>
           <w:tcPr>
-            <w:tcW w:type="dxa" w:w="1605"/>
-            <w:tcBorders>
-              <w:top w:val="single" w:color="89847f" w:sz="8" w:space="0" w:shadow="0" w:frame="0"/>
-              <w:left w:val="single" w:color="929292" w:sz="4" w:space="0" w:shadow="0" w:frame="0"/>
-              <w:bottom w:val="single" w:color="929292" w:sz="4" w:space="0" w:shadow="0" w:frame="0"/>
-              <w:right w:val="single" w:color="929292" w:sz="4" w:space="0" w:shadow="0" w:frame="0"/>
-            </w:tcBorders>
-            <w:shd w:val="clear" w:color="auto" w:fill="auto"/>
-            <w:tcMar>
-              <w:top w:type="dxa" w:w="80"/>
-              <w:left w:type="dxa" w:w="80"/>
-              <w:bottom w:type="dxa" w:w="80"/>
-              <w:right w:type="dxa" w:w="80"/>
-            </w:tcMar>
-            <w:vAlign w:val="top"/>
-          </w:tcPr>
-          <w:p/>
-        </w:tc>
-        <w:tc>
-          <w:tcPr>
-            <w:tcW w:type="dxa" w:w="1605"/>
-            <w:tcBorders>
-              <w:top w:val="single" w:color="89847f" w:sz="8" w:space="0" w:shadow="0" w:frame="0"/>
-              <w:left w:val="single" w:color="929292" w:sz="4" w:space="0" w:shadow="0" w:frame="0"/>
-              <w:bottom w:val="single" w:color="929292" w:sz="4" w:space="0" w:shadow="0" w:frame="0"/>
-              <w:right w:val="single" w:color="929292" w:sz="4" w:space="0" w:shadow="0" w:frame="0"/>
-            </w:tcBorders>
-            <w:shd w:val="clear" w:color="auto" w:fill="auto"/>
-            <w:tcMar>
-              <w:top w:type="dxa" w:w="80"/>
-              <w:left w:type="dxa" w:w="80"/>
-              <w:bottom w:type="dxa" w:w="80"/>
-              <w:right w:type="dxa" w:w="80"/>
-            </w:tcMar>
-            <w:vAlign w:val="top"/>
-          </w:tcPr>
-          <w:p/>
-        </w:tc>
-        <w:tc>
-          <w:tcPr>
-            <w:tcW w:type="dxa" w:w="1604"/>
+            <w:tcW w:type="dxa" w:w="2379"/>
             <w:tcBorders>
               <w:top w:val="single" w:color="89847f" w:sz="8" w:space="0" w:shadow="0" w:frame="0"/>
               <w:left w:val="single" w:color="929292" w:sz="4" w:space="0" w:shadow="0" w:frame="0"/>
@@ -4290,7 +4002,7 @@
         </w:trPr>
         <w:tc>
           <w:tcPr>
-            <w:tcW w:type="dxa" w:w="1604"/>
+            <w:tcW w:type="dxa" w:w="2377"/>
             <w:tcBorders>
               <w:top w:val="single" w:color="929292" w:sz="4" w:space="0" w:shadow="0" w:frame="0"/>
               <w:left w:val="single" w:color="929292" w:sz="4" w:space="0" w:shadow="0" w:frame="0"/>
@@ -4310,7 +4022,7 @@
         </w:tc>
         <w:tc>
           <w:tcPr>
-            <w:tcW w:type="dxa" w:w="1605"/>
+            <w:tcW w:type="dxa" w:w="2379"/>
             <w:tcBorders>
               <w:top w:val="single" w:color="929292" w:sz="4" w:space="0" w:shadow="0" w:frame="0"/>
               <w:left w:val="single" w:color="929292" w:sz="4" w:space="0" w:shadow="0" w:frame="0"/>
@@ -4330,7 +4042,7 @@
         </w:tc>
         <w:tc>
           <w:tcPr>
-            <w:tcW w:type="dxa" w:w="1604"/>
+            <w:tcW w:type="dxa" w:w="2377"/>
             <w:tcBorders>
               <w:top w:val="single" w:color="929292" w:sz="4" w:space="0" w:shadow="0" w:frame="0"/>
               <w:left w:val="single" w:color="929292" w:sz="4" w:space="0" w:shadow="0" w:frame="0"/>
@@ -4350,47 +4062,7 @@
         </w:tc>
         <w:tc>
           <w:tcPr>
-            <w:tcW w:type="dxa" w:w="1605"/>
-            <w:tcBorders>
-              <w:top w:val="single" w:color="929292" w:sz="4" w:space="0" w:shadow="0" w:frame="0"/>
-              <w:left w:val="single" w:color="929292" w:sz="4" w:space="0" w:shadow="0" w:frame="0"/>
-              <w:bottom w:val="single" w:color="929292" w:sz="4" w:space="0" w:shadow="0" w:frame="0"/>
-              <w:right w:val="single" w:color="929292" w:sz="4" w:space="0" w:shadow="0" w:frame="0"/>
-            </w:tcBorders>
-            <w:shd w:val="clear" w:color="auto" w:fill="f7f7f6"/>
-            <w:tcMar>
-              <w:top w:type="dxa" w:w="80"/>
-              <w:left w:type="dxa" w:w="80"/>
-              <w:bottom w:type="dxa" w:w="80"/>
-              <w:right w:type="dxa" w:w="80"/>
-            </w:tcMar>
-            <w:vAlign w:val="top"/>
-          </w:tcPr>
-          <w:p/>
-        </w:tc>
-        <w:tc>
-          <w:tcPr>
-            <w:tcW w:type="dxa" w:w="1605"/>
-            <w:tcBorders>
-              <w:top w:val="single" w:color="929292" w:sz="4" w:space="0" w:shadow="0" w:frame="0"/>
-              <w:left w:val="single" w:color="929292" w:sz="4" w:space="0" w:shadow="0" w:frame="0"/>
-              <w:bottom w:val="single" w:color="929292" w:sz="4" w:space="0" w:shadow="0" w:frame="0"/>
-              <w:right w:val="single" w:color="929292" w:sz="4" w:space="0" w:shadow="0" w:frame="0"/>
-            </w:tcBorders>
-            <w:shd w:val="clear" w:color="auto" w:fill="f7f7f6"/>
-            <w:tcMar>
-              <w:top w:type="dxa" w:w="80"/>
-              <w:left w:type="dxa" w:w="80"/>
-              <w:bottom w:type="dxa" w:w="80"/>
-              <w:right w:type="dxa" w:w="80"/>
-            </w:tcMar>
-            <w:vAlign w:val="top"/>
-          </w:tcPr>
-          <w:p/>
-        </w:tc>
-        <w:tc>
-          <w:tcPr>
-            <w:tcW w:type="dxa" w:w="1604"/>
+            <w:tcW w:type="dxa" w:w="2379"/>
             <w:tcBorders>
               <w:top w:val="single" w:color="929292" w:sz="4" w:space="0" w:shadow="0" w:frame="0"/>
               <w:left w:val="single" w:color="929292" w:sz="4" w:space="0" w:shadow="0" w:frame="0"/>
@@ -4418,7 +4090,7 @@
         </w:trPr>
         <w:tc>
           <w:tcPr>
-            <w:tcW w:type="dxa" w:w="1604"/>
+            <w:tcW w:type="dxa" w:w="2377"/>
             <w:tcBorders>
               <w:top w:val="single" w:color="929292" w:sz="4" w:space="0" w:shadow="0" w:frame="0"/>
               <w:left w:val="single" w:color="929292" w:sz="4" w:space="0" w:shadow="0" w:frame="0"/>
@@ -4438,7 +4110,7 @@
         </w:tc>
         <w:tc>
           <w:tcPr>
-            <w:tcW w:type="dxa" w:w="1605"/>
+            <w:tcW w:type="dxa" w:w="2379"/>
             <w:tcBorders>
               <w:top w:val="single" w:color="929292" w:sz="4" w:space="0" w:shadow="0" w:frame="0"/>
               <w:left w:val="single" w:color="929292" w:sz="4" w:space="0" w:shadow="0" w:frame="0"/>
@@ -4458,7 +4130,7 @@
         </w:tc>
         <w:tc>
           <w:tcPr>
-            <w:tcW w:type="dxa" w:w="1604"/>
+            <w:tcW w:type="dxa" w:w="2377"/>
             <w:tcBorders>
               <w:top w:val="single" w:color="929292" w:sz="4" w:space="0" w:shadow="0" w:frame="0"/>
               <w:left w:val="single" w:color="929292" w:sz="4" w:space="0" w:shadow="0" w:frame="0"/>
@@ -4478,47 +4150,7 @@
         </w:tc>
         <w:tc>
           <w:tcPr>
-            <w:tcW w:type="dxa" w:w="1605"/>
-            <w:tcBorders>
-              <w:top w:val="single" w:color="929292" w:sz="4" w:space="0" w:shadow="0" w:frame="0"/>
-              <w:left w:val="single" w:color="929292" w:sz="4" w:space="0" w:shadow="0" w:frame="0"/>
-              <w:bottom w:val="single" w:color="929292" w:sz="4" w:space="0" w:shadow="0" w:frame="0"/>
-              <w:right w:val="single" w:color="929292" w:sz="4" w:space="0" w:shadow="0" w:frame="0"/>
-            </w:tcBorders>
-            <w:shd w:val="clear" w:color="auto" w:fill="auto"/>
-            <w:tcMar>
-              <w:top w:type="dxa" w:w="80"/>
-              <w:left w:type="dxa" w:w="80"/>
-              <w:bottom w:type="dxa" w:w="80"/>
-              <w:right w:type="dxa" w:w="80"/>
-            </w:tcMar>
-            <w:vAlign w:val="top"/>
-          </w:tcPr>
-          <w:p/>
-        </w:tc>
-        <w:tc>
-          <w:tcPr>
-            <w:tcW w:type="dxa" w:w="1605"/>
-            <w:tcBorders>
-              <w:top w:val="single" w:color="929292" w:sz="4" w:space="0" w:shadow="0" w:frame="0"/>
-              <w:left w:val="single" w:color="929292" w:sz="4" w:space="0" w:shadow="0" w:frame="0"/>
-              <w:bottom w:val="single" w:color="929292" w:sz="4" w:space="0" w:shadow="0" w:frame="0"/>
-              <w:right w:val="single" w:color="929292" w:sz="4" w:space="0" w:shadow="0" w:frame="0"/>
-            </w:tcBorders>
-            <w:shd w:val="clear" w:color="auto" w:fill="auto"/>
-            <w:tcMar>
-              <w:top w:type="dxa" w:w="80"/>
-              <w:left w:type="dxa" w:w="80"/>
-              <w:bottom w:type="dxa" w:w="80"/>
-              <w:right w:type="dxa" w:w="80"/>
-            </w:tcMar>
-            <w:vAlign w:val="top"/>
-          </w:tcPr>
-          <w:p/>
-        </w:tc>
-        <w:tc>
-          <w:tcPr>
-            <w:tcW w:type="dxa" w:w="1604"/>
+            <w:tcW w:type="dxa" w:w="2379"/>
             <w:tcBorders>
               <w:top w:val="single" w:color="929292" w:sz="4" w:space="0" w:shadow="0" w:frame="0"/>
               <w:left w:val="single" w:color="929292" w:sz="4" w:space="0" w:shadow="0" w:frame="0"/>
@@ -4546,7 +4178,7 @@
         </w:trPr>
         <w:tc>
           <w:tcPr>
-            <w:tcW w:type="dxa" w:w="1604"/>
+            <w:tcW w:type="dxa" w:w="2377"/>
             <w:tcBorders>
               <w:top w:val="single" w:color="929292" w:sz="4" w:space="0" w:shadow="0" w:frame="0"/>
               <w:left w:val="single" w:color="929292" w:sz="4" w:space="0" w:shadow="0" w:frame="0"/>
@@ -4566,7 +4198,7 @@
         </w:tc>
         <w:tc>
           <w:tcPr>
-            <w:tcW w:type="dxa" w:w="1605"/>
+            <w:tcW w:type="dxa" w:w="2379"/>
             <w:tcBorders>
               <w:top w:val="single" w:color="929292" w:sz="4" w:space="0" w:shadow="0" w:frame="0"/>
               <w:left w:val="single" w:color="929292" w:sz="4" w:space="0" w:shadow="0" w:frame="0"/>
@@ -4586,7 +4218,7 @@
         </w:tc>
         <w:tc>
           <w:tcPr>
-            <w:tcW w:type="dxa" w:w="1604"/>
+            <w:tcW w:type="dxa" w:w="2377"/>
             <w:tcBorders>
               <w:top w:val="single" w:color="929292" w:sz="4" w:space="0" w:shadow="0" w:frame="0"/>
               <w:left w:val="single" w:color="929292" w:sz="4" w:space="0" w:shadow="0" w:frame="0"/>
@@ -4606,47 +4238,7 @@
         </w:tc>
         <w:tc>
           <w:tcPr>
-            <w:tcW w:type="dxa" w:w="1605"/>
-            <w:tcBorders>
-              <w:top w:val="single" w:color="929292" w:sz="4" w:space="0" w:shadow="0" w:frame="0"/>
-              <w:left w:val="single" w:color="929292" w:sz="4" w:space="0" w:shadow="0" w:frame="0"/>
-              <w:bottom w:val="single" w:color="929292" w:sz="4" w:space="0" w:shadow="0" w:frame="0"/>
-              <w:right w:val="single" w:color="929292" w:sz="4" w:space="0" w:shadow="0" w:frame="0"/>
-            </w:tcBorders>
-            <w:shd w:val="clear" w:color="auto" w:fill="f7f7f6"/>
-            <w:tcMar>
-              <w:top w:type="dxa" w:w="80"/>
-              <w:left w:type="dxa" w:w="80"/>
-              <w:bottom w:type="dxa" w:w="80"/>
-              <w:right w:type="dxa" w:w="80"/>
-            </w:tcMar>
-            <w:vAlign w:val="top"/>
-          </w:tcPr>
-          <w:p/>
-        </w:tc>
-        <w:tc>
-          <w:tcPr>
-            <w:tcW w:type="dxa" w:w="1605"/>
-            <w:tcBorders>
-              <w:top w:val="single" w:color="929292" w:sz="4" w:space="0" w:shadow="0" w:frame="0"/>
-              <w:left w:val="single" w:color="929292" w:sz="4" w:space="0" w:shadow="0" w:frame="0"/>
-              <w:bottom w:val="single" w:color="929292" w:sz="4" w:space="0" w:shadow="0" w:frame="0"/>
-              <w:right w:val="single" w:color="929292" w:sz="4" w:space="0" w:shadow="0" w:frame="0"/>
-            </w:tcBorders>
-            <w:shd w:val="clear" w:color="auto" w:fill="f7f7f6"/>
-            <w:tcMar>
-              <w:top w:type="dxa" w:w="80"/>
-              <w:left w:type="dxa" w:w="80"/>
-              <w:bottom w:type="dxa" w:w="80"/>
-              <w:right w:type="dxa" w:w="80"/>
-            </w:tcMar>
-            <w:vAlign w:val="top"/>
-          </w:tcPr>
-          <w:p/>
-        </w:tc>
-        <w:tc>
-          <w:tcPr>
-            <w:tcW w:type="dxa" w:w="1604"/>
+            <w:tcW w:type="dxa" w:w="2379"/>
             <w:tcBorders>
               <w:top w:val="single" w:color="929292" w:sz="4" w:space="0" w:shadow="0" w:frame="0"/>
               <w:left w:val="single" w:color="929292" w:sz="4" w:space="0" w:shadow="0" w:frame="0"/>
@@ -4674,7 +4266,7 @@
         </w:trPr>
         <w:tc>
           <w:tcPr>
-            <w:tcW w:type="dxa" w:w="1604"/>
+            <w:tcW w:type="dxa" w:w="2377"/>
             <w:tcBorders>
               <w:top w:val="single" w:color="929292" w:sz="4" w:space="0" w:shadow="0" w:frame="0"/>
               <w:left w:val="single" w:color="929292" w:sz="4" w:space="0" w:shadow="0" w:frame="0"/>
@@ -4694,7 +4286,7 @@
         </w:tc>
         <w:tc>
           <w:tcPr>
-            <w:tcW w:type="dxa" w:w="1605"/>
+            <w:tcW w:type="dxa" w:w="2379"/>
             <w:tcBorders>
               <w:top w:val="single" w:color="929292" w:sz="4" w:space="0" w:shadow="0" w:frame="0"/>
               <w:left w:val="single" w:color="929292" w:sz="4" w:space="0" w:shadow="0" w:frame="0"/>
@@ -4714,7 +4306,7 @@
         </w:tc>
         <w:tc>
           <w:tcPr>
-            <w:tcW w:type="dxa" w:w="1604"/>
+            <w:tcW w:type="dxa" w:w="2377"/>
             <w:tcBorders>
               <w:top w:val="single" w:color="929292" w:sz="4" w:space="0" w:shadow="0" w:frame="0"/>
               <w:left w:val="single" w:color="929292" w:sz="4" w:space="0" w:shadow="0" w:frame="0"/>
@@ -4734,47 +4326,7 @@
         </w:tc>
         <w:tc>
           <w:tcPr>
-            <w:tcW w:type="dxa" w:w="1605"/>
-            <w:tcBorders>
-              <w:top w:val="single" w:color="929292" w:sz="4" w:space="0" w:shadow="0" w:frame="0"/>
-              <w:left w:val="single" w:color="929292" w:sz="4" w:space="0" w:shadow="0" w:frame="0"/>
-              <w:bottom w:val="single" w:color="929292" w:sz="4" w:space="0" w:shadow="0" w:frame="0"/>
-              <w:right w:val="single" w:color="929292" w:sz="4" w:space="0" w:shadow="0" w:frame="0"/>
-            </w:tcBorders>
-            <w:shd w:val="clear" w:color="auto" w:fill="auto"/>
-            <w:tcMar>
-              <w:top w:type="dxa" w:w="80"/>
-              <w:left w:type="dxa" w:w="80"/>
-              <w:bottom w:type="dxa" w:w="80"/>
-              <w:right w:type="dxa" w:w="80"/>
-            </w:tcMar>
-            <w:vAlign w:val="top"/>
-          </w:tcPr>
-          <w:p/>
-        </w:tc>
-        <w:tc>
-          <w:tcPr>
-            <w:tcW w:type="dxa" w:w="1605"/>
-            <w:tcBorders>
-              <w:top w:val="single" w:color="929292" w:sz="4" w:space="0" w:shadow="0" w:frame="0"/>
-              <w:left w:val="single" w:color="929292" w:sz="4" w:space="0" w:shadow="0" w:frame="0"/>
-              <w:bottom w:val="single" w:color="929292" w:sz="4" w:space="0" w:shadow="0" w:frame="0"/>
-              <w:right w:val="single" w:color="929292" w:sz="4" w:space="0" w:shadow="0" w:frame="0"/>
-            </w:tcBorders>
-            <w:shd w:val="clear" w:color="auto" w:fill="auto"/>
-            <w:tcMar>
-              <w:top w:type="dxa" w:w="80"/>
-              <w:left w:type="dxa" w:w="80"/>
-              <w:bottom w:type="dxa" w:w="80"/>
-              <w:right w:type="dxa" w:w="80"/>
-            </w:tcMar>
-            <w:vAlign w:val="top"/>
-          </w:tcPr>
-          <w:p/>
-        </w:tc>
-        <w:tc>
-          <w:tcPr>
-            <w:tcW w:type="dxa" w:w="1604"/>
+            <w:tcW w:type="dxa" w:w="2379"/>
             <w:tcBorders>
               <w:top w:val="single" w:color="929292" w:sz="4" w:space="0" w:shadow="0" w:frame="0"/>
               <w:left w:val="single" w:color="929292" w:sz="4" w:space="0" w:shadow="0" w:frame="0"/>
@@ -4802,7 +4354,7 @@
         </w:trPr>
         <w:tc>
           <w:tcPr>
-            <w:tcW w:type="dxa" w:w="1604"/>
+            <w:tcW w:type="dxa" w:w="2377"/>
             <w:tcBorders>
               <w:top w:val="single" w:color="929292" w:sz="4" w:space="0" w:shadow="0" w:frame="0"/>
               <w:left w:val="single" w:color="929292" w:sz="4" w:space="0" w:shadow="0" w:frame="0"/>
@@ -4822,7 +4374,7 @@
         </w:tc>
         <w:tc>
           <w:tcPr>
-            <w:tcW w:type="dxa" w:w="1605"/>
+            <w:tcW w:type="dxa" w:w="2379"/>
             <w:tcBorders>
               <w:top w:val="single" w:color="929292" w:sz="4" w:space="0" w:shadow="0" w:frame="0"/>
               <w:left w:val="single" w:color="929292" w:sz="4" w:space="0" w:shadow="0" w:frame="0"/>
@@ -4842,7 +4394,7 @@
         </w:tc>
         <w:tc>
           <w:tcPr>
-            <w:tcW w:type="dxa" w:w="1604"/>
+            <w:tcW w:type="dxa" w:w="2377"/>
             <w:tcBorders>
               <w:top w:val="single" w:color="929292" w:sz="4" w:space="0" w:shadow="0" w:frame="0"/>
               <w:left w:val="single" w:color="929292" w:sz="4" w:space="0" w:shadow="0" w:frame="0"/>
@@ -4862,47 +4414,7 @@
         </w:tc>
         <w:tc>
           <w:tcPr>
-            <w:tcW w:type="dxa" w:w="1605"/>
-            <w:tcBorders>
-              <w:top w:val="single" w:color="929292" w:sz="4" w:space="0" w:shadow="0" w:frame="0"/>
-              <w:left w:val="single" w:color="929292" w:sz="4" w:space="0" w:shadow="0" w:frame="0"/>
-              <w:bottom w:val="single" w:color="929292" w:sz="4" w:space="0" w:shadow="0" w:frame="0"/>
-              <w:right w:val="single" w:color="929292" w:sz="4" w:space="0" w:shadow="0" w:frame="0"/>
-            </w:tcBorders>
-            <w:shd w:val="clear" w:color="auto" w:fill="f7f7f6"/>
-            <w:tcMar>
-              <w:top w:type="dxa" w:w="80"/>
-              <w:left w:type="dxa" w:w="80"/>
-              <w:bottom w:type="dxa" w:w="80"/>
-              <w:right w:type="dxa" w:w="80"/>
-            </w:tcMar>
-            <w:vAlign w:val="top"/>
-          </w:tcPr>
-          <w:p/>
-        </w:tc>
-        <w:tc>
-          <w:tcPr>
-            <w:tcW w:type="dxa" w:w="1605"/>
-            <w:tcBorders>
-              <w:top w:val="single" w:color="929292" w:sz="4" w:space="0" w:shadow="0" w:frame="0"/>
-              <w:left w:val="single" w:color="929292" w:sz="4" w:space="0" w:shadow="0" w:frame="0"/>
-              <w:bottom w:val="single" w:color="929292" w:sz="4" w:space="0" w:shadow="0" w:frame="0"/>
-              <w:right w:val="single" w:color="929292" w:sz="4" w:space="0" w:shadow="0" w:frame="0"/>
-            </w:tcBorders>
-            <w:shd w:val="clear" w:color="auto" w:fill="f7f7f6"/>
-            <w:tcMar>
-              <w:top w:type="dxa" w:w="80"/>
-              <w:left w:type="dxa" w:w="80"/>
-              <w:bottom w:type="dxa" w:w="80"/>
-              <w:right w:type="dxa" w:w="80"/>
-            </w:tcMar>
-            <w:vAlign w:val="top"/>
-          </w:tcPr>
-          <w:p/>
-        </w:tc>
-        <w:tc>
-          <w:tcPr>
-            <w:tcW w:type="dxa" w:w="1604"/>
+            <w:tcW w:type="dxa" w:w="2379"/>
             <w:tcBorders>
               <w:top w:val="single" w:color="929292" w:sz="4" w:space="0" w:shadow="0" w:frame="0"/>
               <w:left w:val="single" w:color="929292" w:sz="4" w:space="0" w:shadow="0" w:frame="0"/>
@@ -4930,7 +4442,7 @@
         </w:trPr>
         <w:tc>
           <w:tcPr>
-            <w:tcW w:type="dxa" w:w="1604"/>
+            <w:tcW w:type="dxa" w:w="2377"/>
             <w:tcBorders>
               <w:top w:val="single" w:color="929292" w:sz="4" w:space="0" w:shadow="0" w:frame="0"/>
               <w:left w:val="single" w:color="929292" w:sz="4" w:space="0" w:shadow="0" w:frame="0"/>
@@ -4950,7 +4462,7 @@
         </w:tc>
         <w:tc>
           <w:tcPr>
-            <w:tcW w:type="dxa" w:w="1605"/>
+            <w:tcW w:type="dxa" w:w="2379"/>
             <w:tcBorders>
               <w:top w:val="single" w:color="929292" w:sz="4" w:space="0" w:shadow="0" w:frame="0"/>
               <w:left w:val="single" w:color="929292" w:sz="4" w:space="0" w:shadow="0" w:frame="0"/>
@@ -4970,7 +4482,7 @@
         </w:tc>
         <w:tc>
           <w:tcPr>
-            <w:tcW w:type="dxa" w:w="1604"/>
+            <w:tcW w:type="dxa" w:w="2377"/>
             <w:tcBorders>
               <w:top w:val="single" w:color="929292" w:sz="4" w:space="0" w:shadow="0" w:frame="0"/>
               <w:left w:val="single" w:color="929292" w:sz="4" w:space="0" w:shadow="0" w:frame="0"/>
@@ -4990,47 +4502,7 @@
         </w:tc>
         <w:tc>
           <w:tcPr>
-            <w:tcW w:type="dxa" w:w="1605"/>
-            <w:tcBorders>
-              <w:top w:val="single" w:color="929292" w:sz="4" w:space="0" w:shadow="0" w:frame="0"/>
-              <w:left w:val="single" w:color="929292" w:sz="4" w:space="0" w:shadow="0" w:frame="0"/>
-              <w:bottom w:val="single" w:color="929292" w:sz="4" w:space="0" w:shadow="0" w:frame="0"/>
-              <w:right w:val="single" w:color="929292" w:sz="4" w:space="0" w:shadow="0" w:frame="0"/>
-            </w:tcBorders>
-            <w:shd w:val="clear" w:color="auto" w:fill="auto"/>
-            <w:tcMar>
-              <w:top w:type="dxa" w:w="80"/>
-              <w:left w:type="dxa" w:w="80"/>
-              <w:bottom w:type="dxa" w:w="80"/>
-              <w:right w:type="dxa" w:w="80"/>
-            </w:tcMar>
-            <w:vAlign w:val="top"/>
-          </w:tcPr>
-          <w:p/>
-        </w:tc>
-        <w:tc>
-          <w:tcPr>
-            <w:tcW w:type="dxa" w:w="1605"/>
-            <w:tcBorders>
-              <w:top w:val="single" w:color="929292" w:sz="4" w:space="0" w:shadow="0" w:frame="0"/>
-              <w:left w:val="single" w:color="929292" w:sz="4" w:space="0" w:shadow="0" w:frame="0"/>
-              <w:bottom w:val="single" w:color="929292" w:sz="4" w:space="0" w:shadow="0" w:frame="0"/>
-              <w:right w:val="single" w:color="929292" w:sz="4" w:space="0" w:shadow="0" w:frame="0"/>
-            </w:tcBorders>
-            <w:shd w:val="clear" w:color="auto" w:fill="auto"/>
-            <w:tcMar>
-              <w:top w:type="dxa" w:w="80"/>
-              <w:left w:type="dxa" w:w="80"/>
-              <w:bottom w:type="dxa" w:w="80"/>
-              <w:right w:type="dxa" w:w="80"/>
-            </w:tcMar>
-            <w:vAlign w:val="top"/>
-          </w:tcPr>
-          <w:p/>
-        </w:tc>
-        <w:tc>
-          <w:tcPr>
-            <w:tcW w:type="dxa" w:w="1604"/>
+            <w:tcW w:type="dxa" w:w="2379"/>
             <w:tcBorders>
               <w:top w:val="single" w:color="929292" w:sz="4" w:space="0" w:shadow="0" w:frame="0"/>
               <w:left w:val="single" w:color="929292" w:sz="4" w:space="0" w:shadow="0" w:frame="0"/>
@@ -5058,7 +4530,7 @@
         </w:trPr>
         <w:tc>
           <w:tcPr>
-            <w:tcW w:type="dxa" w:w="1604"/>
+            <w:tcW w:type="dxa" w:w="2377"/>
             <w:tcBorders>
               <w:top w:val="single" w:color="929292" w:sz="4" w:space="0" w:shadow="0" w:frame="0"/>
               <w:left w:val="single" w:color="929292" w:sz="4" w:space="0" w:shadow="0" w:frame="0"/>
@@ -5078,7 +4550,7 @@
         </w:tc>
         <w:tc>
           <w:tcPr>
-            <w:tcW w:type="dxa" w:w="1605"/>
+            <w:tcW w:type="dxa" w:w="2379"/>
             <w:tcBorders>
               <w:top w:val="single" w:color="929292" w:sz="4" w:space="0" w:shadow="0" w:frame="0"/>
               <w:left w:val="single" w:color="929292" w:sz="4" w:space="0" w:shadow="0" w:frame="0"/>
@@ -5098,7 +4570,7 @@
         </w:tc>
         <w:tc>
           <w:tcPr>
-            <w:tcW w:type="dxa" w:w="1604"/>
+            <w:tcW w:type="dxa" w:w="2377"/>
             <w:tcBorders>
               <w:top w:val="single" w:color="929292" w:sz="4" w:space="0" w:shadow="0" w:frame="0"/>
               <w:left w:val="single" w:color="929292" w:sz="4" w:space="0" w:shadow="0" w:frame="0"/>
@@ -5118,47 +4590,7 @@
         </w:tc>
         <w:tc>
           <w:tcPr>
-            <w:tcW w:type="dxa" w:w="1605"/>
-            <w:tcBorders>
-              <w:top w:val="single" w:color="929292" w:sz="4" w:space="0" w:shadow="0" w:frame="0"/>
-              <w:left w:val="single" w:color="929292" w:sz="4" w:space="0" w:shadow="0" w:frame="0"/>
-              <w:bottom w:val="single" w:color="929292" w:sz="4" w:space="0" w:shadow="0" w:frame="0"/>
-              <w:right w:val="single" w:color="929292" w:sz="4" w:space="0" w:shadow="0" w:frame="0"/>
-            </w:tcBorders>
-            <w:shd w:val="clear" w:color="auto" w:fill="f7f7f6"/>
-            <w:tcMar>
-              <w:top w:type="dxa" w:w="80"/>
-              <w:left w:type="dxa" w:w="80"/>
-              <w:bottom w:type="dxa" w:w="80"/>
-              <w:right w:type="dxa" w:w="80"/>
-            </w:tcMar>
-            <w:vAlign w:val="top"/>
-          </w:tcPr>
-          <w:p/>
-        </w:tc>
-        <w:tc>
-          <w:tcPr>
-            <w:tcW w:type="dxa" w:w="1605"/>
-            <w:tcBorders>
-              <w:top w:val="single" w:color="929292" w:sz="4" w:space="0" w:shadow="0" w:frame="0"/>
-              <w:left w:val="single" w:color="929292" w:sz="4" w:space="0" w:shadow="0" w:frame="0"/>
-              <w:bottom w:val="single" w:color="929292" w:sz="4" w:space="0" w:shadow="0" w:frame="0"/>
-              <w:right w:val="single" w:color="929292" w:sz="4" w:space="0" w:shadow="0" w:frame="0"/>
-            </w:tcBorders>
-            <w:shd w:val="clear" w:color="auto" w:fill="f7f7f6"/>
-            <w:tcMar>
-              <w:top w:type="dxa" w:w="80"/>
-              <w:left w:type="dxa" w:w="80"/>
-              <w:bottom w:type="dxa" w:w="80"/>
-              <w:right w:type="dxa" w:w="80"/>
-            </w:tcMar>
-            <w:vAlign w:val="top"/>
-          </w:tcPr>
-          <w:p/>
-        </w:tc>
-        <w:tc>
-          <w:tcPr>
-            <w:tcW w:type="dxa" w:w="1604"/>
+            <w:tcW w:type="dxa" w:w="2379"/>
             <w:tcBorders>
               <w:top w:val="single" w:color="929292" w:sz="4" w:space="0" w:shadow="0" w:frame="0"/>
               <w:left w:val="single" w:color="929292" w:sz="4" w:space="0" w:shadow="0" w:frame="0"/>
@@ -5186,7 +4618,7 @@
         </w:trPr>
         <w:tc>
           <w:tcPr>
-            <w:tcW w:type="dxa" w:w="1604"/>
+            <w:tcW w:type="dxa" w:w="2377"/>
             <w:tcBorders>
               <w:top w:val="single" w:color="929292" w:sz="4" w:space="0" w:shadow="0" w:frame="0"/>
               <w:left w:val="single" w:color="929292" w:sz="4" w:space="0" w:shadow="0" w:frame="0"/>
@@ -5206,7 +4638,7 @@
         </w:tc>
         <w:tc>
           <w:tcPr>
-            <w:tcW w:type="dxa" w:w="1605"/>
+            <w:tcW w:type="dxa" w:w="2379"/>
             <w:tcBorders>
               <w:top w:val="single" w:color="929292" w:sz="4" w:space="0" w:shadow="0" w:frame="0"/>
               <w:left w:val="single" w:color="929292" w:sz="4" w:space="0" w:shadow="0" w:frame="0"/>
@@ -5226,7 +4658,7 @@
         </w:tc>
         <w:tc>
           <w:tcPr>
-            <w:tcW w:type="dxa" w:w="1604"/>
+            <w:tcW w:type="dxa" w:w="2377"/>
             <w:tcBorders>
               <w:top w:val="single" w:color="929292" w:sz="4" w:space="0" w:shadow="0" w:frame="0"/>
               <w:left w:val="single" w:color="929292" w:sz="4" w:space="0" w:shadow="0" w:frame="0"/>
@@ -5246,47 +4678,7 @@
         </w:tc>
         <w:tc>
           <w:tcPr>
-            <w:tcW w:type="dxa" w:w="1605"/>
-            <w:tcBorders>
-              <w:top w:val="single" w:color="929292" w:sz="4" w:space="0" w:shadow="0" w:frame="0"/>
-              <w:left w:val="single" w:color="929292" w:sz="4" w:space="0" w:shadow="0" w:frame="0"/>
-              <w:bottom w:val="single" w:color="929292" w:sz="4" w:space="0" w:shadow="0" w:frame="0"/>
-              <w:right w:val="single" w:color="929292" w:sz="4" w:space="0" w:shadow="0" w:frame="0"/>
-            </w:tcBorders>
-            <w:shd w:val="clear" w:color="auto" w:fill="auto"/>
-            <w:tcMar>
-              <w:top w:type="dxa" w:w="80"/>
-              <w:left w:type="dxa" w:w="80"/>
-              <w:bottom w:type="dxa" w:w="80"/>
-              <w:right w:type="dxa" w:w="80"/>
-            </w:tcMar>
-            <w:vAlign w:val="top"/>
-          </w:tcPr>
-          <w:p/>
-        </w:tc>
-        <w:tc>
-          <w:tcPr>
-            <w:tcW w:type="dxa" w:w="1605"/>
-            <w:tcBorders>
-              <w:top w:val="single" w:color="929292" w:sz="4" w:space="0" w:shadow="0" w:frame="0"/>
-              <w:left w:val="single" w:color="929292" w:sz="4" w:space="0" w:shadow="0" w:frame="0"/>
-              <w:bottom w:val="single" w:color="929292" w:sz="4" w:space="0" w:shadow="0" w:frame="0"/>
-              <w:right w:val="single" w:color="929292" w:sz="4" w:space="0" w:shadow="0" w:frame="0"/>
-            </w:tcBorders>
-            <w:shd w:val="clear" w:color="auto" w:fill="auto"/>
-            <w:tcMar>
-              <w:top w:type="dxa" w:w="80"/>
-              <w:left w:type="dxa" w:w="80"/>
-              <w:bottom w:type="dxa" w:w="80"/>
-              <w:right w:type="dxa" w:w="80"/>
-            </w:tcMar>
-            <w:vAlign w:val="top"/>
-          </w:tcPr>
-          <w:p/>
-        </w:tc>
-        <w:tc>
-          <w:tcPr>
-            <w:tcW w:type="dxa" w:w="1604"/>
+            <w:tcW w:type="dxa" w:w="2379"/>
             <w:tcBorders>
               <w:top w:val="single" w:color="929292" w:sz="4" w:space="0" w:shadow="0" w:frame="0"/>
               <w:left w:val="single" w:color="929292" w:sz="4" w:space="0" w:shadow="0" w:frame="0"/>
@@ -5314,7 +4706,7 @@
         </w:trPr>
         <w:tc>
           <w:tcPr>
-            <w:tcW w:type="dxa" w:w="1604"/>
+            <w:tcW w:type="dxa" w:w="2377"/>
             <w:tcBorders>
               <w:top w:val="single" w:color="929292" w:sz="4" w:space="0" w:shadow="0" w:frame="0"/>
               <w:left w:val="single" w:color="929292" w:sz="4" w:space="0" w:shadow="0" w:frame="0"/>
@@ -5334,7 +4726,7 @@
         </w:tc>
         <w:tc>
           <w:tcPr>
-            <w:tcW w:type="dxa" w:w="1605"/>
+            <w:tcW w:type="dxa" w:w="2379"/>
             <w:tcBorders>
               <w:top w:val="single" w:color="929292" w:sz="4" w:space="0" w:shadow="0" w:frame="0"/>
               <w:left w:val="single" w:color="929292" w:sz="4" w:space="0" w:shadow="0" w:frame="0"/>
@@ -5354,7 +4746,7 @@
         </w:tc>
         <w:tc>
           <w:tcPr>
-            <w:tcW w:type="dxa" w:w="1604"/>
+            <w:tcW w:type="dxa" w:w="2377"/>
             <w:tcBorders>
               <w:top w:val="single" w:color="929292" w:sz="4" w:space="0" w:shadow="0" w:frame="0"/>
               <w:left w:val="single" w:color="929292" w:sz="4" w:space="0" w:shadow="0" w:frame="0"/>
@@ -5374,47 +4766,7 @@
         </w:tc>
         <w:tc>
           <w:tcPr>
-            <w:tcW w:type="dxa" w:w="1605"/>
-            <w:tcBorders>
-              <w:top w:val="single" w:color="929292" w:sz="4" w:space="0" w:shadow="0" w:frame="0"/>
-              <w:left w:val="single" w:color="929292" w:sz="4" w:space="0" w:shadow="0" w:frame="0"/>
-              <w:bottom w:val="single" w:color="929292" w:sz="4" w:space="0" w:shadow="0" w:frame="0"/>
-              <w:right w:val="single" w:color="929292" w:sz="4" w:space="0" w:shadow="0" w:frame="0"/>
-            </w:tcBorders>
-            <w:shd w:val="clear" w:color="auto" w:fill="f7f7f6"/>
-            <w:tcMar>
-              <w:top w:type="dxa" w:w="80"/>
-              <w:left w:type="dxa" w:w="80"/>
-              <w:bottom w:type="dxa" w:w="80"/>
-              <w:right w:type="dxa" w:w="80"/>
-            </w:tcMar>
-            <w:vAlign w:val="top"/>
-          </w:tcPr>
-          <w:p/>
-        </w:tc>
-        <w:tc>
-          <w:tcPr>
-            <w:tcW w:type="dxa" w:w="1605"/>
-            <w:tcBorders>
-              <w:top w:val="single" w:color="929292" w:sz="4" w:space="0" w:shadow="0" w:frame="0"/>
-              <w:left w:val="single" w:color="929292" w:sz="4" w:space="0" w:shadow="0" w:frame="0"/>
-              <w:bottom w:val="single" w:color="929292" w:sz="4" w:space="0" w:shadow="0" w:frame="0"/>
-              <w:right w:val="single" w:color="929292" w:sz="4" w:space="0" w:shadow="0" w:frame="0"/>
-            </w:tcBorders>
-            <w:shd w:val="clear" w:color="auto" w:fill="f7f7f6"/>
-            <w:tcMar>
-              <w:top w:type="dxa" w:w="80"/>
-              <w:left w:type="dxa" w:w="80"/>
-              <w:bottom w:type="dxa" w:w="80"/>
-              <w:right w:type="dxa" w:w="80"/>
-            </w:tcMar>
-            <w:vAlign w:val="top"/>
-          </w:tcPr>
-          <w:p/>
-        </w:tc>
-        <w:tc>
-          <w:tcPr>
-            <w:tcW w:type="dxa" w:w="1604"/>
+            <w:tcW w:type="dxa" w:w="2379"/>
             <w:tcBorders>
               <w:top w:val="single" w:color="929292" w:sz="4" w:space="0" w:shadow="0" w:frame="0"/>
               <w:left w:val="single" w:color="929292" w:sz="4" w:space="0" w:shadow="0" w:frame="0"/>
@@ -5442,7 +4794,7 @@
         </w:trPr>
         <w:tc>
           <w:tcPr>
-            <w:tcW w:type="dxa" w:w="1604"/>
+            <w:tcW w:type="dxa" w:w="2377"/>
             <w:tcBorders>
               <w:top w:val="single" w:color="929292" w:sz="4" w:space="0" w:shadow="0" w:frame="0"/>
               <w:left w:val="single" w:color="929292" w:sz="4" w:space="0" w:shadow="0" w:frame="0"/>
@@ -5462,7 +4814,7 @@
         </w:tc>
         <w:tc>
           <w:tcPr>
-            <w:tcW w:type="dxa" w:w="1605"/>
+            <w:tcW w:type="dxa" w:w="2379"/>
             <w:tcBorders>
               <w:top w:val="single" w:color="929292" w:sz="4" w:space="0" w:shadow="0" w:frame="0"/>
               <w:left w:val="single" w:color="929292" w:sz="4" w:space="0" w:shadow="0" w:frame="0"/>
@@ -5482,7 +4834,7 @@
         </w:tc>
         <w:tc>
           <w:tcPr>
-            <w:tcW w:type="dxa" w:w="1604"/>
+            <w:tcW w:type="dxa" w:w="2377"/>
             <w:tcBorders>
               <w:top w:val="single" w:color="929292" w:sz="4" w:space="0" w:shadow="0" w:frame="0"/>
               <w:left w:val="single" w:color="929292" w:sz="4" w:space="0" w:shadow="0" w:frame="0"/>
@@ -5502,47 +4854,7 @@
         </w:tc>
         <w:tc>
           <w:tcPr>
-            <w:tcW w:type="dxa" w:w="1605"/>
-            <w:tcBorders>
-              <w:top w:val="single" w:color="929292" w:sz="4" w:space="0" w:shadow="0" w:frame="0"/>
-              <w:left w:val="single" w:color="929292" w:sz="4" w:space="0" w:shadow="0" w:frame="0"/>
-              <w:bottom w:val="single" w:color="929292" w:sz="4" w:space="0" w:shadow="0" w:frame="0"/>
-              <w:right w:val="single" w:color="929292" w:sz="4" w:space="0" w:shadow="0" w:frame="0"/>
-            </w:tcBorders>
-            <w:shd w:val="clear" w:color="auto" w:fill="auto"/>
-            <w:tcMar>
-              <w:top w:type="dxa" w:w="80"/>
-              <w:left w:type="dxa" w:w="80"/>
-              <w:bottom w:type="dxa" w:w="80"/>
-              <w:right w:type="dxa" w:w="80"/>
-            </w:tcMar>
-            <w:vAlign w:val="top"/>
-          </w:tcPr>
-          <w:p/>
-        </w:tc>
-        <w:tc>
-          <w:tcPr>
-            <w:tcW w:type="dxa" w:w="1605"/>
-            <w:tcBorders>
-              <w:top w:val="single" w:color="929292" w:sz="4" w:space="0" w:shadow="0" w:frame="0"/>
-              <w:left w:val="single" w:color="929292" w:sz="4" w:space="0" w:shadow="0" w:frame="0"/>
-              <w:bottom w:val="single" w:color="929292" w:sz="4" w:space="0" w:shadow="0" w:frame="0"/>
-              <w:right w:val="single" w:color="929292" w:sz="4" w:space="0" w:shadow="0" w:frame="0"/>
-            </w:tcBorders>
-            <w:shd w:val="clear" w:color="auto" w:fill="auto"/>
-            <w:tcMar>
-              <w:top w:type="dxa" w:w="80"/>
-              <w:left w:type="dxa" w:w="80"/>
-              <w:bottom w:type="dxa" w:w="80"/>
-              <w:right w:type="dxa" w:w="80"/>
-            </w:tcMar>
-            <w:vAlign w:val="top"/>
-          </w:tcPr>
-          <w:p/>
-        </w:tc>
-        <w:tc>
-          <w:tcPr>
-            <w:tcW w:type="dxa" w:w="1604"/>
+            <w:tcW w:type="dxa" w:w="2379"/>
             <w:tcBorders>
               <w:top w:val="single" w:color="929292" w:sz="4" w:space="0" w:shadow="0" w:frame="0"/>
               <w:left w:val="single" w:color="929292" w:sz="4" w:space="0" w:shadow="0" w:frame="0"/>
@@ -5570,7 +4882,7 @@
         </w:trPr>
         <w:tc>
           <w:tcPr>
-            <w:tcW w:type="dxa" w:w="1604"/>
+            <w:tcW w:type="dxa" w:w="2377"/>
             <w:tcBorders>
               <w:top w:val="single" w:color="929292" w:sz="4" w:space="0" w:shadow="0" w:frame="0"/>
               <w:left w:val="single" w:color="929292" w:sz="4" w:space="0" w:shadow="0" w:frame="0"/>
@@ -5590,7 +4902,7 @@
         </w:tc>
         <w:tc>
           <w:tcPr>
-            <w:tcW w:type="dxa" w:w="1605"/>
+            <w:tcW w:type="dxa" w:w="2379"/>
             <w:tcBorders>
               <w:top w:val="single" w:color="929292" w:sz="4" w:space="0" w:shadow="0" w:frame="0"/>
               <w:left w:val="single" w:color="929292" w:sz="4" w:space="0" w:shadow="0" w:frame="0"/>
@@ -5610,7 +4922,7 @@
         </w:tc>
         <w:tc>
           <w:tcPr>
-            <w:tcW w:type="dxa" w:w="1604"/>
+            <w:tcW w:type="dxa" w:w="2377"/>
             <w:tcBorders>
               <w:top w:val="single" w:color="929292" w:sz="4" w:space="0" w:shadow="0" w:frame="0"/>
               <w:left w:val="single" w:color="929292" w:sz="4" w:space="0" w:shadow="0" w:frame="0"/>
@@ -5630,47 +4942,7 @@
         </w:tc>
         <w:tc>
           <w:tcPr>
-            <w:tcW w:type="dxa" w:w="1605"/>
-            <w:tcBorders>
-              <w:top w:val="single" w:color="929292" w:sz="4" w:space="0" w:shadow="0" w:frame="0"/>
-              <w:left w:val="single" w:color="929292" w:sz="4" w:space="0" w:shadow="0" w:frame="0"/>
-              <w:bottom w:val="single" w:color="929292" w:sz="4" w:space="0" w:shadow="0" w:frame="0"/>
-              <w:right w:val="single" w:color="929292" w:sz="4" w:space="0" w:shadow="0" w:frame="0"/>
-            </w:tcBorders>
-            <w:shd w:val="clear" w:color="auto" w:fill="f7f7f6"/>
-            <w:tcMar>
-              <w:top w:type="dxa" w:w="80"/>
-              <w:left w:type="dxa" w:w="80"/>
-              <w:bottom w:type="dxa" w:w="80"/>
-              <w:right w:type="dxa" w:w="80"/>
-            </w:tcMar>
-            <w:vAlign w:val="top"/>
-          </w:tcPr>
-          <w:p/>
-        </w:tc>
-        <w:tc>
-          <w:tcPr>
-            <w:tcW w:type="dxa" w:w="1605"/>
-            <w:tcBorders>
-              <w:top w:val="single" w:color="929292" w:sz="4" w:space="0" w:shadow="0" w:frame="0"/>
-              <w:left w:val="single" w:color="929292" w:sz="4" w:space="0" w:shadow="0" w:frame="0"/>
-              <w:bottom w:val="single" w:color="929292" w:sz="4" w:space="0" w:shadow="0" w:frame="0"/>
-              <w:right w:val="single" w:color="929292" w:sz="4" w:space="0" w:shadow="0" w:frame="0"/>
-            </w:tcBorders>
-            <w:shd w:val="clear" w:color="auto" w:fill="f7f7f6"/>
-            <w:tcMar>
-              <w:top w:type="dxa" w:w="80"/>
-              <w:left w:type="dxa" w:w="80"/>
-              <w:bottom w:type="dxa" w:w="80"/>
-              <w:right w:type="dxa" w:w="80"/>
-            </w:tcMar>
-            <w:vAlign w:val="top"/>
-          </w:tcPr>
-          <w:p/>
-        </w:tc>
-        <w:tc>
-          <w:tcPr>
-            <w:tcW w:type="dxa" w:w="1604"/>
+            <w:tcW w:type="dxa" w:w="2379"/>
             <w:tcBorders>
               <w:top w:val="single" w:color="929292" w:sz="4" w:space="0" w:shadow="0" w:frame="0"/>
               <w:left w:val="single" w:color="929292" w:sz="4" w:space="0" w:shadow="0" w:frame="0"/>
@@ -5698,7 +4970,7 @@
         </w:trPr>
         <w:tc>
           <w:tcPr>
-            <w:tcW w:type="dxa" w:w="1604"/>
+            <w:tcW w:type="dxa" w:w="2377"/>
             <w:tcBorders>
               <w:top w:val="single" w:color="929292" w:sz="4" w:space="0" w:shadow="0" w:frame="0"/>
               <w:left w:val="single" w:color="929292" w:sz="4" w:space="0" w:shadow="0" w:frame="0"/>
@@ -5718,7 +4990,7 @@
         </w:tc>
         <w:tc>
           <w:tcPr>
-            <w:tcW w:type="dxa" w:w="1605"/>
+            <w:tcW w:type="dxa" w:w="2379"/>
             <w:tcBorders>
               <w:top w:val="single" w:color="929292" w:sz="4" w:space="0" w:shadow="0" w:frame="0"/>
               <w:left w:val="single" w:color="929292" w:sz="4" w:space="0" w:shadow="0" w:frame="0"/>
@@ -5738,7 +5010,7 @@
         </w:tc>
         <w:tc>
           <w:tcPr>
-            <w:tcW w:type="dxa" w:w="1604"/>
+            <w:tcW w:type="dxa" w:w="2377"/>
             <w:tcBorders>
               <w:top w:val="single" w:color="929292" w:sz="4" w:space="0" w:shadow="0" w:frame="0"/>
               <w:left w:val="single" w:color="929292" w:sz="4" w:space="0" w:shadow="0" w:frame="0"/>
@@ -5758,47 +5030,7 @@
         </w:tc>
         <w:tc>
           <w:tcPr>
-            <w:tcW w:type="dxa" w:w="1605"/>
-            <w:tcBorders>
-              <w:top w:val="single" w:color="929292" w:sz="4" w:space="0" w:shadow="0" w:frame="0"/>
-              <w:left w:val="single" w:color="929292" w:sz="4" w:space="0" w:shadow="0" w:frame="0"/>
-              <w:bottom w:val="single" w:color="929292" w:sz="4" w:space="0" w:shadow="0" w:frame="0"/>
-              <w:right w:val="single" w:color="929292" w:sz="4" w:space="0" w:shadow="0" w:frame="0"/>
-            </w:tcBorders>
-            <w:shd w:val="clear" w:color="auto" w:fill="auto"/>
-            <w:tcMar>
-              <w:top w:type="dxa" w:w="80"/>
-              <w:left w:type="dxa" w:w="80"/>
-              <w:bottom w:type="dxa" w:w="80"/>
-              <w:right w:type="dxa" w:w="80"/>
-            </w:tcMar>
-            <w:vAlign w:val="top"/>
-          </w:tcPr>
-          <w:p/>
-        </w:tc>
-        <w:tc>
-          <w:tcPr>
-            <w:tcW w:type="dxa" w:w="1605"/>
-            <w:tcBorders>
-              <w:top w:val="single" w:color="929292" w:sz="4" w:space="0" w:shadow="0" w:frame="0"/>
-              <w:left w:val="single" w:color="929292" w:sz="4" w:space="0" w:shadow="0" w:frame="0"/>
-              <w:bottom w:val="single" w:color="929292" w:sz="4" w:space="0" w:shadow="0" w:frame="0"/>
-              <w:right w:val="single" w:color="929292" w:sz="4" w:space="0" w:shadow="0" w:frame="0"/>
-            </w:tcBorders>
-            <w:shd w:val="clear" w:color="auto" w:fill="auto"/>
-            <w:tcMar>
-              <w:top w:type="dxa" w:w="80"/>
-              <w:left w:type="dxa" w:w="80"/>
-              <w:bottom w:type="dxa" w:w="80"/>
-              <w:right w:type="dxa" w:w="80"/>
-            </w:tcMar>
-            <w:vAlign w:val="top"/>
-          </w:tcPr>
-          <w:p/>
-        </w:tc>
-        <w:tc>
-          <w:tcPr>
-            <w:tcW w:type="dxa" w:w="1604"/>
+            <w:tcW w:type="dxa" w:w="2379"/>
             <w:tcBorders>
               <w:top w:val="single" w:color="929292" w:sz="4" w:space="0" w:shadow="0" w:frame="0"/>
               <w:left w:val="single" w:color="929292" w:sz="4" w:space="0" w:shadow="0" w:frame="0"/>
@@ -5826,7 +5058,7 @@
         </w:trPr>
         <w:tc>
           <w:tcPr>
-            <w:tcW w:type="dxa" w:w="1604"/>
+            <w:tcW w:type="dxa" w:w="2377"/>
             <w:tcBorders>
               <w:top w:val="single" w:color="929292" w:sz="4" w:space="0" w:shadow="0" w:frame="0"/>
               <w:left w:val="single" w:color="929292" w:sz="4" w:space="0" w:shadow="0" w:frame="0"/>
@@ -5846,7 +5078,7 @@
         </w:tc>
         <w:tc>
           <w:tcPr>
-            <w:tcW w:type="dxa" w:w="1605"/>
+            <w:tcW w:type="dxa" w:w="2379"/>
             <w:tcBorders>
               <w:top w:val="single" w:color="929292" w:sz="4" w:space="0" w:shadow="0" w:frame="0"/>
               <w:left w:val="single" w:color="929292" w:sz="4" w:space="0" w:shadow="0" w:frame="0"/>
@@ -5866,7 +5098,7 @@
         </w:tc>
         <w:tc>
           <w:tcPr>
-            <w:tcW w:type="dxa" w:w="1604"/>
+            <w:tcW w:type="dxa" w:w="2377"/>
             <w:tcBorders>
               <w:top w:val="single" w:color="929292" w:sz="4" w:space="0" w:shadow="0" w:frame="0"/>
               <w:left w:val="single" w:color="929292" w:sz="4" w:space="0" w:shadow="0" w:frame="0"/>
@@ -5886,47 +5118,7 @@
         </w:tc>
         <w:tc>
           <w:tcPr>
-            <w:tcW w:type="dxa" w:w="1605"/>
-            <w:tcBorders>
-              <w:top w:val="single" w:color="929292" w:sz="4" w:space="0" w:shadow="0" w:frame="0"/>
-              <w:left w:val="single" w:color="929292" w:sz="4" w:space="0" w:shadow="0" w:frame="0"/>
-              <w:bottom w:val="single" w:color="929292" w:sz="4" w:space="0" w:shadow="0" w:frame="0"/>
-              <w:right w:val="single" w:color="929292" w:sz="4" w:space="0" w:shadow="0" w:frame="0"/>
-            </w:tcBorders>
-            <w:shd w:val="clear" w:color="auto" w:fill="f7f7f6"/>
-            <w:tcMar>
-              <w:top w:type="dxa" w:w="80"/>
-              <w:left w:type="dxa" w:w="80"/>
-              <w:bottom w:type="dxa" w:w="80"/>
-              <w:right w:type="dxa" w:w="80"/>
-            </w:tcMar>
-            <w:vAlign w:val="top"/>
-          </w:tcPr>
-          <w:p/>
-        </w:tc>
-        <w:tc>
-          <w:tcPr>
-            <w:tcW w:type="dxa" w:w="1605"/>
-            <w:tcBorders>
-              <w:top w:val="single" w:color="929292" w:sz="4" w:space="0" w:shadow="0" w:frame="0"/>
-              <w:left w:val="single" w:color="929292" w:sz="4" w:space="0" w:shadow="0" w:frame="0"/>
-              <w:bottom w:val="single" w:color="929292" w:sz="4" w:space="0" w:shadow="0" w:frame="0"/>
-              <w:right w:val="single" w:color="929292" w:sz="4" w:space="0" w:shadow="0" w:frame="0"/>
-            </w:tcBorders>
-            <w:shd w:val="clear" w:color="auto" w:fill="f7f7f6"/>
-            <w:tcMar>
-              <w:top w:type="dxa" w:w="80"/>
-              <w:left w:type="dxa" w:w="80"/>
-              <w:bottom w:type="dxa" w:w="80"/>
-              <w:right w:type="dxa" w:w="80"/>
-            </w:tcMar>
-            <w:vAlign w:val="top"/>
-          </w:tcPr>
-          <w:p/>
-        </w:tc>
-        <w:tc>
-          <w:tcPr>
-            <w:tcW w:type="dxa" w:w="1604"/>
+            <w:tcW w:type="dxa" w:w="2379"/>
             <w:tcBorders>
               <w:top w:val="single" w:color="929292" w:sz="4" w:space="0" w:shadow="0" w:frame="0"/>
               <w:left w:val="single" w:color="929292" w:sz="4" w:space="0" w:shadow="0" w:frame="0"/>
@@ -5954,7 +5146,7 @@
         </w:trPr>
         <w:tc>
           <w:tcPr>
-            <w:tcW w:type="dxa" w:w="1604"/>
+            <w:tcW w:type="dxa" w:w="2377"/>
             <w:tcBorders>
               <w:top w:val="single" w:color="929292" w:sz="4" w:space="0" w:shadow="0" w:frame="0"/>
               <w:left w:val="single" w:color="929292" w:sz="4" w:space="0" w:shadow="0" w:frame="0"/>
@@ -5974,7 +5166,7 @@
         </w:tc>
         <w:tc>
           <w:tcPr>
-            <w:tcW w:type="dxa" w:w="1605"/>
+            <w:tcW w:type="dxa" w:w="2379"/>
             <w:tcBorders>
               <w:top w:val="single" w:color="929292" w:sz="4" w:space="0" w:shadow="0" w:frame="0"/>
               <w:left w:val="single" w:color="929292" w:sz="4" w:space="0" w:shadow="0" w:frame="0"/>
@@ -5994,7 +5186,7 @@
         </w:tc>
         <w:tc>
           <w:tcPr>
-            <w:tcW w:type="dxa" w:w="1604"/>
+            <w:tcW w:type="dxa" w:w="2377"/>
             <w:tcBorders>
               <w:top w:val="single" w:color="929292" w:sz="4" w:space="0" w:shadow="0" w:frame="0"/>
               <w:left w:val="single" w:color="929292" w:sz="4" w:space="0" w:shadow="0" w:frame="0"/>
@@ -6014,47 +5206,7 @@
         </w:tc>
         <w:tc>
           <w:tcPr>
-            <w:tcW w:type="dxa" w:w="1605"/>
-            <w:tcBorders>
-              <w:top w:val="single" w:color="929292" w:sz="4" w:space="0" w:shadow="0" w:frame="0"/>
-              <w:left w:val="single" w:color="929292" w:sz="4" w:space="0" w:shadow="0" w:frame="0"/>
-              <w:bottom w:val="single" w:color="929292" w:sz="4" w:space="0" w:shadow="0" w:frame="0"/>
-              <w:right w:val="single" w:color="929292" w:sz="4" w:space="0" w:shadow="0" w:frame="0"/>
-            </w:tcBorders>
-            <w:shd w:val="clear" w:color="auto" w:fill="auto"/>
-            <w:tcMar>
-              <w:top w:type="dxa" w:w="80"/>
-              <w:left w:type="dxa" w:w="80"/>
-              <w:bottom w:type="dxa" w:w="80"/>
-              <w:right w:type="dxa" w:w="80"/>
-            </w:tcMar>
-            <w:vAlign w:val="top"/>
-          </w:tcPr>
-          <w:p/>
-        </w:tc>
-        <w:tc>
-          <w:tcPr>
-            <w:tcW w:type="dxa" w:w="1605"/>
-            <w:tcBorders>
-              <w:top w:val="single" w:color="929292" w:sz="4" w:space="0" w:shadow="0" w:frame="0"/>
-              <w:left w:val="single" w:color="929292" w:sz="4" w:space="0" w:shadow="0" w:frame="0"/>
-              <w:bottom w:val="single" w:color="929292" w:sz="4" w:space="0" w:shadow="0" w:frame="0"/>
-              <w:right w:val="single" w:color="929292" w:sz="4" w:space="0" w:shadow="0" w:frame="0"/>
-            </w:tcBorders>
-            <w:shd w:val="clear" w:color="auto" w:fill="auto"/>
-            <w:tcMar>
-              <w:top w:type="dxa" w:w="80"/>
-              <w:left w:type="dxa" w:w="80"/>
-              <w:bottom w:type="dxa" w:w="80"/>
-              <w:right w:type="dxa" w:w="80"/>
-            </w:tcMar>
-            <w:vAlign w:val="top"/>
-          </w:tcPr>
-          <w:p/>
-        </w:tc>
-        <w:tc>
-          <w:tcPr>
-            <w:tcW w:type="dxa" w:w="1604"/>
+            <w:tcW w:type="dxa" w:w="2379"/>
             <w:tcBorders>
               <w:top w:val="single" w:color="929292" w:sz="4" w:space="0" w:shadow="0" w:frame="0"/>
               <w:left w:val="single" w:color="929292" w:sz="4" w:space="0" w:shadow="0" w:frame="0"/>
@@ -6082,7 +5234,7 @@
         </w:trPr>
         <w:tc>
           <w:tcPr>
-            <w:tcW w:type="dxa" w:w="1604"/>
+            <w:tcW w:type="dxa" w:w="2377"/>
             <w:tcBorders>
               <w:top w:val="single" w:color="929292" w:sz="4" w:space="0" w:shadow="0" w:frame="0"/>
               <w:left w:val="single" w:color="929292" w:sz="4" w:space="0" w:shadow="0" w:frame="0"/>
@@ -6102,7 +5254,7 @@
         </w:tc>
         <w:tc>
           <w:tcPr>
-            <w:tcW w:type="dxa" w:w="1605"/>
+            <w:tcW w:type="dxa" w:w="2379"/>
             <w:tcBorders>
               <w:top w:val="single" w:color="929292" w:sz="4" w:space="0" w:shadow="0" w:frame="0"/>
               <w:left w:val="single" w:color="929292" w:sz="4" w:space="0" w:shadow="0" w:frame="0"/>
@@ -6122,7 +5274,7 @@
         </w:tc>
         <w:tc>
           <w:tcPr>
-            <w:tcW w:type="dxa" w:w="1604"/>
+            <w:tcW w:type="dxa" w:w="2377"/>
             <w:tcBorders>
               <w:top w:val="single" w:color="929292" w:sz="4" w:space="0" w:shadow="0" w:frame="0"/>
               <w:left w:val="single" w:color="929292" w:sz="4" w:space="0" w:shadow="0" w:frame="0"/>
@@ -6142,47 +5294,7 @@
         </w:tc>
         <w:tc>
           <w:tcPr>
-            <w:tcW w:type="dxa" w:w="1605"/>
-            <w:tcBorders>
-              <w:top w:val="single" w:color="929292" w:sz="4" w:space="0" w:shadow="0" w:frame="0"/>
-              <w:left w:val="single" w:color="929292" w:sz="4" w:space="0" w:shadow="0" w:frame="0"/>
-              <w:bottom w:val="single" w:color="929292" w:sz="4" w:space="0" w:shadow="0" w:frame="0"/>
-              <w:right w:val="single" w:color="929292" w:sz="4" w:space="0" w:shadow="0" w:frame="0"/>
-            </w:tcBorders>
-            <w:shd w:val="clear" w:color="auto" w:fill="f7f7f6"/>
-            <w:tcMar>
-              <w:top w:type="dxa" w:w="80"/>
-              <w:left w:type="dxa" w:w="80"/>
-              <w:bottom w:type="dxa" w:w="80"/>
-              <w:right w:type="dxa" w:w="80"/>
-            </w:tcMar>
-            <w:vAlign w:val="top"/>
-          </w:tcPr>
-          <w:p/>
-        </w:tc>
-        <w:tc>
-          <w:tcPr>
-            <w:tcW w:type="dxa" w:w="1605"/>
-            <w:tcBorders>
-              <w:top w:val="single" w:color="929292" w:sz="4" w:space="0" w:shadow="0" w:frame="0"/>
-              <w:left w:val="single" w:color="929292" w:sz="4" w:space="0" w:shadow="0" w:frame="0"/>
-              <w:bottom w:val="single" w:color="929292" w:sz="4" w:space="0" w:shadow="0" w:frame="0"/>
-              <w:right w:val="single" w:color="929292" w:sz="4" w:space="0" w:shadow="0" w:frame="0"/>
-            </w:tcBorders>
-            <w:shd w:val="clear" w:color="auto" w:fill="f7f7f6"/>
-            <w:tcMar>
-              <w:top w:type="dxa" w:w="80"/>
-              <w:left w:type="dxa" w:w="80"/>
-              <w:bottom w:type="dxa" w:w="80"/>
-              <w:right w:type="dxa" w:w="80"/>
-            </w:tcMar>
-            <w:vAlign w:val="top"/>
-          </w:tcPr>
-          <w:p/>
-        </w:tc>
-        <w:tc>
-          <w:tcPr>
-            <w:tcW w:type="dxa" w:w="1604"/>
+            <w:tcW w:type="dxa" w:w="2379"/>
             <w:tcBorders>
               <w:top w:val="single" w:color="929292" w:sz="4" w:space="0" w:shadow="0" w:frame="0"/>
               <w:left w:val="single" w:color="929292" w:sz="4" w:space="0" w:shadow="0" w:frame="0"/>
@@ -6210,7 +5322,7 @@
         </w:trPr>
         <w:tc>
           <w:tcPr>
-            <w:tcW w:type="dxa" w:w="1604"/>
+            <w:tcW w:type="dxa" w:w="2377"/>
             <w:tcBorders>
               <w:top w:val="single" w:color="929292" w:sz="4" w:space="0" w:shadow="0" w:frame="0"/>
               <w:left w:val="single" w:color="929292" w:sz="4" w:space="0" w:shadow="0" w:frame="0"/>
@@ -6230,7 +5342,7 @@
         </w:tc>
         <w:tc>
           <w:tcPr>
-            <w:tcW w:type="dxa" w:w="1605"/>
+            <w:tcW w:type="dxa" w:w="2379"/>
             <w:tcBorders>
               <w:top w:val="single" w:color="929292" w:sz="4" w:space="0" w:shadow="0" w:frame="0"/>
               <w:left w:val="single" w:color="929292" w:sz="4" w:space="0" w:shadow="0" w:frame="0"/>
@@ -6250,7 +5362,7 @@
         </w:tc>
         <w:tc>
           <w:tcPr>
-            <w:tcW w:type="dxa" w:w="1604"/>
+            <w:tcW w:type="dxa" w:w="2377"/>
             <w:tcBorders>
               <w:top w:val="single" w:color="929292" w:sz="4" w:space="0" w:shadow="0" w:frame="0"/>
               <w:left w:val="single" w:color="929292" w:sz="4" w:space="0" w:shadow="0" w:frame="0"/>
@@ -6270,47 +5382,7 @@
         </w:tc>
         <w:tc>
           <w:tcPr>
-            <w:tcW w:type="dxa" w:w="1605"/>
-            <w:tcBorders>
-              <w:top w:val="single" w:color="929292" w:sz="4" w:space="0" w:shadow="0" w:frame="0"/>
-              <w:left w:val="single" w:color="929292" w:sz="4" w:space="0" w:shadow="0" w:frame="0"/>
-              <w:bottom w:val="single" w:color="929292" w:sz="4" w:space="0" w:shadow="0" w:frame="0"/>
-              <w:right w:val="single" w:color="929292" w:sz="4" w:space="0" w:shadow="0" w:frame="0"/>
-            </w:tcBorders>
-            <w:shd w:val="clear" w:color="auto" w:fill="auto"/>
-            <w:tcMar>
-              <w:top w:type="dxa" w:w="80"/>
-              <w:left w:type="dxa" w:w="80"/>
-              <w:bottom w:type="dxa" w:w="80"/>
-              <w:right w:type="dxa" w:w="80"/>
-            </w:tcMar>
-            <w:vAlign w:val="top"/>
-          </w:tcPr>
-          <w:p/>
-        </w:tc>
-        <w:tc>
-          <w:tcPr>
-            <w:tcW w:type="dxa" w:w="1605"/>
-            <w:tcBorders>
-              <w:top w:val="single" w:color="929292" w:sz="4" w:space="0" w:shadow="0" w:frame="0"/>
-              <w:left w:val="single" w:color="929292" w:sz="4" w:space="0" w:shadow="0" w:frame="0"/>
-              <w:bottom w:val="single" w:color="929292" w:sz="4" w:space="0" w:shadow="0" w:frame="0"/>
-              <w:right w:val="single" w:color="929292" w:sz="4" w:space="0" w:shadow="0" w:frame="0"/>
-            </w:tcBorders>
-            <w:shd w:val="clear" w:color="auto" w:fill="auto"/>
-            <w:tcMar>
-              <w:top w:type="dxa" w:w="80"/>
-              <w:left w:type="dxa" w:w="80"/>
-              <w:bottom w:type="dxa" w:w="80"/>
-              <w:right w:type="dxa" w:w="80"/>
-            </w:tcMar>
-            <w:vAlign w:val="top"/>
-          </w:tcPr>
-          <w:p/>
-        </w:tc>
-        <w:tc>
-          <w:tcPr>
-            <w:tcW w:type="dxa" w:w="1604"/>
+            <w:tcW w:type="dxa" w:w="2379"/>
             <w:tcBorders>
               <w:top w:val="single" w:color="929292" w:sz="4" w:space="0" w:shadow="0" w:frame="0"/>
               <w:left w:val="single" w:color="929292" w:sz="4" w:space="0" w:shadow="0" w:frame="0"/>
@@ -6338,7 +5410,7 @@
         </w:trPr>
         <w:tc>
           <w:tcPr>
-            <w:tcW w:type="dxa" w:w="1604"/>
+            <w:tcW w:type="dxa" w:w="2377"/>
             <w:tcBorders>
               <w:top w:val="single" w:color="929292" w:sz="4" w:space="0" w:shadow="0" w:frame="0"/>
               <w:left w:val="single" w:color="929292" w:sz="4" w:space="0" w:shadow="0" w:frame="0"/>
@@ -6358,7 +5430,7 @@
         </w:tc>
         <w:tc>
           <w:tcPr>
-            <w:tcW w:type="dxa" w:w="1605"/>
+            <w:tcW w:type="dxa" w:w="2379"/>
             <w:tcBorders>
               <w:top w:val="single" w:color="929292" w:sz="4" w:space="0" w:shadow="0" w:frame="0"/>
               <w:left w:val="single" w:color="929292" w:sz="4" w:space="0" w:shadow="0" w:frame="0"/>
@@ -6378,7 +5450,7 @@
         </w:tc>
         <w:tc>
           <w:tcPr>
-            <w:tcW w:type="dxa" w:w="1604"/>
+            <w:tcW w:type="dxa" w:w="2377"/>
             <w:tcBorders>
               <w:top w:val="single" w:color="929292" w:sz="4" w:space="0" w:shadow="0" w:frame="0"/>
               <w:left w:val="single" w:color="929292" w:sz="4" w:space="0" w:shadow="0" w:frame="0"/>
@@ -6398,47 +5470,7 @@
         </w:tc>
         <w:tc>
           <w:tcPr>
-            <w:tcW w:type="dxa" w:w="1605"/>
-            <w:tcBorders>
-              <w:top w:val="single" w:color="929292" w:sz="4" w:space="0" w:shadow="0" w:frame="0"/>
-              <w:left w:val="single" w:color="929292" w:sz="4" w:space="0" w:shadow="0" w:frame="0"/>
-              <w:bottom w:val="single" w:color="929292" w:sz="4" w:space="0" w:shadow="0" w:frame="0"/>
-              <w:right w:val="single" w:color="929292" w:sz="4" w:space="0" w:shadow="0" w:frame="0"/>
-            </w:tcBorders>
-            <w:shd w:val="clear" w:color="auto" w:fill="f7f7f6"/>
-            <w:tcMar>
-              <w:top w:type="dxa" w:w="80"/>
-              <w:left w:type="dxa" w:w="80"/>
-              <w:bottom w:type="dxa" w:w="80"/>
-              <w:right w:type="dxa" w:w="80"/>
-            </w:tcMar>
-            <w:vAlign w:val="top"/>
-          </w:tcPr>
-          <w:p/>
-        </w:tc>
-        <w:tc>
-          <w:tcPr>
-            <w:tcW w:type="dxa" w:w="1605"/>
-            <w:tcBorders>
-              <w:top w:val="single" w:color="929292" w:sz="4" w:space="0" w:shadow="0" w:frame="0"/>
-              <w:left w:val="single" w:color="929292" w:sz="4" w:space="0" w:shadow="0" w:frame="0"/>
-              <w:bottom w:val="single" w:color="929292" w:sz="4" w:space="0" w:shadow="0" w:frame="0"/>
-              <w:right w:val="single" w:color="929292" w:sz="4" w:space="0" w:shadow="0" w:frame="0"/>
-            </w:tcBorders>
-            <w:shd w:val="clear" w:color="auto" w:fill="f7f7f6"/>
-            <w:tcMar>
-              <w:top w:type="dxa" w:w="80"/>
-              <w:left w:type="dxa" w:w="80"/>
-              <w:bottom w:type="dxa" w:w="80"/>
-              <w:right w:type="dxa" w:w="80"/>
-            </w:tcMar>
-            <w:vAlign w:val="top"/>
-          </w:tcPr>
-          <w:p/>
-        </w:tc>
-        <w:tc>
-          <w:tcPr>
-            <w:tcW w:type="dxa" w:w="1604"/>
+            <w:tcW w:type="dxa" w:w="2379"/>
             <w:tcBorders>
               <w:top w:val="single" w:color="929292" w:sz="4" w:space="0" w:shadow="0" w:frame="0"/>
               <w:left w:val="single" w:color="929292" w:sz="4" w:space="0" w:shadow="0" w:frame="0"/>
@@ -6466,7 +5498,7 @@
         </w:trPr>
         <w:tc>
           <w:tcPr>
-            <w:tcW w:type="dxa" w:w="1604"/>
+            <w:tcW w:type="dxa" w:w="2377"/>
             <w:tcBorders>
               <w:top w:val="single" w:color="929292" w:sz="4" w:space="0" w:shadow="0" w:frame="0"/>
               <w:left w:val="single" w:color="929292" w:sz="4" w:space="0" w:shadow="0" w:frame="0"/>
@@ -6486,7 +5518,7 @@
         </w:tc>
         <w:tc>
           <w:tcPr>
-            <w:tcW w:type="dxa" w:w="1605"/>
+            <w:tcW w:type="dxa" w:w="2379"/>
             <w:tcBorders>
               <w:top w:val="single" w:color="929292" w:sz="4" w:space="0" w:shadow="0" w:frame="0"/>
               <w:left w:val="single" w:color="929292" w:sz="4" w:space="0" w:shadow="0" w:frame="0"/>
@@ -6506,7 +5538,7 @@
         </w:tc>
         <w:tc>
           <w:tcPr>
-            <w:tcW w:type="dxa" w:w="1604"/>
+            <w:tcW w:type="dxa" w:w="2377"/>
             <w:tcBorders>
               <w:top w:val="single" w:color="929292" w:sz="4" w:space="0" w:shadow="0" w:frame="0"/>
               <w:left w:val="single" w:color="929292" w:sz="4" w:space="0" w:shadow="0" w:frame="0"/>
@@ -6526,47 +5558,7 @@
         </w:tc>
         <w:tc>
           <w:tcPr>
-            <w:tcW w:type="dxa" w:w="1605"/>
-            <w:tcBorders>
-              <w:top w:val="single" w:color="929292" w:sz="4" w:space="0" w:shadow="0" w:frame="0"/>
-              <w:left w:val="single" w:color="929292" w:sz="4" w:space="0" w:shadow="0" w:frame="0"/>
-              <w:bottom w:val="single" w:color="929292" w:sz="4" w:space="0" w:shadow="0" w:frame="0"/>
-              <w:right w:val="single" w:color="929292" w:sz="4" w:space="0" w:shadow="0" w:frame="0"/>
-            </w:tcBorders>
-            <w:shd w:val="clear" w:color="auto" w:fill="auto"/>
-            <w:tcMar>
-              <w:top w:type="dxa" w:w="80"/>
-              <w:left w:type="dxa" w:w="80"/>
-              <w:bottom w:type="dxa" w:w="80"/>
-              <w:right w:type="dxa" w:w="80"/>
-            </w:tcMar>
-            <w:vAlign w:val="top"/>
-          </w:tcPr>
-          <w:p/>
-        </w:tc>
-        <w:tc>
-          <w:tcPr>
-            <w:tcW w:type="dxa" w:w="1605"/>
-            <w:tcBorders>
-              <w:top w:val="single" w:color="929292" w:sz="4" w:space="0" w:shadow="0" w:frame="0"/>
-              <w:left w:val="single" w:color="929292" w:sz="4" w:space="0" w:shadow="0" w:frame="0"/>
-              <w:bottom w:val="single" w:color="929292" w:sz="4" w:space="0" w:shadow="0" w:frame="0"/>
-              <w:right w:val="single" w:color="929292" w:sz="4" w:space="0" w:shadow="0" w:frame="0"/>
-            </w:tcBorders>
-            <w:shd w:val="clear" w:color="auto" w:fill="auto"/>
-            <w:tcMar>
-              <w:top w:type="dxa" w:w="80"/>
-              <w:left w:type="dxa" w:w="80"/>
-              <w:bottom w:type="dxa" w:w="80"/>
-              <w:right w:type="dxa" w:w="80"/>
-            </w:tcMar>
-            <w:vAlign w:val="top"/>
-          </w:tcPr>
-          <w:p/>
-        </w:tc>
-        <w:tc>
-          <w:tcPr>
-            <w:tcW w:type="dxa" w:w="1604"/>
+            <w:tcW w:type="dxa" w:w="2379"/>
             <w:tcBorders>
               <w:top w:val="single" w:color="929292" w:sz="4" w:space="0" w:shadow="0" w:frame="0"/>
               <w:left w:val="single" w:color="929292" w:sz="4" w:space="0" w:shadow="0" w:frame="0"/>
@@ -6594,7 +5586,7 @@
         </w:trPr>
         <w:tc>
           <w:tcPr>
-            <w:tcW w:type="dxa" w:w="1604"/>
+            <w:tcW w:type="dxa" w:w="2377"/>
             <w:tcBorders>
               <w:top w:val="single" w:color="929292" w:sz="4" w:space="0" w:shadow="0" w:frame="0"/>
               <w:left w:val="single" w:color="929292" w:sz="4" w:space="0" w:shadow="0" w:frame="0"/>
@@ -6614,7 +5606,7 @@
         </w:tc>
         <w:tc>
           <w:tcPr>
-            <w:tcW w:type="dxa" w:w="1605"/>
+            <w:tcW w:type="dxa" w:w="2379"/>
             <w:tcBorders>
               <w:top w:val="single" w:color="929292" w:sz="4" w:space="0" w:shadow="0" w:frame="0"/>
               <w:left w:val="single" w:color="929292" w:sz="4" w:space="0" w:shadow="0" w:frame="0"/>
@@ -6634,7 +5626,7 @@
         </w:tc>
         <w:tc>
           <w:tcPr>
-            <w:tcW w:type="dxa" w:w="1604"/>
+            <w:tcW w:type="dxa" w:w="2377"/>
             <w:tcBorders>
               <w:top w:val="single" w:color="929292" w:sz="4" w:space="0" w:shadow="0" w:frame="0"/>
               <w:left w:val="single" w:color="929292" w:sz="4" w:space="0" w:shadow="0" w:frame="0"/>
@@ -6654,47 +5646,7 @@
         </w:tc>
         <w:tc>
           <w:tcPr>
-            <w:tcW w:type="dxa" w:w="1605"/>
-            <w:tcBorders>
-              <w:top w:val="single" w:color="929292" w:sz="4" w:space="0" w:shadow="0" w:frame="0"/>
-              <w:left w:val="single" w:color="929292" w:sz="4" w:space="0" w:shadow="0" w:frame="0"/>
-              <w:bottom w:val="single" w:color="929292" w:sz="4" w:space="0" w:shadow="0" w:frame="0"/>
-              <w:right w:val="single" w:color="929292" w:sz="4" w:space="0" w:shadow="0" w:frame="0"/>
-            </w:tcBorders>
-            <w:shd w:val="clear" w:color="auto" w:fill="f7f7f6"/>
-            <w:tcMar>
-              <w:top w:type="dxa" w:w="80"/>
-              <w:left w:type="dxa" w:w="80"/>
-              <w:bottom w:type="dxa" w:w="80"/>
-              <w:right w:type="dxa" w:w="80"/>
-            </w:tcMar>
-            <w:vAlign w:val="top"/>
-          </w:tcPr>
-          <w:p/>
-        </w:tc>
-        <w:tc>
-          <w:tcPr>
-            <w:tcW w:type="dxa" w:w="1605"/>
-            <w:tcBorders>
-              <w:top w:val="single" w:color="929292" w:sz="4" w:space="0" w:shadow="0" w:frame="0"/>
-              <w:left w:val="single" w:color="929292" w:sz="4" w:space="0" w:shadow="0" w:frame="0"/>
-              <w:bottom w:val="single" w:color="929292" w:sz="4" w:space="0" w:shadow="0" w:frame="0"/>
-              <w:right w:val="single" w:color="929292" w:sz="4" w:space="0" w:shadow="0" w:frame="0"/>
-            </w:tcBorders>
-            <w:shd w:val="clear" w:color="auto" w:fill="f7f7f6"/>
-            <w:tcMar>
-              <w:top w:type="dxa" w:w="80"/>
-              <w:left w:type="dxa" w:w="80"/>
-              <w:bottom w:type="dxa" w:w="80"/>
-              <w:right w:type="dxa" w:w="80"/>
-            </w:tcMar>
-            <w:vAlign w:val="top"/>
-          </w:tcPr>
-          <w:p/>
-        </w:tc>
-        <w:tc>
-          <w:tcPr>
-            <w:tcW w:type="dxa" w:w="1604"/>
+            <w:tcW w:type="dxa" w:w="2379"/>
             <w:tcBorders>
               <w:top w:val="single" w:color="929292" w:sz="4" w:space="0" w:shadow="0" w:frame="0"/>
               <w:left w:val="single" w:color="929292" w:sz="4" w:space="0" w:shadow="0" w:frame="0"/>
@@ -6722,7 +5674,7 @@
         </w:trPr>
         <w:tc>
           <w:tcPr>
-            <w:tcW w:type="dxa" w:w="1604"/>
+            <w:tcW w:type="dxa" w:w="2377"/>
             <w:tcBorders>
               <w:top w:val="single" w:color="929292" w:sz="4" w:space="0" w:shadow="0" w:frame="0"/>
               <w:left w:val="single" w:color="929292" w:sz="4" w:space="0" w:shadow="0" w:frame="0"/>
@@ -6742,7 +5694,7 @@
         </w:tc>
         <w:tc>
           <w:tcPr>
-            <w:tcW w:type="dxa" w:w="1605"/>
+            <w:tcW w:type="dxa" w:w="2379"/>
             <w:tcBorders>
               <w:top w:val="single" w:color="929292" w:sz="4" w:space="0" w:shadow="0" w:frame="0"/>
               <w:left w:val="single" w:color="929292" w:sz="4" w:space="0" w:shadow="0" w:frame="0"/>
@@ -6762,7 +5714,7 @@
         </w:tc>
         <w:tc>
           <w:tcPr>
-            <w:tcW w:type="dxa" w:w="1604"/>
+            <w:tcW w:type="dxa" w:w="2377"/>
             <w:tcBorders>
               <w:top w:val="single" w:color="929292" w:sz="4" w:space="0" w:shadow="0" w:frame="0"/>
               <w:left w:val="single" w:color="929292" w:sz="4" w:space="0" w:shadow="0" w:frame="0"/>
@@ -6782,47 +5734,7 @@
         </w:tc>
         <w:tc>
           <w:tcPr>
-            <w:tcW w:type="dxa" w:w="1605"/>
-            <w:tcBorders>
-              <w:top w:val="single" w:color="929292" w:sz="4" w:space="0" w:shadow="0" w:frame="0"/>
-              <w:left w:val="single" w:color="929292" w:sz="4" w:space="0" w:shadow="0" w:frame="0"/>
-              <w:bottom w:val="single" w:color="929292" w:sz="4" w:space="0" w:shadow="0" w:frame="0"/>
-              <w:right w:val="single" w:color="929292" w:sz="4" w:space="0" w:shadow="0" w:frame="0"/>
-            </w:tcBorders>
-            <w:shd w:val="clear" w:color="auto" w:fill="auto"/>
-            <w:tcMar>
-              <w:top w:type="dxa" w:w="80"/>
-              <w:left w:type="dxa" w:w="80"/>
-              <w:bottom w:type="dxa" w:w="80"/>
-              <w:right w:type="dxa" w:w="80"/>
-            </w:tcMar>
-            <w:vAlign w:val="top"/>
-          </w:tcPr>
-          <w:p/>
-        </w:tc>
-        <w:tc>
-          <w:tcPr>
-            <w:tcW w:type="dxa" w:w="1605"/>
-            <w:tcBorders>
-              <w:top w:val="single" w:color="929292" w:sz="4" w:space="0" w:shadow="0" w:frame="0"/>
-              <w:left w:val="single" w:color="929292" w:sz="4" w:space="0" w:shadow="0" w:frame="0"/>
-              <w:bottom w:val="single" w:color="929292" w:sz="4" w:space="0" w:shadow="0" w:frame="0"/>
-              <w:right w:val="single" w:color="929292" w:sz="4" w:space="0" w:shadow="0" w:frame="0"/>
-            </w:tcBorders>
-            <w:shd w:val="clear" w:color="auto" w:fill="auto"/>
-            <w:tcMar>
-              <w:top w:type="dxa" w:w="80"/>
-              <w:left w:type="dxa" w:w="80"/>
-              <w:bottom w:type="dxa" w:w="80"/>
-              <w:right w:type="dxa" w:w="80"/>
-            </w:tcMar>
-            <w:vAlign w:val="top"/>
-          </w:tcPr>
-          <w:p/>
-        </w:tc>
-        <w:tc>
-          <w:tcPr>
-            <w:tcW w:type="dxa" w:w="1604"/>
+            <w:tcW w:type="dxa" w:w="2379"/>
             <w:tcBorders>
               <w:top w:val="single" w:color="929292" w:sz="4" w:space="0" w:shadow="0" w:frame="0"/>
               <w:left w:val="single" w:color="929292" w:sz="4" w:space="0" w:shadow="0" w:frame="0"/>
@@ -6850,7 +5762,7 @@
         </w:trPr>
         <w:tc>
           <w:tcPr>
-            <w:tcW w:type="dxa" w:w="1604"/>
+            <w:tcW w:type="dxa" w:w="2377"/>
             <w:tcBorders>
               <w:top w:val="single" w:color="929292" w:sz="4" w:space="0" w:shadow="0" w:frame="0"/>
               <w:left w:val="single" w:color="929292" w:sz="4" w:space="0" w:shadow="0" w:frame="0"/>
@@ -6870,7 +5782,7 @@
         </w:tc>
         <w:tc>
           <w:tcPr>
-            <w:tcW w:type="dxa" w:w="1605"/>
+            <w:tcW w:type="dxa" w:w="2379"/>
             <w:tcBorders>
               <w:top w:val="single" w:color="929292" w:sz="4" w:space="0" w:shadow="0" w:frame="0"/>
               <w:left w:val="single" w:color="929292" w:sz="4" w:space="0" w:shadow="0" w:frame="0"/>
@@ -6890,7 +5802,7 @@
         </w:tc>
         <w:tc>
           <w:tcPr>
-            <w:tcW w:type="dxa" w:w="1604"/>
+            <w:tcW w:type="dxa" w:w="2377"/>
             <w:tcBorders>
               <w:top w:val="single" w:color="929292" w:sz="4" w:space="0" w:shadow="0" w:frame="0"/>
               <w:left w:val="single" w:color="929292" w:sz="4" w:space="0" w:shadow="0" w:frame="0"/>
@@ -6910,47 +5822,7 @@
         </w:tc>
         <w:tc>
           <w:tcPr>
-            <w:tcW w:type="dxa" w:w="1605"/>
-            <w:tcBorders>
-              <w:top w:val="single" w:color="929292" w:sz="4" w:space="0" w:shadow="0" w:frame="0"/>
-              <w:left w:val="single" w:color="929292" w:sz="4" w:space="0" w:shadow="0" w:frame="0"/>
-              <w:bottom w:val="single" w:color="929292" w:sz="4" w:space="0" w:shadow="0" w:frame="0"/>
-              <w:right w:val="single" w:color="929292" w:sz="4" w:space="0" w:shadow="0" w:frame="0"/>
-            </w:tcBorders>
-            <w:shd w:val="clear" w:color="auto" w:fill="f7f7f6"/>
-            <w:tcMar>
-              <w:top w:type="dxa" w:w="80"/>
-              <w:left w:type="dxa" w:w="80"/>
-              <w:bottom w:type="dxa" w:w="80"/>
-              <w:right w:type="dxa" w:w="80"/>
-            </w:tcMar>
-            <w:vAlign w:val="top"/>
-          </w:tcPr>
-          <w:p/>
-        </w:tc>
-        <w:tc>
-          <w:tcPr>
-            <w:tcW w:type="dxa" w:w="1605"/>
-            <w:tcBorders>
-              <w:top w:val="single" w:color="929292" w:sz="4" w:space="0" w:shadow="0" w:frame="0"/>
-              <w:left w:val="single" w:color="929292" w:sz="4" w:space="0" w:shadow="0" w:frame="0"/>
-              <w:bottom w:val="single" w:color="929292" w:sz="4" w:space="0" w:shadow="0" w:frame="0"/>
-              <w:right w:val="single" w:color="929292" w:sz="4" w:space="0" w:shadow="0" w:frame="0"/>
-            </w:tcBorders>
-            <w:shd w:val="clear" w:color="auto" w:fill="f7f7f6"/>
-            <w:tcMar>
-              <w:top w:type="dxa" w:w="80"/>
-              <w:left w:type="dxa" w:w="80"/>
-              <w:bottom w:type="dxa" w:w="80"/>
-              <w:right w:type="dxa" w:w="80"/>
-            </w:tcMar>
-            <w:vAlign w:val="top"/>
-          </w:tcPr>
-          <w:p/>
-        </w:tc>
-        <w:tc>
-          <w:tcPr>
-            <w:tcW w:type="dxa" w:w="1604"/>
+            <w:tcW w:type="dxa" w:w="2379"/>
             <w:tcBorders>
               <w:top w:val="single" w:color="929292" w:sz="4" w:space="0" w:shadow="0" w:frame="0"/>
               <w:left w:val="single" w:color="929292" w:sz="4" w:space="0" w:shadow="0" w:frame="0"/>
@@ -6978,7 +5850,7 @@
         </w:trPr>
         <w:tc>
           <w:tcPr>
-            <w:tcW w:type="dxa" w:w="1604"/>
+            <w:tcW w:type="dxa" w:w="2377"/>
             <w:tcBorders>
               <w:top w:val="single" w:color="929292" w:sz="4" w:space="0" w:shadow="0" w:frame="0"/>
               <w:left w:val="single" w:color="929292" w:sz="4" w:space="0" w:shadow="0" w:frame="0"/>
@@ -6998,7 +5870,7 @@
         </w:tc>
         <w:tc>
           <w:tcPr>
-            <w:tcW w:type="dxa" w:w="1605"/>
+            <w:tcW w:type="dxa" w:w="2379"/>
             <w:tcBorders>
               <w:top w:val="single" w:color="929292" w:sz="4" w:space="0" w:shadow="0" w:frame="0"/>
               <w:left w:val="single" w:color="929292" w:sz="4" w:space="0" w:shadow="0" w:frame="0"/>
@@ -7018,7 +5890,7 @@
         </w:tc>
         <w:tc>
           <w:tcPr>
-            <w:tcW w:type="dxa" w:w="1604"/>
+            <w:tcW w:type="dxa" w:w="2377"/>
             <w:tcBorders>
               <w:top w:val="single" w:color="929292" w:sz="4" w:space="0" w:shadow="0" w:frame="0"/>
               <w:left w:val="single" w:color="929292" w:sz="4" w:space="0" w:shadow="0" w:frame="0"/>
@@ -7038,47 +5910,7 @@
         </w:tc>
         <w:tc>
           <w:tcPr>
-            <w:tcW w:type="dxa" w:w="1605"/>
-            <w:tcBorders>
-              <w:top w:val="single" w:color="929292" w:sz="4" w:space="0" w:shadow="0" w:frame="0"/>
-              <w:left w:val="single" w:color="929292" w:sz="4" w:space="0" w:shadow="0" w:frame="0"/>
-              <w:bottom w:val="single" w:color="929292" w:sz="4" w:space="0" w:shadow="0" w:frame="0"/>
-              <w:right w:val="single" w:color="929292" w:sz="4" w:space="0" w:shadow="0" w:frame="0"/>
-            </w:tcBorders>
-            <w:shd w:val="clear" w:color="auto" w:fill="auto"/>
-            <w:tcMar>
-              <w:top w:type="dxa" w:w="80"/>
-              <w:left w:type="dxa" w:w="80"/>
-              <w:bottom w:type="dxa" w:w="80"/>
-              <w:right w:type="dxa" w:w="80"/>
-            </w:tcMar>
-            <w:vAlign w:val="top"/>
-          </w:tcPr>
-          <w:p/>
-        </w:tc>
-        <w:tc>
-          <w:tcPr>
-            <w:tcW w:type="dxa" w:w="1605"/>
-            <w:tcBorders>
-              <w:top w:val="single" w:color="929292" w:sz="4" w:space="0" w:shadow="0" w:frame="0"/>
-              <w:left w:val="single" w:color="929292" w:sz="4" w:space="0" w:shadow="0" w:frame="0"/>
-              <w:bottom w:val="single" w:color="929292" w:sz="4" w:space="0" w:shadow="0" w:frame="0"/>
-              <w:right w:val="single" w:color="929292" w:sz="4" w:space="0" w:shadow="0" w:frame="0"/>
-            </w:tcBorders>
-            <w:shd w:val="clear" w:color="auto" w:fill="auto"/>
-            <w:tcMar>
-              <w:top w:type="dxa" w:w="80"/>
-              <w:left w:type="dxa" w:w="80"/>
-              <w:bottom w:type="dxa" w:w="80"/>
-              <w:right w:type="dxa" w:w="80"/>
-            </w:tcMar>
-            <w:vAlign w:val="top"/>
-          </w:tcPr>
-          <w:p/>
-        </w:tc>
-        <w:tc>
-          <w:tcPr>
-            <w:tcW w:type="dxa" w:w="1604"/>
+            <w:tcW w:type="dxa" w:w="2379"/>
             <w:tcBorders>
               <w:top w:val="single" w:color="929292" w:sz="4" w:space="0" w:shadow="0" w:frame="0"/>
               <w:left w:val="single" w:color="929292" w:sz="4" w:space="0" w:shadow="0" w:frame="0"/>
@@ -7106,7 +5938,7 @@
         </w:trPr>
         <w:tc>
           <w:tcPr>
-            <w:tcW w:type="dxa" w:w="1604"/>
+            <w:tcW w:type="dxa" w:w="2377"/>
             <w:tcBorders>
               <w:top w:val="single" w:color="929292" w:sz="4" w:space="0" w:shadow="0" w:frame="0"/>
               <w:left w:val="single" w:color="929292" w:sz="4" w:space="0" w:shadow="0" w:frame="0"/>
@@ -7126,7 +5958,7 @@
         </w:tc>
         <w:tc>
           <w:tcPr>
-            <w:tcW w:type="dxa" w:w="1605"/>
+            <w:tcW w:type="dxa" w:w="2379"/>
             <w:tcBorders>
               <w:top w:val="single" w:color="929292" w:sz="4" w:space="0" w:shadow="0" w:frame="0"/>
               <w:left w:val="single" w:color="929292" w:sz="4" w:space="0" w:shadow="0" w:frame="0"/>
@@ -7146,7 +5978,7 @@
         </w:tc>
         <w:tc>
           <w:tcPr>
-            <w:tcW w:type="dxa" w:w="1604"/>
+            <w:tcW w:type="dxa" w:w="2377"/>
             <w:tcBorders>
               <w:top w:val="single" w:color="929292" w:sz="4" w:space="0" w:shadow="0" w:frame="0"/>
               <w:left w:val="single" w:color="929292" w:sz="4" w:space="0" w:shadow="0" w:frame="0"/>
@@ -7166,47 +5998,7 @@
         </w:tc>
         <w:tc>
           <w:tcPr>
-            <w:tcW w:type="dxa" w:w="1605"/>
-            <w:tcBorders>
-              <w:top w:val="single" w:color="929292" w:sz="4" w:space="0" w:shadow="0" w:frame="0"/>
-              <w:left w:val="single" w:color="929292" w:sz="4" w:space="0" w:shadow="0" w:frame="0"/>
-              <w:bottom w:val="single" w:color="929292" w:sz="4" w:space="0" w:shadow="0" w:frame="0"/>
-              <w:right w:val="single" w:color="929292" w:sz="4" w:space="0" w:shadow="0" w:frame="0"/>
-            </w:tcBorders>
-            <w:shd w:val="clear" w:color="auto" w:fill="f7f7f6"/>
-            <w:tcMar>
-              <w:top w:type="dxa" w:w="80"/>
-              <w:left w:type="dxa" w:w="80"/>
-              <w:bottom w:type="dxa" w:w="80"/>
-              <w:right w:type="dxa" w:w="80"/>
-            </w:tcMar>
-            <w:vAlign w:val="top"/>
-          </w:tcPr>
-          <w:p/>
-        </w:tc>
-        <w:tc>
-          <w:tcPr>
-            <w:tcW w:type="dxa" w:w="1605"/>
-            <w:tcBorders>
-              <w:top w:val="single" w:color="929292" w:sz="4" w:space="0" w:shadow="0" w:frame="0"/>
-              <w:left w:val="single" w:color="929292" w:sz="4" w:space="0" w:shadow="0" w:frame="0"/>
-              <w:bottom w:val="single" w:color="929292" w:sz="4" w:space="0" w:shadow="0" w:frame="0"/>
-              <w:right w:val="single" w:color="929292" w:sz="4" w:space="0" w:shadow="0" w:frame="0"/>
-            </w:tcBorders>
-            <w:shd w:val="clear" w:color="auto" w:fill="f7f7f6"/>
-            <w:tcMar>
-              <w:top w:type="dxa" w:w="80"/>
-              <w:left w:type="dxa" w:w="80"/>
-              <w:bottom w:type="dxa" w:w="80"/>
-              <w:right w:type="dxa" w:w="80"/>
-            </w:tcMar>
-            <w:vAlign w:val="top"/>
-          </w:tcPr>
-          <w:p/>
-        </w:tc>
-        <w:tc>
-          <w:tcPr>
-            <w:tcW w:type="dxa" w:w="1604"/>
+            <w:tcW w:type="dxa" w:w="2379"/>
             <w:tcBorders>
               <w:top w:val="single" w:color="929292" w:sz="4" w:space="0" w:shadow="0" w:frame="0"/>
               <w:left w:val="single" w:color="929292" w:sz="4" w:space="0" w:shadow="0" w:frame="0"/>
@@ -7234,7 +6026,7 @@
         </w:trPr>
         <w:tc>
           <w:tcPr>
-            <w:tcW w:type="dxa" w:w="1604"/>
+            <w:tcW w:type="dxa" w:w="2377"/>
             <w:tcBorders>
               <w:top w:val="single" w:color="929292" w:sz="4" w:space="0" w:shadow="0" w:frame="0"/>
               <w:left w:val="single" w:color="929292" w:sz="4" w:space="0" w:shadow="0" w:frame="0"/>
@@ -7254,7 +6046,7 @@
         </w:tc>
         <w:tc>
           <w:tcPr>
-            <w:tcW w:type="dxa" w:w="1605"/>
+            <w:tcW w:type="dxa" w:w="2379"/>
             <w:tcBorders>
               <w:top w:val="single" w:color="929292" w:sz="4" w:space="0" w:shadow="0" w:frame="0"/>
               <w:left w:val="single" w:color="929292" w:sz="4" w:space="0" w:shadow="0" w:frame="0"/>
@@ -7274,7 +6066,7 @@
         </w:tc>
         <w:tc>
           <w:tcPr>
-            <w:tcW w:type="dxa" w:w="1604"/>
+            <w:tcW w:type="dxa" w:w="2377"/>
             <w:tcBorders>
               <w:top w:val="single" w:color="929292" w:sz="4" w:space="0" w:shadow="0" w:frame="0"/>
               <w:left w:val="single" w:color="929292" w:sz="4" w:space="0" w:shadow="0" w:frame="0"/>
@@ -7294,47 +6086,7 @@
         </w:tc>
         <w:tc>
           <w:tcPr>
-            <w:tcW w:type="dxa" w:w="1605"/>
-            <w:tcBorders>
-              <w:top w:val="single" w:color="929292" w:sz="4" w:space="0" w:shadow="0" w:frame="0"/>
-              <w:left w:val="single" w:color="929292" w:sz="4" w:space="0" w:shadow="0" w:frame="0"/>
-              <w:bottom w:val="single" w:color="929292" w:sz="4" w:space="0" w:shadow="0" w:frame="0"/>
-              <w:right w:val="single" w:color="929292" w:sz="4" w:space="0" w:shadow="0" w:frame="0"/>
-            </w:tcBorders>
-            <w:shd w:val="clear" w:color="auto" w:fill="auto"/>
-            <w:tcMar>
-              <w:top w:type="dxa" w:w="80"/>
-              <w:left w:type="dxa" w:w="80"/>
-              <w:bottom w:type="dxa" w:w="80"/>
-              <w:right w:type="dxa" w:w="80"/>
-            </w:tcMar>
-            <w:vAlign w:val="top"/>
-          </w:tcPr>
-          <w:p/>
-        </w:tc>
-        <w:tc>
-          <w:tcPr>
-            <w:tcW w:type="dxa" w:w="1605"/>
-            <w:tcBorders>
-              <w:top w:val="single" w:color="929292" w:sz="4" w:space="0" w:shadow="0" w:frame="0"/>
-              <w:left w:val="single" w:color="929292" w:sz="4" w:space="0" w:shadow="0" w:frame="0"/>
-              <w:bottom w:val="single" w:color="929292" w:sz="4" w:space="0" w:shadow="0" w:frame="0"/>
-              <w:right w:val="single" w:color="929292" w:sz="4" w:space="0" w:shadow="0" w:frame="0"/>
-            </w:tcBorders>
-            <w:shd w:val="clear" w:color="auto" w:fill="auto"/>
-            <w:tcMar>
-              <w:top w:type="dxa" w:w="80"/>
-              <w:left w:type="dxa" w:w="80"/>
-              <w:bottom w:type="dxa" w:w="80"/>
-              <w:right w:type="dxa" w:w="80"/>
-            </w:tcMar>
-            <w:vAlign w:val="top"/>
-          </w:tcPr>
-          <w:p/>
-        </w:tc>
-        <w:tc>
-          <w:tcPr>
-            <w:tcW w:type="dxa" w:w="1604"/>
+            <w:tcW w:type="dxa" w:w="2379"/>
             <w:tcBorders>
               <w:top w:val="single" w:color="929292" w:sz="4" w:space="0" w:shadow="0" w:frame="0"/>
               <w:left w:val="single" w:color="929292" w:sz="4" w:space="0" w:shadow="0" w:frame="0"/>
@@ -7362,7 +6114,7 @@
         </w:trPr>
         <w:tc>
           <w:tcPr>
-            <w:tcW w:type="dxa" w:w="1604"/>
+            <w:tcW w:type="dxa" w:w="2377"/>
             <w:tcBorders>
               <w:top w:val="single" w:color="929292" w:sz="4" w:space="0" w:shadow="0" w:frame="0"/>
               <w:left w:val="single" w:color="929292" w:sz="4" w:space="0" w:shadow="0" w:frame="0"/>
@@ -7382,7 +6134,7 @@
         </w:tc>
         <w:tc>
           <w:tcPr>
-            <w:tcW w:type="dxa" w:w="1605"/>
+            <w:tcW w:type="dxa" w:w="2379"/>
             <w:tcBorders>
               <w:top w:val="single" w:color="929292" w:sz="4" w:space="0" w:shadow="0" w:frame="0"/>
               <w:left w:val="single" w:color="929292" w:sz="4" w:space="0" w:shadow="0" w:frame="0"/>
@@ -7402,7 +6154,7 @@
         </w:tc>
         <w:tc>
           <w:tcPr>
-            <w:tcW w:type="dxa" w:w="1604"/>
+            <w:tcW w:type="dxa" w:w="2377"/>
             <w:tcBorders>
               <w:top w:val="single" w:color="929292" w:sz="4" w:space="0" w:shadow="0" w:frame="0"/>
               <w:left w:val="single" w:color="929292" w:sz="4" w:space="0" w:shadow="0" w:frame="0"/>
@@ -7422,47 +6174,7 @@
         </w:tc>
         <w:tc>
           <w:tcPr>
-            <w:tcW w:type="dxa" w:w="1605"/>
-            <w:tcBorders>
-              <w:top w:val="single" w:color="929292" w:sz="4" w:space="0" w:shadow="0" w:frame="0"/>
-              <w:left w:val="single" w:color="929292" w:sz="4" w:space="0" w:shadow="0" w:frame="0"/>
-              <w:bottom w:val="single" w:color="929292" w:sz="4" w:space="0" w:shadow="0" w:frame="0"/>
-              <w:right w:val="single" w:color="929292" w:sz="4" w:space="0" w:shadow="0" w:frame="0"/>
-            </w:tcBorders>
-            <w:shd w:val="clear" w:color="auto" w:fill="f7f7f6"/>
-            <w:tcMar>
-              <w:top w:type="dxa" w:w="80"/>
-              <w:left w:type="dxa" w:w="80"/>
-              <w:bottom w:type="dxa" w:w="80"/>
-              <w:right w:type="dxa" w:w="80"/>
-            </w:tcMar>
-            <w:vAlign w:val="top"/>
-          </w:tcPr>
-          <w:p/>
-        </w:tc>
-        <w:tc>
-          <w:tcPr>
-            <w:tcW w:type="dxa" w:w="1605"/>
-            <w:tcBorders>
-              <w:top w:val="single" w:color="929292" w:sz="4" w:space="0" w:shadow="0" w:frame="0"/>
-              <w:left w:val="single" w:color="929292" w:sz="4" w:space="0" w:shadow="0" w:frame="0"/>
-              <w:bottom w:val="single" w:color="929292" w:sz="4" w:space="0" w:shadow="0" w:frame="0"/>
-              <w:right w:val="single" w:color="929292" w:sz="4" w:space="0" w:shadow="0" w:frame="0"/>
-            </w:tcBorders>
-            <w:shd w:val="clear" w:color="auto" w:fill="f7f7f6"/>
-            <w:tcMar>
-              <w:top w:type="dxa" w:w="80"/>
-              <w:left w:type="dxa" w:w="80"/>
-              <w:bottom w:type="dxa" w:w="80"/>
-              <w:right w:type="dxa" w:w="80"/>
-            </w:tcMar>
-            <w:vAlign w:val="top"/>
-          </w:tcPr>
-          <w:p/>
-        </w:tc>
-        <w:tc>
-          <w:tcPr>
-            <w:tcW w:type="dxa" w:w="1604"/>
+            <w:tcW w:type="dxa" w:w="2379"/>
             <w:tcBorders>
               <w:top w:val="single" w:color="929292" w:sz="4" w:space="0" w:shadow="0" w:frame="0"/>
               <w:left w:val="single" w:color="929292" w:sz="4" w:space="0" w:shadow="0" w:frame="0"/>
@@ -7490,7 +6202,7 @@
         </w:trPr>
         <w:tc>
           <w:tcPr>
-            <w:tcW w:type="dxa" w:w="1604"/>
+            <w:tcW w:type="dxa" w:w="2377"/>
             <w:tcBorders>
               <w:top w:val="single" w:color="929292" w:sz="4" w:space="0" w:shadow="0" w:frame="0"/>
               <w:left w:val="single" w:color="929292" w:sz="4" w:space="0" w:shadow="0" w:frame="0"/>
@@ -7510,7 +6222,7 @@
         </w:tc>
         <w:tc>
           <w:tcPr>
-            <w:tcW w:type="dxa" w:w="1605"/>
+            <w:tcW w:type="dxa" w:w="2379"/>
             <w:tcBorders>
               <w:top w:val="single" w:color="929292" w:sz="4" w:space="0" w:shadow="0" w:frame="0"/>
               <w:left w:val="single" w:color="929292" w:sz="4" w:space="0" w:shadow="0" w:frame="0"/>
@@ -7530,7 +6242,7 @@
         </w:tc>
         <w:tc>
           <w:tcPr>
-            <w:tcW w:type="dxa" w:w="1604"/>
+            <w:tcW w:type="dxa" w:w="2377"/>
             <w:tcBorders>
               <w:top w:val="single" w:color="929292" w:sz="4" w:space="0" w:shadow="0" w:frame="0"/>
               <w:left w:val="single" w:color="929292" w:sz="4" w:space="0" w:shadow="0" w:frame="0"/>
@@ -7550,47 +6262,7 @@
         </w:tc>
         <w:tc>
           <w:tcPr>
-            <w:tcW w:type="dxa" w:w="1605"/>
-            <w:tcBorders>
-              <w:top w:val="single" w:color="929292" w:sz="4" w:space="0" w:shadow="0" w:frame="0"/>
-              <w:left w:val="single" w:color="929292" w:sz="4" w:space="0" w:shadow="0" w:frame="0"/>
-              <w:bottom w:val="single" w:color="929292" w:sz="4" w:space="0" w:shadow="0" w:frame="0"/>
-              <w:right w:val="single" w:color="929292" w:sz="4" w:space="0" w:shadow="0" w:frame="0"/>
-            </w:tcBorders>
-            <w:shd w:val="clear" w:color="auto" w:fill="auto"/>
-            <w:tcMar>
-              <w:top w:type="dxa" w:w="80"/>
-              <w:left w:type="dxa" w:w="80"/>
-              <w:bottom w:type="dxa" w:w="80"/>
-              <w:right w:type="dxa" w:w="80"/>
-            </w:tcMar>
-            <w:vAlign w:val="top"/>
-          </w:tcPr>
-          <w:p/>
-        </w:tc>
-        <w:tc>
-          <w:tcPr>
-            <w:tcW w:type="dxa" w:w="1605"/>
-            <w:tcBorders>
-              <w:top w:val="single" w:color="929292" w:sz="4" w:space="0" w:shadow="0" w:frame="0"/>
-              <w:left w:val="single" w:color="929292" w:sz="4" w:space="0" w:shadow="0" w:frame="0"/>
-              <w:bottom w:val="single" w:color="929292" w:sz="4" w:space="0" w:shadow="0" w:frame="0"/>
-              <w:right w:val="single" w:color="929292" w:sz="4" w:space="0" w:shadow="0" w:frame="0"/>
-            </w:tcBorders>
-            <w:shd w:val="clear" w:color="auto" w:fill="auto"/>
-            <w:tcMar>
-              <w:top w:type="dxa" w:w="80"/>
-              <w:left w:type="dxa" w:w="80"/>
-              <w:bottom w:type="dxa" w:w="80"/>
-              <w:right w:type="dxa" w:w="80"/>
-            </w:tcMar>
-            <w:vAlign w:val="top"/>
-          </w:tcPr>
-          <w:p/>
-        </w:tc>
-        <w:tc>
-          <w:tcPr>
-            <w:tcW w:type="dxa" w:w="1604"/>
+            <w:tcW w:type="dxa" w:w="2379"/>
             <w:tcBorders>
               <w:top w:val="single" w:color="929292" w:sz="4" w:space="0" w:shadow="0" w:frame="0"/>
               <w:left w:val="single" w:color="929292" w:sz="4" w:space="0" w:shadow="0" w:frame="0"/>
@@ -7618,7 +6290,7 @@
         </w:trPr>
         <w:tc>
           <w:tcPr>
-            <w:tcW w:type="dxa" w:w="1604"/>
+            <w:tcW w:type="dxa" w:w="2377"/>
             <w:tcBorders>
               <w:top w:val="single" w:color="929292" w:sz="4" w:space="0" w:shadow="0" w:frame="0"/>
               <w:left w:val="single" w:color="929292" w:sz="4" w:space="0" w:shadow="0" w:frame="0"/>
@@ -7638,7 +6310,7 @@
         </w:tc>
         <w:tc>
           <w:tcPr>
-            <w:tcW w:type="dxa" w:w="1605"/>
+            <w:tcW w:type="dxa" w:w="2379"/>
             <w:tcBorders>
               <w:top w:val="single" w:color="929292" w:sz="4" w:space="0" w:shadow="0" w:frame="0"/>
               <w:left w:val="single" w:color="929292" w:sz="4" w:space="0" w:shadow="0" w:frame="0"/>
@@ -7658,7 +6330,7 @@
         </w:tc>
         <w:tc>
           <w:tcPr>
-            <w:tcW w:type="dxa" w:w="1604"/>
+            <w:tcW w:type="dxa" w:w="2377"/>
             <w:tcBorders>
               <w:top w:val="single" w:color="929292" w:sz="4" w:space="0" w:shadow="0" w:frame="0"/>
               <w:left w:val="single" w:color="929292" w:sz="4" w:space="0" w:shadow="0" w:frame="0"/>
@@ -7678,47 +6350,7 @@
         </w:tc>
         <w:tc>
           <w:tcPr>
-            <w:tcW w:type="dxa" w:w="1605"/>
-            <w:tcBorders>
-              <w:top w:val="single" w:color="929292" w:sz="4" w:space="0" w:shadow="0" w:frame="0"/>
-              <w:left w:val="single" w:color="929292" w:sz="4" w:space="0" w:shadow="0" w:frame="0"/>
-              <w:bottom w:val="single" w:color="929292" w:sz="4" w:space="0" w:shadow="0" w:frame="0"/>
-              <w:right w:val="single" w:color="929292" w:sz="4" w:space="0" w:shadow="0" w:frame="0"/>
-            </w:tcBorders>
-            <w:shd w:val="clear" w:color="auto" w:fill="f7f7f6"/>
-            <w:tcMar>
-              <w:top w:type="dxa" w:w="80"/>
-              <w:left w:type="dxa" w:w="80"/>
-              <w:bottom w:type="dxa" w:w="80"/>
-              <w:right w:type="dxa" w:w="80"/>
-            </w:tcMar>
-            <w:vAlign w:val="top"/>
-          </w:tcPr>
-          <w:p/>
-        </w:tc>
-        <w:tc>
-          <w:tcPr>
-            <w:tcW w:type="dxa" w:w="1605"/>
-            <w:tcBorders>
-              <w:top w:val="single" w:color="929292" w:sz="4" w:space="0" w:shadow="0" w:frame="0"/>
-              <w:left w:val="single" w:color="929292" w:sz="4" w:space="0" w:shadow="0" w:frame="0"/>
-              <w:bottom w:val="single" w:color="929292" w:sz="4" w:space="0" w:shadow="0" w:frame="0"/>
-              <w:right w:val="single" w:color="929292" w:sz="4" w:space="0" w:shadow="0" w:frame="0"/>
-            </w:tcBorders>
-            <w:shd w:val="clear" w:color="auto" w:fill="f7f7f6"/>
-            <w:tcMar>
-              <w:top w:type="dxa" w:w="80"/>
-              <w:left w:type="dxa" w:w="80"/>
-              <w:bottom w:type="dxa" w:w="80"/>
-              <w:right w:type="dxa" w:w="80"/>
-            </w:tcMar>
-            <w:vAlign w:val="top"/>
-          </w:tcPr>
-          <w:p/>
-        </w:tc>
-        <w:tc>
-          <w:tcPr>
-            <w:tcW w:type="dxa" w:w="1604"/>
+            <w:tcW w:type="dxa" w:w="2379"/>
             <w:tcBorders>
               <w:top w:val="single" w:color="929292" w:sz="4" w:space="0" w:shadow="0" w:frame="0"/>
               <w:left w:val="single" w:color="929292" w:sz="4" w:space="0" w:shadow="0" w:frame="0"/>
@@ -7746,7 +6378,7 @@
         </w:trPr>
         <w:tc>
           <w:tcPr>
-            <w:tcW w:type="dxa" w:w="1604"/>
+            <w:tcW w:type="dxa" w:w="2377"/>
             <w:tcBorders>
               <w:top w:val="single" w:color="929292" w:sz="4" w:space="0" w:shadow="0" w:frame="0"/>
               <w:left w:val="single" w:color="929292" w:sz="4" w:space="0" w:shadow="0" w:frame="0"/>
@@ -7766,7 +6398,7 @@
         </w:tc>
         <w:tc>
           <w:tcPr>
-            <w:tcW w:type="dxa" w:w="1605"/>
+            <w:tcW w:type="dxa" w:w="2379"/>
             <w:tcBorders>
               <w:top w:val="single" w:color="929292" w:sz="4" w:space="0" w:shadow="0" w:frame="0"/>
               <w:left w:val="single" w:color="929292" w:sz="4" w:space="0" w:shadow="0" w:frame="0"/>
@@ -7786,7 +6418,7 @@
         </w:tc>
         <w:tc>
           <w:tcPr>
-            <w:tcW w:type="dxa" w:w="1604"/>
+            <w:tcW w:type="dxa" w:w="2377"/>
             <w:tcBorders>
               <w:top w:val="single" w:color="929292" w:sz="4" w:space="0" w:shadow="0" w:frame="0"/>
               <w:left w:val="single" w:color="929292" w:sz="4" w:space="0" w:shadow="0" w:frame="0"/>
@@ -7806,47 +6438,7 @@
         </w:tc>
         <w:tc>
           <w:tcPr>
-            <w:tcW w:type="dxa" w:w="1605"/>
-            <w:tcBorders>
-              <w:top w:val="single" w:color="929292" w:sz="4" w:space="0" w:shadow="0" w:frame="0"/>
-              <w:left w:val="single" w:color="929292" w:sz="4" w:space="0" w:shadow="0" w:frame="0"/>
-              <w:bottom w:val="single" w:color="929292" w:sz="4" w:space="0" w:shadow="0" w:frame="0"/>
-              <w:right w:val="single" w:color="929292" w:sz="4" w:space="0" w:shadow="0" w:frame="0"/>
-            </w:tcBorders>
-            <w:shd w:val="clear" w:color="auto" w:fill="auto"/>
-            <w:tcMar>
-              <w:top w:type="dxa" w:w="80"/>
-              <w:left w:type="dxa" w:w="80"/>
-              <w:bottom w:type="dxa" w:w="80"/>
-              <w:right w:type="dxa" w:w="80"/>
-            </w:tcMar>
-            <w:vAlign w:val="top"/>
-          </w:tcPr>
-          <w:p/>
-        </w:tc>
-        <w:tc>
-          <w:tcPr>
-            <w:tcW w:type="dxa" w:w="1605"/>
-            <w:tcBorders>
-              <w:top w:val="single" w:color="929292" w:sz="4" w:space="0" w:shadow="0" w:frame="0"/>
-              <w:left w:val="single" w:color="929292" w:sz="4" w:space="0" w:shadow="0" w:frame="0"/>
-              <w:bottom w:val="single" w:color="929292" w:sz="4" w:space="0" w:shadow="0" w:frame="0"/>
-              <w:right w:val="single" w:color="929292" w:sz="4" w:space="0" w:shadow="0" w:frame="0"/>
-            </w:tcBorders>
-            <w:shd w:val="clear" w:color="auto" w:fill="auto"/>
-            <w:tcMar>
-              <w:top w:type="dxa" w:w="80"/>
-              <w:left w:type="dxa" w:w="80"/>
-              <w:bottom w:type="dxa" w:w="80"/>
-              <w:right w:type="dxa" w:w="80"/>
-            </w:tcMar>
-            <w:vAlign w:val="top"/>
-          </w:tcPr>
-          <w:p/>
-        </w:tc>
-        <w:tc>
-          <w:tcPr>
-            <w:tcW w:type="dxa" w:w="1604"/>
+            <w:tcW w:type="dxa" w:w="2379"/>
             <w:tcBorders>
               <w:top w:val="single" w:color="929292" w:sz="4" w:space="0" w:shadow="0" w:frame="0"/>
               <w:left w:val="single" w:color="929292" w:sz="4" w:space="0" w:shadow="0" w:frame="0"/>
@@ -7874,7 +6466,7 @@
         </w:trPr>
         <w:tc>
           <w:tcPr>
-            <w:tcW w:type="dxa" w:w="1604"/>
+            <w:tcW w:type="dxa" w:w="2377"/>
             <w:tcBorders>
               <w:top w:val="single" w:color="929292" w:sz="4" w:space="0" w:shadow="0" w:frame="0"/>
               <w:left w:val="single" w:color="929292" w:sz="4" w:space="0" w:shadow="0" w:frame="0"/>
@@ -7894,7 +6486,7 @@
         </w:tc>
         <w:tc>
           <w:tcPr>
-            <w:tcW w:type="dxa" w:w="1605"/>
+            <w:tcW w:type="dxa" w:w="2379"/>
             <w:tcBorders>
               <w:top w:val="single" w:color="929292" w:sz="4" w:space="0" w:shadow="0" w:frame="0"/>
               <w:left w:val="single" w:color="929292" w:sz="4" w:space="0" w:shadow="0" w:frame="0"/>
@@ -7914,7 +6506,7 @@
         </w:tc>
         <w:tc>
           <w:tcPr>
-            <w:tcW w:type="dxa" w:w="1604"/>
+            <w:tcW w:type="dxa" w:w="2377"/>
             <w:tcBorders>
               <w:top w:val="single" w:color="929292" w:sz="4" w:space="0" w:shadow="0" w:frame="0"/>
               <w:left w:val="single" w:color="929292" w:sz="4" w:space="0" w:shadow="0" w:frame="0"/>
@@ -7934,47 +6526,7 @@
         </w:tc>
         <w:tc>
           <w:tcPr>
-            <w:tcW w:type="dxa" w:w="1605"/>
-            <w:tcBorders>
-              <w:top w:val="single" w:color="929292" w:sz="4" w:space="0" w:shadow="0" w:frame="0"/>
-              <w:left w:val="single" w:color="929292" w:sz="4" w:space="0" w:shadow="0" w:frame="0"/>
-              <w:bottom w:val="single" w:color="929292" w:sz="4" w:space="0" w:shadow="0" w:frame="0"/>
-              <w:right w:val="single" w:color="929292" w:sz="4" w:space="0" w:shadow="0" w:frame="0"/>
-            </w:tcBorders>
-            <w:shd w:val="clear" w:color="auto" w:fill="f7f7f6"/>
-            <w:tcMar>
-              <w:top w:type="dxa" w:w="80"/>
-              <w:left w:type="dxa" w:w="80"/>
-              <w:bottom w:type="dxa" w:w="80"/>
-              <w:right w:type="dxa" w:w="80"/>
-            </w:tcMar>
-            <w:vAlign w:val="top"/>
-          </w:tcPr>
-          <w:p/>
-        </w:tc>
-        <w:tc>
-          <w:tcPr>
-            <w:tcW w:type="dxa" w:w="1605"/>
-            <w:tcBorders>
-              <w:top w:val="single" w:color="929292" w:sz="4" w:space="0" w:shadow="0" w:frame="0"/>
-              <w:left w:val="single" w:color="929292" w:sz="4" w:space="0" w:shadow="0" w:frame="0"/>
-              <w:bottom w:val="single" w:color="929292" w:sz="4" w:space="0" w:shadow="0" w:frame="0"/>
-              <w:right w:val="single" w:color="929292" w:sz="4" w:space="0" w:shadow="0" w:frame="0"/>
-            </w:tcBorders>
-            <w:shd w:val="clear" w:color="auto" w:fill="f7f7f6"/>
-            <w:tcMar>
-              <w:top w:type="dxa" w:w="80"/>
-              <w:left w:type="dxa" w:w="80"/>
-              <w:bottom w:type="dxa" w:w="80"/>
-              <w:right w:type="dxa" w:w="80"/>
-            </w:tcMar>
-            <w:vAlign w:val="top"/>
-          </w:tcPr>
-          <w:p/>
-        </w:tc>
-        <w:tc>
-          <w:tcPr>
-            <w:tcW w:type="dxa" w:w="1604"/>
+            <w:tcW w:type="dxa" w:w="2379"/>
             <w:tcBorders>
               <w:top w:val="single" w:color="929292" w:sz="4" w:space="0" w:shadow="0" w:frame="0"/>
               <w:left w:val="single" w:color="929292" w:sz="4" w:space="0" w:shadow="0" w:frame="0"/>

</xml_diff>

<commit_message>
feat(earthquake): enhance predicted earthquake queries with new severity ranking and indexing
</commit_message>
<xml_diff>
--- a/src/main/resources/templates/word/DEHAReportTemplate.docx
+++ b/src/main/resources/templates/word/DEHAReportTemplate.docx
@@ -3480,15 +3480,15 @@
           <w:rFonts w:ascii="Futura" w:cs="Futura" w:hAnsi="Futura" w:eastAsia="Futura"/>
         </w:rPr>
         <w:drawing xmlns:a="http://schemas.openxmlformats.org/drawingml/2006/main">
-          <wp:anchor distT="0" distB="0" distL="0" distR="0" simplePos="0" relativeHeight="251660288" behindDoc="0" locked="0" layoutInCell="1" allowOverlap="1">
+          <wp:anchor distT="0" distB="0" distL="152400" distR="152400" simplePos="0" relativeHeight="251661312" behindDoc="0" locked="0" layoutInCell="1" allowOverlap="1">
             <wp:simplePos x="0" y="0"/>
             <wp:positionH relativeFrom="margin">
-              <wp:posOffset>880172</wp:posOffset>
+              <wp:posOffset>1210474</wp:posOffset>
             </wp:positionH>
             <wp:positionV relativeFrom="line">
-              <wp:posOffset>2533203</wp:posOffset>
+              <wp:posOffset>1833727</wp:posOffset>
             </wp:positionV>
-            <wp:extent cx="5036861" cy="3783055"/>
+            <wp:extent cx="5065256" cy="3810000"/>
             <wp:effectExtent l="0" t="0" r="0" b="0"/>
             <wp:wrapTopAndBottom distT="0" distB="0"/>
             <wp:docPr id="1073741825" name="officeArt object"/>
@@ -3521,7 +3521,7 @@
           <w:rFonts w:ascii="Arial Unicode MS" w:cs="Arial Unicode MS" w:hAnsi="Arial Unicode MS" w:eastAsia="Arial Unicode MS"/>
         </w:rPr>
         <w:drawing xmlns:a="http://schemas.openxmlformats.org/drawingml/2006/main">
-          <wp:anchor distT="0" distB="0" distL="0" distR="0" simplePos="0" relativeHeight="251661312" behindDoc="0" locked="0" layoutInCell="1" allowOverlap="1">
+          <wp:anchor distT="0" distB="0" distL="0" distR="0" simplePos="0" relativeHeight="251660288" behindDoc="0" locked="0" layoutInCell="1" allowOverlap="1">
             <wp:simplePos x="0" y="0"/>
             <wp:positionH relativeFrom="margin">
               <wp:posOffset>877122</wp:posOffset>
@@ -7010,10 +7010,10 @@
           <c:layoutTarget val="inner"/>
           <c:xMode val="edge"/>
           <c:yMode val="edge"/>
-          <c:x val="0.0704013"/>
-          <c:y val="0.124561"/>
-          <c:w val="0.912776"/>
-          <c:h val="0.803539"/>
+          <c:x val="0.136679"/>
+          <c:y val="0.21496"/>
+          <c:w val="0.836974"/>
+          <c:h val="0.662604"/>
         </c:manualLayout>
       </c:layout>
       <c:lineChart>
@@ -7034,27 +7034,31 @@
             </c:strRef>
           </c:tx>
           <c:spPr>
-            <a:noFill/>
-            <a:ln w="50800" cap="flat">
+            <a:solidFill>
+              <a:schemeClr val="accent1"/>
+            </a:solidFill>
+            <a:ln w="47625" cap="flat">
               <a:solidFill>
-                <a:srgbClr val="56C1FF"/>
+                <a:srgbClr val="009EF9"/>
               </a:solidFill>
               <a:prstDash val="solid"/>
-              <a:miter lim="400000"/>
+              <a:round/>
             </a:ln>
             <a:effectLst/>
           </c:spPr>
           <c:marker>
-            <c:symbol val="none"/>
-            <c:size val="4"/>
+            <c:symbol val="circle"/>
+            <c:size val="9"/>
             <c:spPr>
-              <a:noFill/>
-              <a:ln w="50800" cap="flat">
+              <a:solidFill>
+                <a:schemeClr val="accent1"/>
+              </a:solidFill>
+              <a:ln w="9525" cap="flat">
                 <a:solidFill>
-                  <a:srgbClr val="56C1FF"/>
+                  <a:srgbClr val="009EF9"/>
                 </a:solidFill>
                 <a:prstDash val="solid"/>
-                <a:miter lim="400000"/>
+                <a:round/>
               </a:ln>
               <a:effectLst/>
             </c:spPr>
@@ -7066,11 +7070,11 @@
               <a:lstStyle/>
               <a:p>
                 <a:pPr>
-                  <a:defRPr b="0" i="0" strike="noStrike" sz="1200" u="none">
+                  <a:defRPr b="0" i="0" strike="noStrike" sz="1800" u="none">
                     <a:solidFill>
                       <a:srgbClr val="000000"/>
                     </a:solidFill>
-                    <a:latin typeface="Futura"/>
+                    <a:latin typeface="Helvetica Neue"/>
                   </a:defRPr>
                 </a:pPr>
               </a:p>
@@ -7180,16 +7184,16 @@
         <c:delete val="0"/>
         <c:axPos val="b"/>
         <c:numFmt formatCode="General" sourceLinked="0"/>
-        <c:majorTickMark val="none"/>
+        <c:majorTickMark val="out"/>
         <c:minorTickMark val="none"/>
         <c:tickLblPos val="low"/>
         <c:spPr>
           <a:ln w="12700" cap="flat">
             <a:solidFill>
-              <a:srgbClr val="000000"/>
+              <a:srgbClr val="888888"/>
             </a:solidFill>
             <a:prstDash val="solid"/>
-            <a:miter lim="400000"/>
+            <a:round/>
           </a:ln>
         </c:spPr>
         <c:txPr>
@@ -7197,11 +7201,11 @@
           <a:lstStyle/>
           <a:p>
             <a:pPr>
-              <a:defRPr b="0" i="0" strike="noStrike" sz="1000" u="none">
+              <a:defRPr b="0" i="0" strike="noStrike" sz="1800" u="none">
                 <a:solidFill>
                   <a:srgbClr val="000000"/>
                 </a:solidFill>
-                <a:latin typeface="Futura"/>
+                <a:latin typeface="Helvetica Neue"/>
               </a:defRPr>
             </a:pPr>
           </a:p>
@@ -7223,22 +7227,24 @@
           <c:spPr>
             <a:ln w="12700" cap="flat">
               <a:solidFill>
-                <a:srgbClr val="B8B8B8"/>
+                <a:srgbClr val="888888"/>
               </a:solidFill>
               <a:prstDash val="solid"/>
-              <a:miter lim="400000"/>
+              <a:round/>
             </a:ln>
           </c:spPr>
         </c:majorGridlines>
-        <c:numFmt formatCode="0.#" sourceLinked="0"/>
-        <c:majorTickMark val="none"/>
+        <c:numFmt formatCode="General" sourceLinked="0"/>
+        <c:majorTickMark val="out"/>
         <c:minorTickMark val="none"/>
         <c:tickLblPos val="nextTo"/>
         <c:spPr>
           <a:ln w="12700" cap="flat">
-            <a:noFill/>
+            <a:solidFill>
+              <a:srgbClr val="888888"/>
+            </a:solidFill>
             <a:prstDash val="solid"/>
-            <a:miter lim="400000"/>
+            <a:round/>
           </a:ln>
         </c:spPr>
         <c:txPr>
@@ -7246,11 +7252,11 @@
           <a:lstStyle/>
           <a:p>
             <a:pPr>
-              <a:defRPr b="0" i="0" strike="noStrike" sz="1000" u="none">
+              <a:defRPr b="0" i="0" strike="noStrike" sz="1800" u="none">
                 <a:solidFill>
                   <a:srgbClr val="000000"/>
                 </a:solidFill>
-                <a:latin typeface="Futura"/>
+                <a:latin typeface="Helvetica Neue"/>
               </a:defRPr>
             </a:pPr>
           </a:p>
@@ -7262,7 +7268,9 @@
         <c:minorUnit val="0.625"/>
       </c:valAx>
       <c:spPr>
-        <a:noFill/>
+        <a:solidFill>
+          <a:srgbClr val="FFFFFF"/>
+        </a:solidFill>
         <a:ln w="12700" cap="flat">
           <a:noFill/>
           <a:miter lim="400000"/>
@@ -7276,10 +7284,10 @@
         <c:manualLayout>
           <c:xMode val="edge"/>
           <c:yMode val="edge"/>
-          <c:x val="0.0489568"/>
+          <c:x val="0.062692"/>
           <c:y val="0"/>
-          <c:w val="0.907708"/>
-          <c:h val="0.0676421"/>
+          <c:w val="0.90262"/>
+          <c:h val="0.0966533"/>
         </c:manualLayout>
       </c:layout>
       <c:overlay val="1"/>
@@ -7296,11 +7304,11 @@
         <a:lstStyle/>
         <a:p>
           <a:pPr>
-            <a:defRPr b="0" i="0" strike="noStrike" sz="1000" u="none">
+            <a:defRPr b="0" i="0" strike="noStrike" sz="1800" u="none">
               <a:solidFill>
                 <a:srgbClr val="000000"/>
               </a:solidFill>
-              <a:latin typeface="Futura"/>
+              <a:latin typeface="Helvetica Neue"/>
             </a:defRPr>
           </a:pPr>
         </a:p>
@@ -7310,9 +7318,15 @@
     <c:dispBlanksAs val="gap"/>
   </c:chart>
   <c:spPr>
-    <a:noFill/>
-    <a:ln>
-      <a:noFill/>
+    <a:solidFill>
+      <a:srgbClr val="FFFFFF"/>
+    </a:solidFill>
+    <a:ln w="12700" cap="flat">
+      <a:solidFill>
+        <a:srgbClr val="888888"/>
+      </a:solidFill>
+      <a:prstDash val="solid"/>
+      <a:round/>
     </a:ln>
     <a:effectLst/>
   </c:spPr>

</xml_diff>